<commit_message>
PIP-TZ and MER models
</commit_message>
<xml_diff>
--- a/Utils/ESCMID2026_Dalbavacin.docx
+++ b/Utils/ESCMID2026_Dalbavacin.docx
@@ -1,12 +1,12 @@
 
 <file path=word/document.xml><?xml version="1.0" encoding="utf-8"?>
-<w:document xmlns:wpc="http://schemas.microsoft.com/office/word/2010/wordprocessingCanvas" xmlns:cx="http://schemas.microsoft.com/office/drawing/2014/chartex" xmlns:cx1="http://schemas.microsoft.com/office/drawing/2015/9/8/chartex" xmlns:cx2="http://schemas.microsoft.com/office/drawing/2015/10/21/chartex" xmlns:cx3="http://schemas.microsoft.com/office/drawing/2016/5/9/chartex" xmlns:cx4="http://schemas.microsoft.com/office/drawing/2016/5/10/chartex" xmlns:cx5="http://schemas.microsoft.com/office/drawing/2016/5/11/chartex" xmlns:cx6="http://schemas.microsoft.com/office/drawing/2016/5/12/chartex" xmlns:cx7="http://schemas.microsoft.com/office/drawing/2016/5/13/chartex" xmlns:cx8="http://schemas.microsoft.com/office/drawing/2016/5/14/chartex" xmlns:mc="http://schemas.openxmlformats.org/markup-compatibility/2006" xmlns:aink="http://schemas.microsoft.com/office/drawing/2016/ink" xmlns:am3d="http://schemas.microsoft.com/office/drawing/2017/model3d" xmlns:o="urn:schemas-microsoft-com:office:office" xmlns:oel="http://schemas.microsoft.com/office/2019/extlst" xmlns:r="http://schemas.openxmlformats.org/officeDocument/2006/relationships" xmlns:m="http://schemas.openxmlformats.org/officeDocument/2006/math" xmlns:v="urn:schemas-microsoft-com:vml" xmlns:wp14="http://schemas.microsoft.com/office/word/2010/wordprocessingDrawing" xmlns:wp="http://schemas.openxmlformats.org/drawingml/2006/wordprocessingDrawing" xmlns:w10="urn:schemas-microsoft-com:office:word" xmlns:w="http://schemas.openxmlformats.org/wordprocessingml/2006/main" xmlns:w14="http://schemas.microsoft.com/office/word/2010/wordml" xmlns:w15="http://schemas.microsoft.com/office/word/2012/wordml" xmlns:w16cex="http://schemas.microsoft.com/office/word/2018/wordml/cex" xmlns:w16cid="http://schemas.microsoft.com/office/word/2016/wordml/cid" xmlns:w16="http://schemas.microsoft.com/office/word/2018/wordml" xmlns:w16du="http://schemas.microsoft.com/office/word/2023/wordml/word16du" xmlns:w16sdtdh="http://schemas.microsoft.com/office/word/2020/wordml/sdtdatahash" xmlns:w16sdtfl="http://schemas.microsoft.com/office/word/2024/wordml/sdtformatlock" xmlns:w16se="http://schemas.microsoft.com/office/word/2015/wordml/symex" xmlns:wpg="http://schemas.microsoft.com/office/word/2010/wordprocessingGroup" xmlns:wpi="http://schemas.microsoft.com/office/word/2010/wordprocessingInk" xmlns:wne="http://schemas.microsoft.com/office/word/2006/wordml" xmlns:wps="http://schemas.microsoft.com/office/word/2010/wordprocessingShape" xmlns:a="http://schemas.openxmlformats.org/drawingml/2006/main" xmlns:pic="http://schemas.openxmlformats.org/drawingml/2006/picture" mc:Ignorable="w14 w15 w16se w16cid w16 w16cex w16sdtdh w16sdtfl w16du wp14">
+<w:document xmlns:wpc="http://schemas.microsoft.com/office/word/2010/wordprocessingCanvas" xmlns:cx="http://schemas.microsoft.com/office/drawing/2014/chartex" xmlns:cx1="http://schemas.microsoft.com/office/drawing/2015/9/8/chartex" xmlns:cx2="http://schemas.microsoft.com/office/drawing/2015/10/21/chartex" xmlns:cx3="http://schemas.microsoft.com/office/drawing/2016/5/9/chartex" xmlns:cx4="http://schemas.microsoft.com/office/drawing/2016/5/10/chartex" xmlns:cx5="http://schemas.microsoft.com/office/drawing/2016/5/11/chartex" xmlns:cx6="http://schemas.microsoft.com/office/drawing/2016/5/12/chartex" xmlns:cx7="http://schemas.microsoft.com/office/drawing/2016/5/13/chartex" xmlns:cx8="http://schemas.microsoft.com/office/drawing/2016/5/14/chartex" xmlns:mc="http://schemas.openxmlformats.org/markup-compatibility/2006" xmlns:aink="http://schemas.microsoft.com/office/drawing/2016/ink" xmlns:am3d="http://schemas.microsoft.com/office/drawing/2017/model3d" xmlns:o="urn:schemas-microsoft-com:office:office" xmlns:oel="http://schemas.microsoft.com/office/2019/extlst" xmlns:r="http://schemas.openxmlformats.org/officeDocument/2006/relationships" xmlns:m="http://schemas.openxmlformats.org/officeDocument/2006/math" xmlns:v="urn:schemas-microsoft-com:vml" xmlns:wp14="http://schemas.microsoft.com/office/word/2010/wordprocessingDrawing" xmlns:wp="http://schemas.openxmlformats.org/drawingml/2006/wordprocessingDrawing" xmlns:w10="urn:schemas-microsoft-com:office:word" xmlns:w="http://schemas.openxmlformats.org/wordprocessingml/2006/main" xmlns:w14="http://schemas.microsoft.com/office/word/2010/wordml" xmlns:w15="http://schemas.microsoft.com/office/word/2012/wordml" xmlns:w16cex="http://schemas.microsoft.com/office/word/2018/wordml/cex" xmlns:w16cid="http://schemas.microsoft.com/office/word/2016/wordml/cid" xmlns:w16="http://schemas.microsoft.com/office/word/2018/wordml" xmlns:w16du="http://schemas.microsoft.com/office/word/2023/wordml/word16du" xmlns:w16sdtdh="http://schemas.microsoft.com/office/word/2020/wordml/sdtdatahash" xmlns:w16sdtfl="http://schemas.microsoft.com/office/word/2024/wordml/sdtformatlock" xmlns:w16se="http://schemas.microsoft.com/office/word/2015/wordml/symex" xmlns:wpg="http://schemas.microsoft.com/office/word/2010/wordprocessingGroup" xmlns:wpi="http://schemas.microsoft.com/office/word/2010/wordprocessingInk" xmlns:wne="http://schemas.microsoft.com/office/word/2006/wordml" xmlns:wps="http://schemas.microsoft.com/office/word/2010/wordprocessingShape" mc:Ignorable="w14 w15 w16se w16cid w16 w16cex w16sdtdh w16sdtfl w16du wp14">
   <w:body>
     <w:p>
       <w:pPr>
         <w:jc w:val="center"/>
         <w:rPr>
-          <w:rFonts w:ascii="Arial" w:hAnsi="Arial" w:eastAsia="Arial" w:cs="Arial"/>
+          <w:rFonts w:ascii="Arial" w:eastAsia="Arial" w:hAnsi="Arial" w:cs="Arial"/>
           <w:b/>
           <w:bCs/>
           <w:color w:val="000000" w:themeColor="text1"/>
@@ -16,7 +16,7 @@
       </w:pPr>
       <w:r>
         <w:rPr>
-          <w:rFonts w:ascii="Arial" w:hAnsi="Arial" w:eastAsia="Arial" w:cs="Arial"/>
+          <w:rFonts w:ascii="Arial" w:eastAsia="Arial" w:hAnsi="Arial" w:cs="Arial"/>
           <w:b/>
           <w:color w:val="000000" w:themeColor="text1"/>
           <w:sz w:val="40"/>
@@ -28,12 +28,12 @@
     <w:p>
       <w:pPr>
         <w:rPr>
-          <w:rFonts w:ascii="Arial" w:hAnsi="Arial" w:eastAsia="Arial" w:cs="Arial"/>
+          <w:rFonts w:ascii="Arial" w:eastAsia="Arial" w:hAnsi="Arial" w:cs="Arial"/>
           <w:color w:val="000000" w:themeColor="text1"/>
           <w:lang w:val="it-IT"/>
-          <w:rPrChange w:author="" w16du:dateUtc="2025-11-20T17:04:00Z" w:id="1624702069">
+          <w:rPrChange w:id="0" w:author="" w16du:dateUtc="2025-11-20T17:04:00Z">
             <w:rPr>
-              <w:rFonts w:ascii="Arial" w:hAnsi="Arial" w:eastAsia="Arial" w:cs="Arial"/>
+              <w:rFonts w:ascii="Arial" w:eastAsia="Arial" w:hAnsi="Arial" w:cs="Arial"/>
               <w:color w:val="000000" w:themeColor="text1"/>
             </w:rPr>
           </w:rPrChange>
@@ -41,73 +41,65 @@
       </w:pPr>
       <w:r>
         <w:rPr>
-          <w:rFonts w:ascii="Arial" w:hAnsi="Arial" w:eastAsia="Arial" w:cs="Arial"/>
-          <w:color w:val="000000" w:themeColor="text1" w:themeTint="FF" w:themeShade="FF"/>
-          <w:lang w:val="it-IT"/>
+          <w:rFonts w:ascii="Arial" w:eastAsia="Arial" w:hAnsi="Arial" w:cs="Arial"/>
+          <w:color w:val="000000" w:themeColor="text1"/>
         </w:rPr>
         <w:t>M.</w:t>
       </w:r>
       <w:r>
         <w:rPr>
-          <w:rFonts w:ascii="Arial" w:hAnsi="Arial" w:eastAsia="Arial" w:cs="Arial"/>
-          <w:color w:val="000000" w:themeColor="text1" w:themeTint="FF" w:themeShade="FF"/>
-          <w:lang w:val="it-IT"/>
+          <w:rFonts w:ascii="Arial" w:eastAsia="Arial" w:hAnsi="Arial" w:cs="Arial"/>
+          <w:color w:val="000000" w:themeColor="text1"/>
         </w:rPr>
         <w:t xml:space="preserve"> </w:t>
       </w:r>
       <w:r>
         <w:rPr>
-          <w:rFonts w:ascii="Arial" w:hAnsi="Arial" w:eastAsia="Arial" w:cs="Arial"/>
-          <w:color w:val="000000" w:themeColor="text1" w:themeTint="FF" w:themeShade="FF"/>
-          <w:lang w:val="it-IT"/>
+          <w:rFonts w:ascii="Arial" w:eastAsia="Arial" w:hAnsi="Arial" w:cs="Arial"/>
+          <w:color w:val="000000" w:themeColor="text1"/>
         </w:rPr>
         <w:t xml:space="preserve">Morra, </w:t>
       </w:r>
       <w:r>
         <w:rPr>
           <w:rFonts w:ascii="Arial" w:hAnsi="Arial" w:cs="Arial"/>
-          <w:color w:val="000000" w:themeColor="text1" w:themeTint="FF" w:themeShade="FF"/>
-          <w:lang w:val="it-IT"/>
+          <w:color w:val="000000" w:themeColor="text1"/>
         </w:rPr>
         <w:t>Jason A Roberts</w:t>
       </w:r>
       <w:r>
         <w:rPr>
-          <w:rFonts w:ascii="Arial" w:hAnsi="Arial" w:eastAsia="Arial" w:cs="Arial"/>
-          <w:color w:val="000000" w:themeColor="text1" w:themeTint="FF" w:themeShade="FF"/>
-          <w:lang w:val="it-IT"/>
+          <w:rFonts w:ascii="Arial" w:eastAsia="Arial" w:hAnsi="Arial" w:cs="Arial"/>
+          <w:color w:val="000000" w:themeColor="text1"/>
         </w:rPr>
         <w:t xml:space="preserve">, </w:t>
       </w:r>
       <w:r>
         <w:rPr>
           <w:rFonts w:ascii="Arial" w:hAnsi="Arial" w:cs="Arial"/>
-          <w:color w:val="000000" w:themeColor="text1" w:themeTint="FF" w:themeShade="FF"/>
-          <w:lang w:val="it-IT"/>
+          <w:color w:val="000000" w:themeColor="text1"/>
         </w:rPr>
         <w:t>C. Leven</w:t>
       </w:r>
       <w:r>
         <w:rPr>
-          <w:rFonts w:ascii="Arial" w:hAnsi="Arial" w:eastAsia="Arial" w:cs="Arial"/>
-          <w:color w:val="000000" w:themeColor="text1" w:themeTint="FF" w:themeShade="FF"/>
-          <w:lang w:val="it-IT"/>
+          <w:rFonts w:ascii="Arial" w:eastAsia="Arial" w:hAnsi="Arial" w:cs="Arial"/>
+          <w:color w:val="000000" w:themeColor="text1"/>
         </w:rPr>
         <w:t xml:space="preserve">, </w:t>
       </w:r>
       <w:r>
         <w:rPr>
-          <w:rFonts w:ascii="Arial" w:hAnsi="Arial" w:eastAsia="Arial" w:cs="Arial"/>
-          <w:color w:val="000000" w:themeColor="text1" w:themeTint="FF" w:themeShade="FF"/>
-          <w:lang w:val="it-IT"/>
+          <w:rFonts w:ascii="Arial" w:eastAsia="Arial" w:hAnsi="Arial" w:cs="Arial"/>
+          <w:color w:val="000000" w:themeColor="text1"/>
         </w:rPr>
         <w:t xml:space="preserve">E. Tacconelli, M. </w:t>
       </w:r>
-      <w:hyperlink r:id="R9dbcd42010fe4fa8">
+      <w:hyperlink r:id="rId5">
         <w:r>
           <w:rPr>
-            <w:rFonts w:ascii="Arial" w:hAnsi="Arial" w:eastAsia="Arial" w:cs="Arial"/>
-            <w:color w:val="000000" w:themeColor="text1" w:themeTint="FF" w:themeShade="FF"/>
+            <w:rFonts w:ascii="Arial" w:eastAsia="Arial" w:hAnsi="Arial" w:cs="Arial"/>
+            <w:color w:val="000000" w:themeColor="text1"/>
             <w:lang w:val="it-IT"/>
           </w:rPr>
           <w:t>Gregoire</w:t>
@@ -117,7 +109,7 @@
     <w:p>
       <w:pPr>
         <w:rPr>
-          <w:rFonts w:ascii="Arial" w:hAnsi="Arial" w:eastAsia="Arial" w:cs="Arial"/>
+          <w:rFonts w:ascii="Arial" w:eastAsia="Arial" w:hAnsi="Arial" w:cs="Arial"/>
           <w:b/>
           <w:bCs/>
           <w:color w:val="000000" w:themeColor="text1"/>
@@ -127,7 +119,7 @@
       </w:pPr>
       <w:r>
         <w:rPr>
-          <w:rFonts w:ascii="Arial" w:hAnsi="Arial" w:eastAsia="Arial" w:cs="Arial"/>
+          <w:rFonts w:ascii="Arial" w:eastAsia="Arial" w:hAnsi="Arial" w:cs="Arial"/>
           <w:b/>
           <w:bCs/>
           <w:color w:val="000000" w:themeColor="text1"/>
@@ -140,20 +132,20 @@
     <w:p>
       <w:pPr>
         <w:rPr>
-          <w:rFonts w:ascii="Arial" w:hAnsi="Arial" w:eastAsia="Arial" w:cs="Arial"/>
-          <w:color w:val="000000" w:themeColor="text1"/>
-        </w:rPr>
-      </w:pPr>
-      <w:r>
-        <w:rPr>
-          <w:rFonts w:ascii="Arial" w:hAnsi="Arial" w:eastAsia="Arial" w:cs="Arial"/>
+          <w:rFonts w:ascii="Arial" w:eastAsia="Arial" w:hAnsi="Arial" w:cs="Arial"/>
+          <w:color w:val="000000" w:themeColor="text1"/>
+        </w:rPr>
+      </w:pPr>
+      <w:r>
+        <w:rPr>
+          <w:rFonts w:ascii="Arial" w:eastAsia="Arial" w:hAnsi="Arial" w:cs="Arial"/>
           <w:color w:val="000000" w:themeColor="text1"/>
         </w:rPr>
         <w:t xml:space="preserve">Dalbavancin is an attractive therapeutic option owing to its exceptionally long terminal half-life of approximately 14 days and its potent in vitro activity against </w:t>
       </w:r>
       <w:r>
         <w:rPr>
-          <w:rFonts w:ascii="Arial" w:hAnsi="Arial" w:eastAsia="Arial" w:cs="Arial"/>
+          <w:rFonts w:ascii="Arial" w:eastAsia="Arial" w:hAnsi="Arial" w:cs="Arial"/>
           <w:i/>
           <w:iCs/>
           <w:color w:val="000000" w:themeColor="text1"/>
@@ -162,21 +154,21 @@
       </w:r>
       <w:r>
         <w:rPr>
-          <w:rFonts w:ascii="Arial" w:hAnsi="Arial" w:eastAsia="Arial" w:cs="Arial"/>
+          <w:rFonts w:ascii="Arial" w:eastAsia="Arial" w:hAnsi="Arial" w:cs="Arial"/>
           <w:color w:val="000000" w:themeColor="text1"/>
         </w:rPr>
         <w:t xml:space="preserve">, including methicillin-resistant strains. Its clinical use has expanded beyond approved indications to include complex infections such as bone and joint infections and infective endocarditis. However, optimal dosing strategies for these </w:t>
       </w:r>
       <w:r>
         <w:rPr>
-          <w:rFonts w:ascii="Arial" w:hAnsi="Arial" w:eastAsia="Arial" w:cs="Arial"/>
+          <w:rFonts w:ascii="Arial" w:eastAsia="Arial" w:hAnsi="Arial" w:cs="Arial"/>
           <w:color w:val="000000" w:themeColor="text1"/>
         </w:rPr>
         <w:t>off label</w:t>
       </w:r>
       <w:r>
         <w:rPr>
-          <w:rFonts w:ascii="Arial" w:hAnsi="Arial" w:eastAsia="Arial" w:cs="Arial"/>
+          <w:rFonts w:ascii="Arial" w:eastAsia="Arial" w:hAnsi="Arial" w:cs="Arial"/>
           <w:color w:val="000000" w:themeColor="text1"/>
         </w:rPr>
         <w:t xml:space="preserve"> uses remain poorly defined. To address this gap, we developed a model-informed precision dosing tool to support individualized dalbavancin therapy.</w:t>
@@ -185,7 +177,7 @@
     <w:p>
       <w:pPr>
         <w:rPr>
-          <w:rFonts w:ascii="Arial" w:hAnsi="Arial" w:eastAsia="Arial" w:cs="Arial"/>
+          <w:rFonts w:ascii="Arial" w:eastAsia="Arial" w:hAnsi="Arial" w:cs="Arial"/>
           <w:b/>
           <w:bCs/>
           <w:color w:val="000000" w:themeColor="text1"/>
@@ -195,7 +187,7 @@
       </w:pPr>
       <w:r>
         <w:rPr>
-          <w:rFonts w:ascii="Arial" w:hAnsi="Arial" w:eastAsia="Arial" w:cs="Arial"/>
+          <w:rFonts w:ascii="Arial" w:eastAsia="Arial" w:hAnsi="Arial" w:cs="Arial"/>
           <w:b/>
           <w:bCs/>
           <w:color w:val="000000" w:themeColor="text1"/>
@@ -208,55 +200,55 @@
     <w:p>
       <w:pPr>
         <w:rPr>
-          <w:rFonts w:ascii="Arial" w:hAnsi="Arial" w:eastAsia="Arial" w:cs="Arial"/>
-          <w:color w:val="000000" w:themeColor="text1"/>
-        </w:rPr>
-      </w:pPr>
-      <w:r>
-        <w:rPr>
-          <w:rFonts w:ascii="Arial" w:hAnsi="Arial" w:eastAsia="Arial" w:cs="Arial"/>
+          <w:rFonts w:ascii="Arial" w:eastAsia="Arial" w:hAnsi="Arial" w:cs="Arial"/>
+          <w:color w:val="000000" w:themeColor="text1"/>
+        </w:rPr>
+      </w:pPr>
+      <w:r>
+        <w:rPr>
+          <w:rFonts w:ascii="Arial" w:eastAsia="Arial" w:hAnsi="Arial" w:cs="Arial"/>
           <w:color w:val="000000" w:themeColor="text1"/>
         </w:rPr>
         <w:t xml:space="preserve">A systematic search of the literature was performed to identify published dalbavancin </w:t>
       </w:r>
       <w:r>
         <w:rPr>
-          <w:rFonts w:ascii="Arial" w:hAnsi="Arial" w:eastAsia="Arial" w:cs="Arial"/>
+          <w:rFonts w:ascii="Arial" w:eastAsia="Arial" w:hAnsi="Arial" w:cs="Arial"/>
           <w:color w:val="000000" w:themeColor="text1"/>
         </w:rPr>
         <w:t>population pharm</w:t>
       </w:r>
       <w:r>
         <w:rPr>
-          <w:rFonts w:ascii="Arial" w:hAnsi="Arial" w:eastAsia="Arial" w:cs="Arial"/>
+          <w:rFonts w:ascii="Arial" w:eastAsia="Arial" w:hAnsi="Arial" w:cs="Arial"/>
           <w:color w:val="000000" w:themeColor="text1"/>
         </w:rPr>
         <w:t>acokinetic</w:t>
       </w:r>
       <w:r>
         <w:rPr>
-          <w:rFonts w:ascii="Arial" w:hAnsi="Arial" w:eastAsia="Arial" w:cs="Arial"/>
+          <w:rFonts w:ascii="Arial" w:eastAsia="Arial" w:hAnsi="Arial" w:cs="Arial"/>
           <w:color w:val="000000" w:themeColor="text1"/>
         </w:rPr>
         <w:t xml:space="preserve"> models</w:t>
       </w:r>
       <w:r>
         <w:rPr>
-          <w:rFonts w:ascii="Arial" w:hAnsi="Arial" w:eastAsia="Arial" w:cs="Arial"/>
+          <w:rFonts w:ascii="Arial" w:eastAsia="Arial" w:hAnsi="Arial" w:cs="Arial"/>
           <w:color w:val="000000" w:themeColor="text1"/>
         </w:rPr>
         <w:t xml:space="preserve">. </w:t>
       </w:r>
       <w:r>
         <w:rPr>
-          <w:rFonts w:ascii="Arial" w:hAnsi="Arial" w:eastAsia="Arial" w:cs="Arial"/>
+          <w:rFonts w:ascii="Arial" w:eastAsia="Arial" w:hAnsi="Arial" w:cs="Arial"/>
           <w:color w:val="000000" w:themeColor="text1"/>
         </w:rPr>
         <w:t xml:space="preserve">A Shiny application was developed using the R packages </w:t>
       </w:r>
       <w:r>
         <w:rPr>
-          <w:rFonts w:ascii="Arial" w:hAnsi="Arial" w:eastAsia="Arial" w:cs="Arial"/>
+          <w:rFonts w:ascii="Arial" w:eastAsia="Arial" w:hAnsi="Arial" w:cs="Arial"/>
           <w:b/>
           <w:bCs/>
           <w:color w:val="000000" w:themeColor="text1"/>
@@ -265,7 +257,7 @@
       </w:r>
       <w:r>
         <w:rPr>
-          <w:rFonts w:ascii="Arial" w:hAnsi="Arial" w:eastAsia="Arial" w:cs="Arial"/>
+          <w:rFonts w:ascii="Arial" w:eastAsia="Arial" w:hAnsi="Arial" w:cs="Arial"/>
           <w:color w:val="000000" w:themeColor="text1"/>
         </w:rPr>
         <w:t xml:space="preserve"> and </w:t>
@@ -273,7 +265,7 @@
       <w:proofErr w:type="spellStart"/>
       <w:r>
         <w:rPr>
-          <w:rFonts w:ascii="Arial" w:hAnsi="Arial" w:eastAsia="Arial" w:cs="Arial"/>
+          <w:rFonts w:ascii="Arial" w:eastAsia="Arial" w:hAnsi="Arial" w:cs="Arial"/>
           <w:b/>
           <w:bCs/>
           <w:color w:val="000000" w:themeColor="text1"/>
@@ -283,7 +275,7 @@
       <w:proofErr w:type="spellEnd"/>
       <w:r>
         <w:rPr>
-          <w:rFonts w:ascii="Arial" w:hAnsi="Arial" w:eastAsia="Arial" w:cs="Arial"/>
+          <w:rFonts w:ascii="Arial" w:eastAsia="Arial" w:hAnsi="Arial" w:cs="Arial"/>
           <w:color w:val="000000" w:themeColor="text1"/>
         </w:rPr>
         <w:t xml:space="preserve"> to enable a posteriori dosing optimisation.</w:t>
@@ -292,34 +284,34 @@
     <w:p>
       <w:pPr>
         <w:rPr>
-          <w:rFonts w:ascii="Arial" w:hAnsi="Arial" w:eastAsia="Arial" w:cs="Arial"/>
-          <w:color w:val="000000" w:themeColor="text1"/>
-        </w:rPr>
-      </w:pPr>
-      <w:r>
-        <w:rPr>
-          <w:rFonts w:ascii="Arial" w:hAnsi="Arial" w:eastAsia="Arial" w:cs="Arial"/>
+          <w:rFonts w:ascii="Arial" w:eastAsia="Arial" w:hAnsi="Arial" w:cs="Arial"/>
+          <w:color w:val="000000" w:themeColor="text1"/>
+        </w:rPr>
+      </w:pPr>
+      <w:r>
+        <w:rPr>
+          <w:rFonts w:ascii="Arial" w:eastAsia="Arial" w:hAnsi="Arial" w:cs="Arial"/>
           <w:color w:val="000000" w:themeColor="text1"/>
         </w:rPr>
         <w:t>Model averaging was implemented using a log</w:t>
       </w:r>
       <w:r>
         <w:rPr>
-          <w:rFonts w:ascii="Arial" w:hAnsi="Arial" w:eastAsia="Arial" w:cs="Arial"/>
+          <w:rFonts w:ascii="Arial" w:eastAsia="Arial" w:hAnsi="Arial" w:cs="Arial"/>
           <w:color w:val="000000" w:themeColor="text1"/>
         </w:rPr>
         <w:t>–</w:t>
       </w:r>
       <w:r>
         <w:rPr>
-          <w:rFonts w:ascii="Arial" w:hAnsi="Arial" w:eastAsia="Arial" w:cs="Arial"/>
+          <w:rFonts w:ascii="Arial" w:eastAsia="Arial" w:hAnsi="Arial" w:cs="Arial"/>
           <w:color w:val="000000" w:themeColor="text1"/>
         </w:rPr>
         <w:t xml:space="preserve">likelihood–based weighting approach. </w:t>
       </w:r>
       <w:r>
         <w:rPr>
-          <w:rFonts w:ascii="Arial" w:hAnsi="Arial" w:eastAsia="Arial" w:cs="Arial"/>
+          <w:rFonts w:ascii="Arial" w:eastAsia="Arial" w:hAnsi="Arial" w:cs="Arial"/>
           <w:color w:val="000000" w:themeColor="text1"/>
         </w:rPr>
         <w:t xml:space="preserve">For each candidate model </w:t>
@@ -327,7 +319,7 @@
       <m:oMath>
         <m:r>
           <w:rPr>
-            <w:rFonts w:ascii="Cambria Math" w:hAnsi="Cambria Math" w:eastAsia="Arial" w:cs="Arial"/>
+            <w:rFonts w:ascii="Cambria Math" w:eastAsia="Arial" w:hAnsi="Cambria Math" w:cs="Arial"/>
             <w:color w:val="000000" w:themeColor="text1"/>
           </w:rPr>
           <m:t>i</m:t>
@@ -335,7 +327,7 @@
       </m:oMath>
       <w:r>
         <w:rPr>
-          <w:rFonts w:ascii="Arial" w:hAnsi="Arial" w:eastAsia="Arial" w:cs="Arial"/>
+          <w:rFonts w:ascii="Arial" w:eastAsia="Arial" w:hAnsi="Arial" w:cs="Arial"/>
           <w:color w:val="000000" w:themeColor="text1"/>
         </w:rPr>
         <w:t xml:space="preserve">, the likelihood was computed as </w:t>
@@ -345,7 +337,7 @@
           <m:sSubPr>
             <m:ctrlPr>
               <w:rPr>
-                <w:rFonts w:ascii="Cambria Math" w:hAnsi="Cambria Math" w:eastAsia="Arial" w:cs="Arial"/>
+                <w:rFonts w:ascii="Cambria Math" w:eastAsia="Arial" w:hAnsi="Cambria Math" w:cs="Arial"/>
                 <w:color w:val="000000" w:themeColor="text1"/>
               </w:rPr>
             </m:ctrlPr>
@@ -353,7 +345,7 @@
           <m:e>
             <m:r>
               <w:rPr>
-                <w:rFonts w:ascii="Cambria Math" w:hAnsi="Cambria Math" w:eastAsia="Arial" w:cs="Arial"/>
+                <w:rFonts w:ascii="Cambria Math" w:eastAsia="Arial" w:hAnsi="Cambria Math" w:cs="Arial"/>
                 <w:color w:val="000000" w:themeColor="text1"/>
               </w:rPr>
               <m:t>L</m:t>
@@ -362,7 +354,7 @@
           <m:sub>
             <m:r>
               <w:rPr>
-                <w:rFonts w:ascii="Cambria Math" w:hAnsi="Cambria Math" w:eastAsia="Arial" w:cs="Arial"/>
+                <w:rFonts w:ascii="Cambria Math" w:eastAsia="Arial" w:hAnsi="Cambria Math" w:cs="Arial"/>
                 <w:color w:val="000000" w:themeColor="text1"/>
               </w:rPr>
               <m:t>i</m:t>
@@ -371,7 +363,7 @@
         </m:sSub>
         <m:r>
           <w:rPr>
-            <w:rFonts w:ascii="Cambria Math" w:hAnsi="Cambria Math" w:eastAsia="Arial" w:cs="Arial"/>
+            <w:rFonts w:ascii="Cambria Math" w:eastAsia="Arial" w:hAnsi="Cambria Math" w:cs="Arial"/>
             <w:color w:val="000000" w:themeColor="text1"/>
           </w:rPr>
           <m:t>=</m:t>
@@ -381,14 +373,14 @@
             <m:sty m:val="p"/>
           </m:rPr>
           <w:rPr>
-            <w:rFonts w:ascii="Cambria Math" w:hAnsi="Cambria Math" w:eastAsia="Arial" w:cs="Arial"/>
+            <w:rFonts w:ascii="Cambria Math" w:eastAsia="Arial" w:hAnsi="Cambria Math" w:cs="Arial"/>
             <w:color w:val="000000" w:themeColor="text1"/>
           </w:rPr>
           <m:t>exp</m:t>
         </m:r>
         <m:r>
           <w:rPr>
-            <w:rFonts w:ascii="Cambria Math" w:hAnsi="Cambria Math" w:eastAsia="Arial" w:cs="Arial"/>
+            <w:rFonts w:ascii="Cambria Math" w:eastAsia="Arial" w:hAnsi="Cambria Math" w:cs="Arial"/>
             <w:color w:val="000000" w:themeColor="text1"/>
           </w:rPr>
           <m:t>⁡(-0.5×OF</m:t>
@@ -397,7 +389,7 @@
           <m:sSubPr>
             <m:ctrlPr>
               <w:rPr>
-                <w:rFonts w:ascii="Cambria Math" w:hAnsi="Cambria Math" w:eastAsia="Arial" w:cs="Arial"/>
+                <w:rFonts w:ascii="Cambria Math" w:eastAsia="Arial" w:hAnsi="Cambria Math" w:cs="Arial"/>
                 <w:color w:val="000000" w:themeColor="text1"/>
               </w:rPr>
             </m:ctrlPr>
@@ -405,7 +397,7 @@
           <m:e>
             <m:r>
               <w:rPr>
-                <w:rFonts w:ascii="Cambria Math" w:hAnsi="Cambria Math" w:eastAsia="Arial" w:cs="Arial"/>
+                <w:rFonts w:ascii="Cambria Math" w:eastAsia="Arial" w:hAnsi="Cambria Math" w:cs="Arial"/>
                 <w:color w:val="000000" w:themeColor="text1"/>
               </w:rPr>
               <m:t>V</m:t>
@@ -414,7 +406,7 @@
           <m:sub>
             <m:r>
               <w:rPr>
-                <w:rFonts w:ascii="Cambria Math" w:hAnsi="Cambria Math" w:eastAsia="Arial" w:cs="Arial"/>
+                <w:rFonts w:ascii="Cambria Math" w:eastAsia="Arial" w:hAnsi="Cambria Math" w:cs="Arial"/>
                 <w:color w:val="000000" w:themeColor="text1"/>
               </w:rPr>
               <m:t>i</m:t>
@@ -423,7 +415,7 @@
         </m:sSub>
         <m:r>
           <w:rPr>
-            <w:rFonts w:ascii="Cambria Math" w:hAnsi="Cambria Math" w:eastAsia="Arial" w:cs="Arial"/>
+            <w:rFonts w:ascii="Cambria Math" w:eastAsia="Arial" w:hAnsi="Cambria Math" w:cs="Arial"/>
             <w:color w:val="000000" w:themeColor="text1"/>
           </w:rPr>
           <m:t>)</m:t>
@@ -431,21 +423,21 @@
       </m:oMath>
       <w:r>
         <w:rPr>
-          <w:rFonts w:ascii="Arial" w:hAnsi="Arial" w:eastAsia="Arial" w:cs="Arial"/>
+          <w:rFonts w:ascii="Arial" w:eastAsia="Arial" w:hAnsi="Arial" w:cs="Arial"/>
           <w:color w:val="000000" w:themeColor="text1"/>
         </w:rPr>
         <w:t>, and the corresponding model weight</w:t>
       </w:r>
       <w:r>
         <w:rPr>
-          <w:rFonts w:ascii="Arial" w:hAnsi="Arial" w:eastAsia="Arial" w:cs="Arial"/>
+          <w:rFonts w:ascii="Arial" w:eastAsia="Arial" w:hAnsi="Arial" w:cs="Arial"/>
           <w:color w:val="000000" w:themeColor="text1"/>
         </w:rPr>
         <w:t xml:space="preserve"> </w:t>
       </w:r>
       <w:r>
         <w:rPr>
-          <w:rFonts w:ascii="Arial" w:hAnsi="Arial" w:eastAsia="Arial" w:cs="Arial"/>
+          <w:rFonts w:ascii="Arial" w:eastAsia="Arial" w:hAnsi="Arial" w:cs="Arial"/>
           <w:color w:val="000000" w:themeColor="text1"/>
         </w:rPr>
         <w:t>(</w:t>
@@ -455,7 +447,7 @@
           <m:sSubPr>
             <m:ctrlPr>
               <w:rPr>
-                <w:rFonts w:ascii="Cambria Math" w:hAnsi="Cambria Math" w:eastAsia="Arial" w:cs="Arial"/>
+                <w:rFonts w:ascii="Cambria Math" w:eastAsia="Arial" w:hAnsi="Cambria Math" w:cs="Arial"/>
                 <w:i/>
                 <w:color w:val="000000" w:themeColor="text1"/>
               </w:rPr>
@@ -464,7 +456,7 @@
           <m:e>
             <m:r>
               <w:rPr>
-                <w:rFonts w:ascii="Cambria Math" w:hAnsi="Cambria Math" w:eastAsia="Arial" w:cs="Arial"/>
+                <w:rFonts w:ascii="Cambria Math" w:eastAsia="Arial" w:hAnsi="Cambria Math" w:cs="Arial"/>
                 <w:color w:val="000000" w:themeColor="text1"/>
               </w:rPr>
               <m:t>w</m:t>
@@ -473,7 +465,7 @@
           <m:sub>
             <m:r>
               <w:rPr>
-                <w:rFonts w:ascii="Cambria Math" w:hAnsi="Cambria Math" w:eastAsia="Arial" w:cs="Arial"/>
+                <w:rFonts w:ascii="Cambria Math" w:eastAsia="Arial" w:hAnsi="Cambria Math" w:cs="Arial"/>
                 <w:color w:val="000000" w:themeColor="text1"/>
               </w:rPr>
               <m:t>i</m:t>
@@ -483,14 +475,14 @@
       </m:oMath>
       <w:r>
         <w:rPr>
-          <w:rFonts w:ascii="Arial" w:hAnsi="Arial" w:eastAsia="Arial" w:cs="Arial"/>
+          <w:rFonts w:ascii="Arial" w:eastAsia="Arial" w:hAnsi="Arial" w:cs="Arial"/>
           <w:color w:val="000000" w:themeColor="text1"/>
         </w:rPr>
         <w:t>)</w:t>
       </w:r>
       <w:r>
         <w:rPr>
-          <w:rFonts w:ascii="Arial" w:hAnsi="Arial" w:eastAsia="Arial" w:cs="Arial"/>
+          <w:rFonts w:ascii="Arial" w:eastAsia="Arial" w:hAnsi="Arial" w:cs="Arial"/>
           <w:color w:val="000000" w:themeColor="text1"/>
         </w:rPr>
         <w:t xml:space="preserve"> was calculated as:</w:t>
@@ -500,17 +492,206 @@
       <w:pPr>
         <w:jc w:val="center"/>
         <w:rPr>
-          <w:rFonts w:ascii="Arial" w:hAnsi="Arial" w:eastAsia="Arial" w:cs="Arial"/>
-          <w:color w:val="000000" w:themeColor="text1"/>
-        </w:rPr>
-      </w:pPr>
+          <w:rFonts w:ascii="Arial" w:eastAsia="Arial" w:hAnsi="Arial" w:cs="Arial"/>
+          <w:color w:val="000000" w:themeColor="text1"/>
+        </w:rPr>
+      </w:pPr>
+      <m:oMathPara>
+        <m:oMath>
+          <m:sSub>
+            <m:sSubPr>
+              <m:ctrlPr>
+                <w:rPr>
+                  <w:rFonts w:ascii="Cambria Math" w:eastAsia="Arial" w:hAnsi="Cambria Math" w:cs="Arial"/>
+                  <w:i/>
+                  <w:color w:val="000000" w:themeColor="text1"/>
+                </w:rPr>
+              </m:ctrlPr>
+            </m:sSubPr>
+            <m:e>
+              <m:r>
+                <w:rPr>
+                  <w:rFonts w:ascii="Cambria Math" w:eastAsia="Arial" w:hAnsi="Cambria Math" w:cs="Arial"/>
+                  <w:color w:val="000000" w:themeColor="text1"/>
+                </w:rPr>
+                <m:t>w</m:t>
+              </m:r>
+            </m:e>
+            <m:sub>
+              <m:r>
+                <w:rPr>
+                  <w:rFonts w:ascii="Cambria Math" w:eastAsia="Arial" w:hAnsi="Cambria Math" w:cs="Arial"/>
+                  <w:color w:val="000000" w:themeColor="text1"/>
+                </w:rPr>
+                <m:t>i</m:t>
+              </m:r>
+            </m:sub>
+          </m:sSub>
+          <m:r>
+            <w:rPr>
+              <w:rFonts w:ascii="Cambria Math" w:eastAsia="Arial" w:hAnsi="Cambria Math" w:cs="Arial"/>
+              <w:color w:val="000000" w:themeColor="text1"/>
+            </w:rPr>
+            <m:t>=</m:t>
+          </m:r>
+          <m:f>
+            <m:fPr>
+              <m:ctrlPr>
+                <w:rPr>
+                  <w:rFonts w:ascii="Cambria Math" w:eastAsia="Arial" w:hAnsi="Cambria Math" w:cs="Arial"/>
+                  <w:color w:val="000000" w:themeColor="text1"/>
+                </w:rPr>
+              </m:ctrlPr>
+            </m:fPr>
+            <m:num>
+              <m:sSub>
+                <m:sSubPr>
+                  <m:ctrlPr>
+                    <w:rPr>
+                      <w:rFonts w:ascii="Cambria Math" w:eastAsia="Arial" w:hAnsi="Cambria Math" w:cs="Arial"/>
+                      <w:color w:val="000000" w:themeColor="text1"/>
+                    </w:rPr>
+                  </m:ctrlPr>
+                </m:sSubPr>
+                <m:e>
+                  <m:r>
+                    <w:rPr>
+                      <w:rFonts w:ascii="Cambria Math" w:eastAsia="Arial" w:hAnsi="Cambria Math" w:cs="Arial"/>
+                      <w:color w:val="000000" w:themeColor="text1"/>
+                    </w:rPr>
+                    <m:t>L</m:t>
+                  </m:r>
+                </m:e>
+                <m:sub>
+                  <m:r>
+                    <w:rPr>
+                      <w:rFonts w:ascii="Cambria Math" w:eastAsia="Arial" w:hAnsi="Cambria Math" w:cs="Arial"/>
+                      <w:color w:val="000000" w:themeColor="text1"/>
+                    </w:rPr>
+                    <m:t>i</m:t>
+                  </m:r>
+                </m:sub>
+              </m:sSub>
+              <m:ctrlPr>
+                <w:rPr>
+                  <w:rFonts w:ascii="Cambria Math" w:eastAsia="Arial" w:hAnsi="Cambria Math" w:cs="Arial"/>
+                  <w:i/>
+                  <w:color w:val="000000" w:themeColor="text1"/>
+                </w:rPr>
+              </m:ctrlPr>
+            </m:num>
+            <m:den>
+              <m:nary>
+                <m:naryPr>
+                  <m:chr m:val="∑"/>
+                  <m:ctrlPr>
+                    <w:rPr>
+                      <w:rFonts w:ascii="Cambria Math" w:eastAsia="Arial" w:hAnsi="Cambria Math" w:cs="Arial"/>
+                      <w:color w:val="000000" w:themeColor="text1"/>
+                    </w:rPr>
+                  </m:ctrlPr>
+                </m:naryPr>
+                <m:sub>
+                  <m:r>
+                    <w:rPr>
+                      <w:rFonts w:ascii="Cambria Math" w:eastAsia="Arial" w:hAnsi="Cambria Math" w:cs="Arial"/>
+                      <w:color w:val="000000" w:themeColor="text1"/>
+                    </w:rPr>
+                    <m:t>j=1</m:t>
+                  </m:r>
+                  <m:ctrlPr>
+                    <w:rPr>
+                      <w:rFonts w:ascii="Cambria Math" w:eastAsia="Arial" w:hAnsi="Cambria Math" w:cs="Arial"/>
+                      <w:i/>
+                      <w:color w:val="000000" w:themeColor="text1"/>
+                    </w:rPr>
+                  </m:ctrlPr>
+                </m:sub>
+                <m:sup>
+                  <m:r>
+                    <w:rPr>
+                      <w:rFonts w:ascii="Cambria Math" w:eastAsia="Arial" w:hAnsi="Cambria Math" w:cs="Arial"/>
+                      <w:color w:val="000000" w:themeColor="text1"/>
+                    </w:rPr>
+                    <m:t>n</m:t>
+                  </m:r>
+                  <m:ctrlPr>
+                    <w:rPr>
+                      <w:rFonts w:ascii="Cambria Math" w:eastAsia="Arial" w:hAnsi="Cambria Math" w:cs="Arial"/>
+                      <w:i/>
+                      <w:color w:val="000000" w:themeColor="text1"/>
+                    </w:rPr>
+                  </m:ctrlPr>
+                </m:sup>
+                <m:e>
+                  <m:sSub>
+                    <m:sSubPr>
+                      <m:ctrlPr>
+                        <w:rPr>
+                          <w:rFonts w:ascii="Cambria Math" w:eastAsia="Arial" w:hAnsi="Cambria Math" w:cs="Arial"/>
+                          <w:i/>
+                          <w:color w:val="000000" w:themeColor="text1"/>
+                        </w:rPr>
+                      </m:ctrlPr>
+                    </m:sSubPr>
+                    <m:e>
+                      <m:r>
+                        <w:rPr>
+                          <w:rFonts w:ascii="Cambria Math" w:eastAsia="Arial" w:hAnsi="Cambria Math" w:cs="Arial"/>
+                          <w:color w:val="000000" w:themeColor="text1"/>
+                        </w:rPr>
+                        <m:t>L</m:t>
+                      </m:r>
+                    </m:e>
+                    <m:sub>
+                      <m:r>
+                        <w:rPr>
+                          <w:rFonts w:ascii="Cambria Math" w:eastAsia="Arial" w:hAnsi="Cambria Math" w:cs="Arial"/>
+                          <w:color w:val="000000" w:themeColor="text1"/>
+                        </w:rPr>
+                        <m:t>J</m:t>
+                      </m:r>
+                    </m:sub>
+                  </m:sSub>
+                  <m:ctrlPr>
+                    <w:rPr>
+                      <w:rFonts w:ascii="Cambria Math" w:eastAsia="Arial" w:hAnsi="Cambria Math" w:cs="Arial"/>
+                      <w:i/>
+                      <w:color w:val="000000" w:themeColor="text1"/>
+                    </w:rPr>
+                  </m:ctrlPr>
+                </m:e>
+              </m:nary>
+              <m:ctrlPr>
+                <w:rPr>
+                  <w:rFonts w:ascii="Cambria Math" w:eastAsia="Arial" w:hAnsi="Cambria Math" w:cs="Arial"/>
+                  <w:i/>
+                  <w:color w:val="000000" w:themeColor="text1"/>
+                </w:rPr>
+              </m:ctrlPr>
+            </m:den>
+          </m:f>
+        </m:oMath>
+      </m:oMathPara>
+    </w:p>
+    <w:p>
+      <w:pPr>
+        <w:pStyle w:val="NormaleWeb"/>
+        <w:jc w:val="both"/>
+      </w:pPr>
+      <w:r>
+        <w:rPr>
+          <w:rFonts w:ascii="Arial" w:eastAsia="Arial" w:hAnsi="Arial" w:cs="Arial"/>
+          <w:color w:val="000000" w:themeColor="text1"/>
+        </w:rPr>
+        <w:t xml:space="preserve">where </w:t>
+      </w:r>
       <m:oMath>
         <m:sSub>
           <m:sSubPr>
             <m:ctrlPr>
               <w:rPr>
-                <w:rFonts w:ascii="Cambria Math" w:hAnsi="Cambria Math" w:eastAsia="Arial" w:cs="Arial"/>
-                <w:i/>
+                <w:rFonts w:ascii="Cambria Math" w:eastAsia="Arial" w:hAnsi="Cambria Math" w:cs="Arial"/>
                 <w:color w:val="000000" w:themeColor="text1"/>
               </w:rPr>
             </m:ctrlPr>
@@ -518,204 +699,7 @@
           <m:e>
             <m:r>
               <w:rPr>
-                <w:rFonts w:ascii="Cambria Math" w:hAnsi="Cambria Math" w:eastAsia="Arial" w:cs="Arial"/>
-                <w:color w:val="000000" w:themeColor="text1"/>
-              </w:rPr>
-              <m:t>w</m:t>
-            </m:r>
-          </m:e>
-          <m:sub>
-            <m:r>
-              <w:rPr>
-                <w:rFonts w:ascii="Cambria Math" w:hAnsi="Cambria Math" w:eastAsia="Arial" w:cs="Arial"/>
-                <w:color w:val="000000" w:themeColor="text1"/>
-              </w:rPr>
-              <m:t>i</m:t>
-            </m:r>
-          </m:sub>
-        </m:sSub>
-        <m:r>
-          <w:rPr>
-            <w:rFonts w:ascii="Cambria Math" w:hAnsi="Cambria Math" w:eastAsia="Arial" w:cs="Arial"/>
-            <w:color w:val="000000" w:themeColor="text1"/>
-          </w:rPr>
-          <m:t>=</m:t>
-        </m:r>
-        <m:f>
-          <m:fPr>
-            <m:ctrlPr>
-              <w:rPr>
-                <w:rFonts w:ascii="Cambria Math" w:hAnsi="Cambria Math" w:eastAsia="Arial" w:cs="Arial"/>
-                <w:color w:val="000000" w:themeColor="text1"/>
-              </w:rPr>
-            </m:ctrlPr>
-          </m:fPr>
-          <m:num>
-            <m:sSub>
-              <m:sSubPr>
-                <m:ctrlPr>
-                  <w:rPr>
-                    <w:rFonts w:ascii="Cambria Math" w:hAnsi="Cambria Math" w:eastAsia="Arial" w:cs="Arial"/>
-                    <w:color w:val="000000" w:themeColor="text1"/>
-                  </w:rPr>
-                </m:ctrlPr>
-              </m:sSubPr>
-              <m:e>
-                <m:r>
-                  <w:rPr>
-                    <w:rFonts w:ascii="Cambria Math" w:hAnsi="Cambria Math" w:eastAsia="Arial" w:cs="Arial"/>
-                    <w:color w:val="000000" w:themeColor="text1"/>
-                  </w:rPr>
-                  <m:t>L</m:t>
-                </m:r>
-              </m:e>
-              <m:sub>
-                <m:r>
-                  <w:rPr>
-                    <w:rFonts w:ascii="Cambria Math" w:hAnsi="Cambria Math" w:eastAsia="Arial" w:cs="Arial"/>
-                    <w:color w:val="000000" w:themeColor="text1"/>
-                  </w:rPr>
-                  <m:t>i</m:t>
-                </m:r>
-              </m:sub>
-            </m:sSub>
-            <m:ctrlPr>
-              <w:rPr>
-                <w:rFonts w:ascii="Cambria Math" w:hAnsi="Cambria Math" w:eastAsia="Arial" w:cs="Arial"/>
-                <w:i/>
-                <w:color w:val="000000" w:themeColor="text1"/>
-              </w:rPr>
-            </m:ctrlPr>
-          </m:num>
-          <m:den>
-            <m:nary>
-              <m:naryPr>
-                <m:chr m:val="∑"/>
-                <m:ctrlPr>
-                  <w:rPr>
-                    <w:rFonts w:ascii="Cambria Math" w:hAnsi="Cambria Math" w:eastAsia="Arial" w:cs="Arial"/>
-                    <w:color w:val="000000" w:themeColor="text1"/>
-                  </w:rPr>
-                </m:ctrlPr>
-              </m:naryPr>
-              <m:sub>
-                <m:r>
-                  <w:rPr>
-                    <w:rFonts w:ascii="Cambria Math" w:hAnsi="Cambria Math" w:eastAsia="Arial" w:cs="Arial"/>
-                    <w:color w:val="000000" w:themeColor="text1"/>
-                  </w:rPr>
-                  <m:t>j</m:t>
-                </m:r>
-                <m:r>
-                  <w:rPr>
-                    <w:rFonts w:ascii="Cambria Math" w:hAnsi="Cambria Math" w:eastAsia="Arial" w:cs="Arial"/>
-                    <w:color w:val="000000" w:themeColor="text1"/>
-                  </w:rPr>
-                  <m:t>=1</m:t>
-                </m:r>
-                <m:ctrlPr>
-                  <w:rPr>
-                    <w:rFonts w:ascii="Cambria Math" w:hAnsi="Cambria Math" w:eastAsia="Arial" w:cs="Arial"/>
-                    <w:i/>
-                    <w:color w:val="000000" w:themeColor="text1"/>
-                  </w:rPr>
-                </m:ctrlPr>
-              </m:sub>
-              <m:sup>
-                <m:r>
-                  <w:rPr>
-                    <w:rFonts w:ascii="Cambria Math" w:hAnsi="Cambria Math" w:eastAsia="Arial" w:cs="Arial"/>
-                    <w:color w:val="000000" w:themeColor="text1"/>
-                  </w:rPr>
-                  <m:t>n</m:t>
-                </m:r>
-                <m:ctrlPr>
-                  <w:rPr>
-                    <w:rFonts w:ascii="Cambria Math" w:hAnsi="Cambria Math" w:eastAsia="Arial" w:cs="Arial"/>
-                    <w:i/>
-                    <w:color w:val="000000" w:themeColor="text1"/>
-                  </w:rPr>
-                </m:ctrlPr>
-              </m:sup>
-              <m:e>
-                <m:sSub>
-                  <m:sSubPr>
-                    <m:ctrlPr>
-                      <w:rPr>
-                        <w:rFonts w:ascii="Cambria Math" w:hAnsi="Cambria Math" w:eastAsia="Arial" w:cs="Arial"/>
-                        <w:i/>
-                        <w:color w:val="000000" w:themeColor="text1"/>
-                      </w:rPr>
-                    </m:ctrlPr>
-                  </m:sSubPr>
-                  <m:e>
-                    <m:r>
-                      <w:rPr>
-                        <w:rFonts w:ascii="Cambria Math" w:hAnsi="Cambria Math" w:eastAsia="Arial" w:cs="Arial"/>
-                        <w:color w:val="000000" w:themeColor="text1"/>
-                      </w:rPr>
-                      <m:t>L</m:t>
-                    </m:r>
-                  </m:e>
-                  <m:sub>
-                    <m:r>
-                      <w:rPr>
-                        <w:rFonts w:ascii="Cambria Math" w:hAnsi="Cambria Math" w:eastAsia="Arial" w:cs="Arial"/>
-                        <w:color w:val="000000" w:themeColor="text1"/>
-                      </w:rPr>
-                      <m:t>J</m:t>
-                    </m:r>
-                  </m:sub>
-                </m:sSub>
-                <m:ctrlPr>
-                  <w:rPr>
-                    <w:rFonts w:ascii="Cambria Math" w:hAnsi="Cambria Math" w:eastAsia="Arial" w:cs="Arial"/>
-                    <w:i/>
-                    <w:color w:val="000000" w:themeColor="text1"/>
-                  </w:rPr>
-                </m:ctrlPr>
-              </m:e>
-            </m:nary>
-            <m:ctrlPr>
-              <w:rPr>
-                <w:rFonts w:ascii="Cambria Math" w:hAnsi="Cambria Math" w:eastAsia="Arial" w:cs="Arial"/>
-                <w:i/>
-                <w:color w:val="000000" w:themeColor="text1"/>
-              </w:rPr>
-            </m:ctrlPr>
-          </m:den>
-        </m:f>
-      </m:oMath>
-      <w:r>
-        <w:t>,</w:t>
-      </w:r>
-    </w:p>
-    <w:p>
-      <w:pPr>
-        <w:pStyle w:val="NormaleWeb"/>
-        <w:jc w:val="both"/>
-      </w:pPr>
-      <w:r>
-        <w:rPr>
-          <w:rFonts w:ascii="Arial" w:hAnsi="Arial" w:eastAsia="Arial" w:cs="Arial"/>
-          <w:color w:val="000000" w:themeColor="text1"/>
-        </w:rPr>
-        <w:t xml:space="preserve">where </w:t>
-      </w:r>
-      <m:oMath>
-        <m:sSub>
-          <m:sSubPr>
-            <m:ctrlPr>
-              <w:rPr>
-                <w:rFonts w:ascii="Cambria Math" w:hAnsi="Cambria Math" w:eastAsia="Arial" w:cs="Arial"/>
-                <w:color w:val="000000" w:themeColor="text1"/>
-              </w:rPr>
-            </m:ctrlPr>
-          </m:sSubPr>
-          <m:e>
-            <m:r>
-              <w:rPr>
-                <w:rFonts w:ascii="Cambria Math" w:hAnsi="Cambria Math" w:eastAsia="Arial" w:cs="Arial"/>
+                <w:rFonts w:ascii="Cambria Math" w:eastAsia="Arial" w:hAnsi="Cambria Math" w:cs="Arial"/>
                 <w:color w:val="000000" w:themeColor="text1"/>
               </w:rPr>
               <m:t>L</m:t>
@@ -724,7 +708,7 @@
           <m:sub>
             <m:r>
               <w:rPr>
-                <w:rFonts w:ascii="Cambria Math" w:hAnsi="Cambria Math" w:eastAsia="Arial" w:cs="Arial"/>
+                <w:rFonts w:ascii="Cambria Math" w:eastAsia="Arial" w:hAnsi="Cambria Math" w:cs="Arial"/>
                 <w:color w:val="000000" w:themeColor="text1"/>
               </w:rPr>
               <m:t>i</m:t>
@@ -734,14 +718,14 @@
       </m:oMath>
       <w:r>
         <w:rPr>
-          <w:rFonts w:ascii="Arial" w:hAnsi="Arial" w:eastAsia="Arial" w:cs="Arial"/>
+          <w:rFonts w:ascii="Arial" w:eastAsia="Arial" w:hAnsi="Arial" w:cs="Arial"/>
           <w:color w:val="000000" w:themeColor="text1"/>
         </w:rPr>
         <w:t xml:space="preserve">is the </w:t>
       </w:r>
       <w:r>
         <w:rPr>
-          <w:rFonts w:ascii="Arial" w:hAnsi="Arial" w:eastAsia="Arial" w:cs="Arial"/>
+          <w:rFonts w:ascii="Arial" w:eastAsia="Arial" w:hAnsi="Arial" w:cs="Arial"/>
           <w:color w:val="000000" w:themeColor="text1"/>
         </w:rPr>
         <w:t xml:space="preserve">likelihood of model </w:t>
@@ -749,7 +733,7 @@
       <m:oMath>
         <m:r>
           <w:rPr>
-            <w:rFonts w:ascii="Cambria Math" w:hAnsi="Cambria Math" w:eastAsia="Arial" w:cs="Arial"/>
+            <w:rFonts w:ascii="Cambria Math" w:eastAsia="Arial" w:hAnsi="Cambria Math" w:cs="Arial"/>
             <w:color w:val="000000" w:themeColor="text1"/>
           </w:rPr>
           <m:t>i</m:t>
@@ -757,7 +741,7 @@
       </m:oMath>
       <w:r>
         <w:rPr>
-          <w:rFonts w:ascii="Arial" w:hAnsi="Arial" w:eastAsia="Arial" w:cs="Arial"/>
+          <w:rFonts w:ascii="Arial" w:eastAsia="Arial" w:hAnsi="Arial" w:cs="Arial"/>
           <w:color w:val="000000" w:themeColor="text1"/>
         </w:rPr>
         <w:t xml:space="preserve">, and </w:t>
@@ -765,7 +749,7 @@
       <m:oMath>
         <m:r>
           <w:rPr>
-            <w:rFonts w:ascii="Cambria Math" w:hAnsi="Cambria Math" w:eastAsia="Arial" w:cs="Arial"/>
+            <w:rFonts w:ascii="Cambria Math" w:eastAsia="Arial" w:hAnsi="Cambria Math" w:cs="Arial"/>
             <w:color w:val="000000" w:themeColor="text1"/>
           </w:rPr>
           <m:t>n</m:t>
@@ -773,70 +757,70 @@
       </m:oMath>
       <w:r>
         <w:rPr>
-          <w:rFonts w:ascii="Arial" w:hAnsi="Arial" w:eastAsia="Arial" w:cs="Arial"/>
+          <w:rFonts w:ascii="Arial" w:eastAsia="Arial" w:hAnsi="Arial" w:cs="Arial"/>
           <w:color w:val="000000" w:themeColor="text1"/>
         </w:rPr>
         <w:t xml:space="preserve"> </w:t>
       </w:r>
       <w:r>
         <w:rPr>
-          <w:rFonts w:ascii="Arial" w:hAnsi="Arial" w:eastAsia="Arial" w:cs="Arial"/>
+          <w:rFonts w:ascii="Arial" w:eastAsia="Arial" w:hAnsi="Arial" w:cs="Arial"/>
           <w:color w:val="000000" w:themeColor="text1"/>
         </w:rPr>
         <w:t>is the total number of candidate models.</w:t>
       </w:r>
       <w:r>
         <w:rPr>
-          <w:rFonts w:ascii="Arial" w:hAnsi="Arial" w:eastAsia="Arial" w:cs="Arial"/>
+          <w:rFonts w:ascii="Arial" w:eastAsia="Arial" w:hAnsi="Arial" w:cs="Arial"/>
           <w:color w:val="000000" w:themeColor="text1"/>
         </w:rPr>
         <w:t xml:space="preserve"> </w:t>
       </w:r>
       <w:r>
         <w:rPr>
-          <w:rFonts w:ascii="Arial" w:hAnsi="Arial" w:eastAsia="Arial" w:cs="Arial"/>
+          <w:rFonts w:ascii="Arial" w:eastAsia="Arial" w:hAnsi="Arial" w:cs="Arial"/>
           <w:color w:val="000000" w:themeColor="text1"/>
         </w:rPr>
         <w:t>The predicted concentrations from the best</w:t>
       </w:r>
       <w:r>
         <w:rPr>
-          <w:rFonts w:ascii="Arial" w:hAnsi="Arial" w:eastAsia="Arial" w:cs="Arial"/>
+          <w:rFonts w:ascii="Arial" w:eastAsia="Arial" w:hAnsi="Arial" w:cs="Arial"/>
           <w:color w:val="000000" w:themeColor="text1"/>
         </w:rPr>
         <w:t>-</w:t>
       </w:r>
       <w:r>
         <w:rPr>
-          <w:rFonts w:ascii="Arial" w:hAnsi="Arial" w:eastAsia="Arial" w:cs="Arial"/>
+          <w:rFonts w:ascii="Arial" w:eastAsia="Arial" w:hAnsi="Arial" w:cs="Arial"/>
           <w:color w:val="000000" w:themeColor="text1"/>
         </w:rPr>
         <w:t>fitt</w:t>
       </w:r>
       <w:r>
         <w:rPr>
-          <w:rFonts w:ascii="Arial" w:hAnsi="Arial" w:eastAsia="Arial" w:cs="Arial"/>
+          <w:rFonts w:ascii="Arial" w:eastAsia="Arial" w:hAnsi="Arial" w:cs="Arial"/>
           <w:color w:val="000000" w:themeColor="text1"/>
         </w:rPr>
         <w:t>ing</w:t>
       </w:r>
       <w:r>
         <w:rPr>
-          <w:rFonts w:ascii="Arial" w:hAnsi="Arial" w:eastAsia="Arial" w:cs="Arial"/>
+          <w:rFonts w:ascii="Arial" w:eastAsia="Arial" w:hAnsi="Arial" w:cs="Arial"/>
           <w:color w:val="000000" w:themeColor="text1"/>
         </w:rPr>
         <w:t xml:space="preserve"> model </w:t>
       </w:r>
       <w:r>
         <w:rPr>
-          <w:rFonts w:ascii="Arial" w:hAnsi="Arial" w:eastAsia="Arial" w:cs="Arial"/>
+          <w:rFonts w:ascii="Arial" w:eastAsia="Arial" w:hAnsi="Arial" w:cs="Arial"/>
           <w:color w:val="000000" w:themeColor="text1"/>
         </w:rPr>
         <w:t xml:space="preserve">were </w:t>
       </w:r>
       <w:r>
         <w:rPr>
-          <w:rFonts w:ascii="Arial" w:hAnsi="Arial" w:eastAsia="Arial" w:cs="Arial"/>
+          <w:rFonts w:ascii="Arial" w:eastAsia="Arial" w:hAnsi="Arial" w:cs="Arial"/>
           <w:color w:val="000000" w:themeColor="text1"/>
         </w:rPr>
         <w:t>compared with observed concentrations by calculating relative bias (</w:t>
@@ -844,7 +828,7 @@
       <w:proofErr w:type="spellStart"/>
       <w:r>
         <w:rPr>
-          <w:rFonts w:ascii="Arial" w:hAnsi="Arial" w:eastAsia="Arial" w:cs="Arial"/>
+          <w:rFonts w:ascii="Arial" w:eastAsia="Arial" w:hAnsi="Arial" w:cs="Arial"/>
           <w:color w:val="000000" w:themeColor="text1"/>
         </w:rPr>
         <w:t>rBias</w:t>
@@ -852,7 +836,7 @@
       <w:proofErr w:type="spellEnd"/>
       <w:r>
         <w:rPr>
-          <w:rFonts w:ascii="Arial" w:hAnsi="Arial" w:eastAsia="Arial" w:cs="Arial"/>
+          <w:rFonts w:ascii="Arial" w:eastAsia="Arial" w:hAnsi="Arial" w:cs="Arial"/>
           <w:color w:val="000000" w:themeColor="text1"/>
         </w:rPr>
         <w:t>) and relative root mean squared error (</w:t>
@@ -860,7 +844,7 @@
       <w:proofErr w:type="spellStart"/>
       <w:r>
         <w:rPr>
-          <w:rFonts w:ascii="Arial" w:hAnsi="Arial" w:eastAsia="Arial" w:cs="Arial"/>
+          <w:rFonts w:ascii="Arial" w:eastAsia="Arial" w:hAnsi="Arial" w:cs="Arial"/>
           <w:color w:val="000000" w:themeColor="text1"/>
         </w:rPr>
         <w:t>rRMSE</w:t>
@@ -868,7 +852,7 @@
       <w:proofErr w:type="spellEnd"/>
       <w:r>
         <w:rPr>
-          <w:rFonts w:ascii="Arial" w:hAnsi="Arial" w:eastAsia="Arial" w:cs="Arial"/>
+          <w:rFonts w:ascii="Arial" w:eastAsia="Arial" w:hAnsi="Arial" w:cs="Arial"/>
           <w:color w:val="000000" w:themeColor="text1"/>
         </w:rPr>
         <w:t>) as follows:</w:t>
@@ -877,7 +861,7 @@
     <w:p>
       <w:pPr>
         <w:rPr>
-          <w:rFonts w:ascii="Arial" w:hAnsi="Arial" w:eastAsia="Arial" w:cs="Arial"/>
+          <w:rFonts w:ascii="Arial" w:eastAsia="Arial" w:hAnsi="Arial" w:cs="Arial"/>
           <w:color w:val="000000" w:themeColor="text1"/>
         </w:rPr>
       </w:pPr>
@@ -885,7 +869,7 @@
         <m:oMath>
           <m:r>
             <w:rPr>
-              <w:rFonts w:ascii="Cambria Math" w:hAnsi="Cambria Math" w:eastAsia="Arial" w:cs="Arial"/>
+              <w:rFonts w:ascii="Cambria Math" w:eastAsia="Arial" w:hAnsi="Cambria Math" w:cs="Arial"/>
               <w:color w:val="000000" w:themeColor="text1"/>
             </w:rPr>
             <m:t>rBias=</m:t>
@@ -894,7 +878,7 @@
             <m:fPr>
               <m:ctrlPr>
                 <w:rPr>
-                  <w:rFonts w:ascii="Cambria Math" w:hAnsi="Cambria Math" w:eastAsia="Arial" w:cs="Arial"/>
+                  <w:rFonts w:ascii="Cambria Math" w:eastAsia="Arial" w:hAnsi="Cambria Math" w:cs="Arial"/>
                   <w:i/>
                   <w:color w:val="000000" w:themeColor="text1"/>
                 </w:rPr>
@@ -903,7 +887,7 @@
             <m:num>
               <m:r>
                 <w:rPr>
-                  <w:rFonts w:ascii="Cambria Math" w:hAnsi="Cambria Math" w:eastAsia="Arial" w:cs="Arial"/>
+                  <w:rFonts w:ascii="Cambria Math" w:eastAsia="Arial" w:hAnsi="Cambria Math" w:cs="Arial"/>
                   <w:color w:val="000000" w:themeColor="text1"/>
                 </w:rPr>
                 <m:t>1</m:t>
@@ -912,7 +896,7 @@
             <m:den>
               <m:r>
                 <w:rPr>
-                  <w:rFonts w:ascii="Cambria Math" w:hAnsi="Cambria Math" w:eastAsia="Arial" w:cs="Arial"/>
+                  <w:rFonts w:ascii="Cambria Math" w:eastAsia="Arial" w:hAnsi="Cambria Math" w:cs="Arial"/>
                   <w:color w:val="000000" w:themeColor="text1"/>
                 </w:rPr>
                 <m:t>N</m:t>
@@ -921,7 +905,7 @@
           </m:f>
           <m:r>
             <w:rPr>
-              <w:rFonts w:ascii="Cambria Math" w:hAnsi="Cambria Math" w:eastAsia="Arial" w:cs="Arial"/>
+              <w:rFonts w:ascii="Cambria Math" w:eastAsia="Arial" w:hAnsi="Cambria Math" w:cs="Arial"/>
               <w:color w:val="000000" w:themeColor="text1"/>
             </w:rPr>
             <m:t xml:space="preserve"> </m:t>
@@ -932,7 +916,7 @@
               <m:limLoc m:val="undOvr"/>
               <m:ctrlPr>
                 <w:rPr>
-                  <w:rFonts w:ascii="Cambria Math" w:hAnsi="Cambria Math" w:eastAsia="Arial" w:cs="Arial"/>
+                  <w:rFonts w:ascii="Cambria Math" w:eastAsia="Arial" w:hAnsi="Cambria Math" w:cs="Arial"/>
                   <w:i/>
                   <w:color w:val="000000" w:themeColor="text1"/>
                 </w:rPr>
@@ -941,7 +925,7 @@
             <m:sub>
               <m:r>
                 <w:rPr>
-                  <w:rFonts w:ascii="Cambria Math" w:hAnsi="Cambria Math" w:eastAsia="Arial" w:cs="Arial"/>
+                  <w:rFonts w:ascii="Cambria Math" w:eastAsia="Arial" w:hAnsi="Cambria Math" w:cs="Arial"/>
                   <w:color w:val="000000" w:themeColor="text1"/>
                 </w:rPr>
                 <m:t>1</m:t>
@@ -950,7 +934,7 @@
             <m:sup>
               <m:r>
                 <w:rPr>
-                  <w:rFonts w:ascii="Cambria Math" w:hAnsi="Cambria Math" w:eastAsia="Arial" w:cs="Arial"/>
+                  <w:rFonts w:ascii="Cambria Math" w:eastAsia="Arial" w:hAnsi="Cambria Math" w:cs="Arial"/>
                   <w:color w:val="000000" w:themeColor="text1"/>
                 </w:rPr>
                 <m:t>i</m:t>
@@ -961,7 +945,7 @@
                 <m:fPr>
                   <m:ctrlPr>
                     <w:rPr>
-                      <w:rFonts w:ascii="Cambria Math" w:hAnsi="Cambria Math" w:eastAsia="Arial" w:cs="Arial"/>
+                      <w:rFonts w:ascii="Cambria Math" w:eastAsia="Arial" w:hAnsi="Cambria Math" w:cs="Arial"/>
                       <w:i/>
                       <w:color w:val="000000" w:themeColor="text1"/>
                     </w:rPr>
@@ -972,7 +956,7 @@
                     <m:sSubPr>
                       <m:ctrlPr>
                         <w:rPr>
-                          <w:rFonts w:ascii="Cambria Math" w:hAnsi="Cambria Math" w:eastAsia="Arial" w:cs="Arial"/>
+                          <w:rFonts w:ascii="Cambria Math" w:eastAsia="Arial" w:hAnsi="Cambria Math" w:cs="Arial"/>
                           <w:i/>
                           <w:color w:val="000000" w:themeColor="text1"/>
                         </w:rPr>
@@ -981,7 +965,7 @@
                     <m:e>
                       <m:r>
                         <w:rPr>
-                          <w:rFonts w:ascii="Cambria Math" w:hAnsi="Cambria Math" w:eastAsia="Arial" w:cs="Arial"/>
+                          <w:rFonts w:ascii="Cambria Math" w:eastAsia="Arial" w:hAnsi="Cambria Math" w:cs="Arial"/>
                           <w:color w:val="000000" w:themeColor="text1"/>
                         </w:rPr>
                         <m:t>predicted</m:t>
@@ -990,7 +974,7 @@
                     <m:sub>
                       <m:r>
                         <w:rPr>
-                          <w:rFonts w:ascii="Cambria Math" w:hAnsi="Cambria Math" w:eastAsia="Arial" w:cs="Arial"/>
+                          <w:rFonts w:ascii="Cambria Math" w:eastAsia="Arial" w:hAnsi="Cambria Math" w:cs="Arial"/>
                           <w:color w:val="000000" w:themeColor="text1"/>
                         </w:rPr>
                         <m:t>i</m:t>
@@ -999,7 +983,7 @@
                   </m:sSub>
                   <m:r>
                     <w:rPr>
-                      <w:rFonts w:ascii="Cambria Math" w:hAnsi="Cambria Math" w:eastAsia="Arial" w:cs="Arial"/>
+                      <w:rFonts w:ascii="Cambria Math" w:eastAsia="Arial" w:hAnsi="Cambria Math" w:cs="Arial"/>
                       <w:color w:val="000000" w:themeColor="text1"/>
                     </w:rPr>
                     <m:t>-</m:t>
@@ -1008,7 +992,7 @@
                     <m:sSubPr>
                       <m:ctrlPr>
                         <w:rPr>
-                          <w:rFonts w:ascii="Cambria Math" w:hAnsi="Cambria Math" w:eastAsia="Arial" w:cs="Arial"/>
+                          <w:rFonts w:ascii="Cambria Math" w:eastAsia="Arial" w:hAnsi="Cambria Math" w:cs="Arial"/>
                           <w:i/>
                           <w:color w:val="000000" w:themeColor="text1"/>
                         </w:rPr>
@@ -1017,7 +1001,7 @@
                     <m:e>
                       <m:r>
                         <w:rPr>
-                          <w:rFonts w:ascii="Cambria Math" w:hAnsi="Cambria Math" w:eastAsia="Arial" w:cs="Arial"/>
+                          <w:rFonts w:ascii="Cambria Math" w:eastAsia="Arial" w:hAnsi="Cambria Math" w:cs="Arial"/>
                           <w:color w:val="000000" w:themeColor="text1"/>
                         </w:rPr>
                         <m:t>observed</m:t>
@@ -1026,7 +1010,7 @@
                     <m:sub>
                       <m:r>
                         <w:rPr>
-                          <w:rFonts w:ascii="Cambria Math" w:hAnsi="Cambria Math" w:eastAsia="Arial" w:cs="Arial"/>
+                          <w:rFonts w:ascii="Cambria Math" w:eastAsia="Arial" w:hAnsi="Cambria Math" w:cs="Arial"/>
                           <w:color w:val="000000" w:themeColor="text1"/>
                         </w:rPr>
                         <m:t>i</m:t>
@@ -1037,7 +1021,7 @@
                 <m:den>
                   <m:r>
                     <w:rPr>
-                      <w:rFonts w:ascii="Cambria Math" w:hAnsi="Cambria Math" w:eastAsia="Arial" w:cs="Arial"/>
+                      <w:rFonts w:ascii="Cambria Math" w:eastAsia="Arial" w:hAnsi="Cambria Math" w:cs="Arial"/>
                       <w:color w:val="000000" w:themeColor="text1"/>
                     </w:rPr>
                     <m:t>(</m:t>
@@ -1046,7 +1030,7 @@
                     <m:sSubPr>
                       <m:ctrlPr>
                         <w:rPr>
-                          <w:rFonts w:ascii="Cambria Math" w:hAnsi="Cambria Math" w:eastAsia="Arial" w:cs="Arial"/>
+                          <w:rFonts w:ascii="Cambria Math" w:eastAsia="Arial" w:hAnsi="Cambria Math" w:cs="Arial"/>
                           <w:i/>
                           <w:color w:val="000000" w:themeColor="text1"/>
                         </w:rPr>
@@ -1055,7 +1039,7 @@
                     <m:e>
                       <m:r>
                         <w:rPr>
-                          <w:rFonts w:ascii="Cambria Math" w:hAnsi="Cambria Math" w:eastAsia="Arial" w:cs="Arial"/>
+                          <w:rFonts w:ascii="Cambria Math" w:eastAsia="Arial" w:hAnsi="Cambria Math" w:cs="Arial"/>
                           <w:color w:val="000000" w:themeColor="text1"/>
                         </w:rPr>
                         <m:t>predicted</m:t>
@@ -1064,7 +1048,7 @@
                     <m:sub>
                       <m:r>
                         <w:rPr>
-                          <w:rFonts w:ascii="Cambria Math" w:hAnsi="Cambria Math" w:eastAsia="Arial" w:cs="Arial"/>
+                          <w:rFonts w:ascii="Cambria Math" w:eastAsia="Arial" w:hAnsi="Cambria Math" w:cs="Arial"/>
                           <w:color w:val="000000" w:themeColor="text1"/>
                         </w:rPr>
                         <m:t>i</m:t>
@@ -1073,7 +1057,7 @@
                   </m:sSub>
                   <m:r>
                     <w:rPr>
-                      <w:rFonts w:ascii="Cambria Math" w:hAnsi="Cambria Math" w:eastAsia="Arial" w:cs="Arial"/>
+                      <w:rFonts w:ascii="Cambria Math" w:eastAsia="Arial" w:hAnsi="Cambria Math" w:cs="Arial"/>
                       <w:color w:val="000000" w:themeColor="text1"/>
                     </w:rPr>
                     <m:t>+</m:t>
@@ -1082,7 +1066,7 @@
                     <m:sSubPr>
                       <m:ctrlPr>
                         <w:rPr>
-                          <w:rFonts w:ascii="Cambria Math" w:hAnsi="Cambria Math" w:eastAsia="Arial" w:cs="Arial"/>
+                          <w:rFonts w:ascii="Cambria Math" w:eastAsia="Arial" w:hAnsi="Cambria Math" w:cs="Arial"/>
                           <w:i/>
                           <w:color w:val="000000" w:themeColor="text1"/>
                         </w:rPr>
@@ -1091,7 +1075,7 @@
                     <m:e>
                       <m:r>
                         <w:rPr>
-                          <w:rFonts w:ascii="Cambria Math" w:hAnsi="Cambria Math" w:eastAsia="Arial" w:cs="Arial"/>
+                          <w:rFonts w:ascii="Cambria Math" w:eastAsia="Arial" w:hAnsi="Cambria Math" w:cs="Arial"/>
                           <w:color w:val="000000" w:themeColor="text1"/>
                         </w:rPr>
                         <m:t>observed</m:t>
@@ -1100,7 +1084,7 @@
                     <m:sub>
                       <m:r>
                         <w:rPr>
-                          <w:rFonts w:ascii="Cambria Math" w:hAnsi="Cambria Math" w:eastAsia="Arial" w:cs="Arial"/>
+                          <w:rFonts w:ascii="Cambria Math" w:eastAsia="Arial" w:hAnsi="Cambria Math" w:cs="Arial"/>
                           <w:color w:val="000000" w:themeColor="text1"/>
                         </w:rPr>
                         <m:t>i</m:t>
@@ -1109,7 +1093,7 @@
                   </m:sSub>
                   <m:r>
                     <w:rPr>
-                      <w:rFonts w:ascii="Cambria Math" w:hAnsi="Cambria Math" w:eastAsia="Arial" w:cs="Arial"/>
+                      <w:rFonts w:ascii="Cambria Math" w:eastAsia="Arial" w:hAnsi="Cambria Math" w:cs="Arial"/>
                       <w:color w:val="000000" w:themeColor="text1"/>
                     </w:rPr>
                     <m:t>)/2</m:t>
@@ -1120,7 +1104,7 @@
           </m:nary>
           <m:r>
             <w:rPr>
-              <w:rFonts w:ascii="Cambria Math" w:hAnsi="Cambria Math" w:eastAsia="Arial" w:cs="Arial"/>
+              <w:rFonts w:ascii="Cambria Math" w:eastAsia="Arial" w:hAnsi="Cambria Math" w:cs="Arial"/>
               <w:color w:val="000000" w:themeColor="text1"/>
             </w:rPr>
             <m:t>*100</m:t>
@@ -1131,15 +1115,15 @@
     <w:p>
       <w:pPr>
         <w:rPr>
-          <w:rFonts w:ascii="Arial" w:hAnsi="Arial" w:eastAsia="Arial" w:cs="Arial"/>
-          <w:color w:val="000000" w:themeColor="text1"/>
-        </w:rPr>
-      </w:pPr>
-    </w:p>
-    <w:p>
-      <w:pPr>
-        <w:rPr>
-          <w:rFonts w:ascii="Arial" w:hAnsi="Arial" w:eastAsia="Arial" w:cs="Arial"/>
+          <w:rFonts w:ascii="Arial" w:eastAsia="Arial" w:hAnsi="Arial" w:cs="Arial"/>
+          <w:color w:val="000000" w:themeColor="text1"/>
+        </w:rPr>
+      </w:pPr>
+    </w:p>
+    <w:p>
+      <w:pPr>
+        <w:rPr>
+          <w:rFonts w:ascii="Arial" w:eastAsia="Arial" w:hAnsi="Arial" w:cs="Arial"/>
           <w:color w:val="000000" w:themeColor="text1"/>
         </w:rPr>
       </w:pPr>
@@ -1147,7 +1131,7 @@
         <m:oMath>
           <m:r>
             <w:rPr>
-              <w:rFonts w:ascii="Cambria Math" w:hAnsi="Cambria Math" w:eastAsia="Arial" w:cs="Arial"/>
+              <w:rFonts w:ascii="Cambria Math" w:eastAsia="Arial" w:hAnsi="Cambria Math" w:cs="Arial"/>
               <w:color w:val="000000" w:themeColor="text1"/>
             </w:rPr>
             <m:t>rRMSE=</m:t>
@@ -1157,7 +1141,7 @@
               <m:degHide m:val="1"/>
               <m:ctrlPr>
                 <w:rPr>
-                  <w:rFonts w:ascii="Cambria Math" w:hAnsi="Cambria Math" w:eastAsia="Arial" w:cs="Arial"/>
+                  <w:rFonts w:ascii="Cambria Math" w:eastAsia="Arial" w:hAnsi="Cambria Math" w:cs="Arial"/>
                   <w:i/>
                   <w:color w:val="000000" w:themeColor="text1"/>
                 </w:rPr>
@@ -1169,7 +1153,7 @@
                 <m:fPr>
                   <m:ctrlPr>
                     <w:rPr>
-                      <w:rFonts w:ascii="Cambria Math" w:hAnsi="Cambria Math" w:eastAsia="Arial" w:cs="Arial"/>
+                      <w:rFonts w:ascii="Cambria Math" w:eastAsia="Arial" w:hAnsi="Cambria Math" w:cs="Arial"/>
                       <w:i/>
                       <w:color w:val="000000" w:themeColor="text1"/>
                     </w:rPr>
@@ -1178,7 +1162,7 @@
                 <m:num>
                   <m:r>
                     <w:rPr>
-                      <w:rFonts w:ascii="Cambria Math" w:hAnsi="Cambria Math" w:eastAsia="Arial" w:cs="Arial"/>
+                      <w:rFonts w:ascii="Cambria Math" w:eastAsia="Arial" w:hAnsi="Cambria Math" w:cs="Arial"/>
                       <w:color w:val="000000" w:themeColor="text1"/>
                     </w:rPr>
                     <m:t>1</m:t>
@@ -1187,7 +1171,7 @@
                 <m:den>
                   <m:r>
                     <w:rPr>
-                      <w:rFonts w:ascii="Cambria Math" w:hAnsi="Cambria Math" w:eastAsia="Arial" w:cs="Arial"/>
+                      <w:rFonts w:ascii="Cambria Math" w:eastAsia="Arial" w:hAnsi="Cambria Math" w:cs="Arial"/>
                       <w:color w:val="000000" w:themeColor="text1"/>
                     </w:rPr>
                     <m:t>N</m:t>
@@ -1196,7 +1180,7 @@
               </m:f>
               <m:r>
                 <w:rPr>
-                  <w:rFonts w:ascii="Cambria Math" w:hAnsi="Cambria Math" w:eastAsia="Arial" w:cs="Arial"/>
+                  <w:rFonts w:ascii="Cambria Math" w:eastAsia="Arial" w:hAnsi="Cambria Math" w:cs="Arial"/>
                   <w:color w:val="000000" w:themeColor="text1"/>
                 </w:rPr>
                 <m:t xml:space="preserve"> </m:t>
@@ -1207,7 +1191,7 @@
                   <m:limLoc m:val="undOvr"/>
                   <m:ctrlPr>
                     <w:rPr>
-                      <w:rFonts w:ascii="Cambria Math" w:hAnsi="Cambria Math" w:eastAsia="Arial" w:cs="Arial"/>
+                      <w:rFonts w:ascii="Cambria Math" w:eastAsia="Arial" w:hAnsi="Cambria Math" w:cs="Arial"/>
                       <w:i/>
                       <w:color w:val="000000" w:themeColor="text1"/>
                     </w:rPr>
@@ -1216,7 +1200,7 @@
                 <m:sub>
                   <m:r>
                     <w:rPr>
-                      <w:rFonts w:ascii="Cambria Math" w:hAnsi="Cambria Math" w:eastAsia="Arial" w:cs="Arial"/>
+                      <w:rFonts w:ascii="Cambria Math" w:eastAsia="Arial" w:hAnsi="Cambria Math" w:cs="Arial"/>
                       <w:color w:val="000000" w:themeColor="text1"/>
                     </w:rPr>
                     <m:t>1</m:t>
@@ -1225,7 +1209,7 @@
                 <m:sup>
                   <m:r>
                     <w:rPr>
-                      <w:rFonts w:ascii="Cambria Math" w:hAnsi="Cambria Math" w:eastAsia="Arial" w:cs="Arial"/>
+                      <w:rFonts w:ascii="Cambria Math" w:eastAsia="Arial" w:hAnsi="Cambria Math" w:cs="Arial"/>
                       <w:color w:val="000000" w:themeColor="text1"/>
                     </w:rPr>
                     <m:t>i</m:t>
@@ -1236,7 +1220,7 @@
                     <m:fPr>
                       <m:ctrlPr>
                         <w:rPr>
-                          <w:rFonts w:ascii="Cambria Math" w:hAnsi="Cambria Math" w:eastAsia="Arial" w:cs="Arial"/>
+                          <w:rFonts w:ascii="Cambria Math" w:eastAsia="Arial" w:hAnsi="Cambria Math" w:cs="Arial"/>
                           <w:i/>
                           <w:color w:val="000000" w:themeColor="text1"/>
                         </w:rPr>
@@ -1245,7 +1229,7 @@
                     <m:num>
                       <m:r>
                         <w:rPr>
-                          <w:rFonts w:ascii="Cambria Math" w:hAnsi="Cambria Math" w:eastAsia="Arial" w:cs="Arial"/>
+                          <w:rFonts w:ascii="Cambria Math" w:eastAsia="Arial" w:hAnsi="Cambria Math" w:cs="Arial"/>
                           <w:color w:val="000000" w:themeColor="text1"/>
                         </w:rPr>
                         <m:t>(</m:t>
@@ -1254,7 +1238,7 @@
                         <m:sSupPr>
                           <m:ctrlPr>
                             <w:rPr>
-                              <w:rFonts w:ascii="Cambria Math" w:hAnsi="Cambria Math" w:eastAsia="Arial" w:cs="Arial"/>
+                              <w:rFonts w:ascii="Cambria Math" w:eastAsia="Arial" w:hAnsi="Cambria Math" w:cs="Arial"/>
                               <w:i/>
                               <w:color w:val="000000" w:themeColor="text1"/>
                             </w:rPr>
@@ -1265,7 +1249,7 @@
                             <m:sSubPr>
                               <m:ctrlPr>
                                 <w:rPr>
-                                  <w:rFonts w:ascii="Cambria Math" w:hAnsi="Cambria Math" w:eastAsia="Arial" w:cs="Arial"/>
+                                  <w:rFonts w:ascii="Cambria Math" w:eastAsia="Arial" w:hAnsi="Cambria Math" w:cs="Arial"/>
                                   <w:i/>
                                   <w:color w:val="000000" w:themeColor="text1"/>
                                 </w:rPr>
@@ -1274,7 +1258,7 @@
                             <m:e>
                               <m:r>
                                 <w:rPr>
-                                  <w:rFonts w:ascii="Cambria Math" w:hAnsi="Cambria Math" w:eastAsia="Arial" w:cs="Arial"/>
+                                  <w:rFonts w:ascii="Cambria Math" w:eastAsia="Arial" w:hAnsi="Cambria Math" w:cs="Arial"/>
                                   <w:color w:val="000000" w:themeColor="text1"/>
                                 </w:rPr>
                                 <m:t>predicted</m:t>
@@ -1283,7 +1267,7 @@
                             <m:sub>
                               <m:r>
                                 <w:rPr>
-                                  <w:rFonts w:ascii="Cambria Math" w:hAnsi="Cambria Math" w:eastAsia="Arial" w:cs="Arial"/>
+                                  <w:rFonts w:ascii="Cambria Math" w:eastAsia="Arial" w:hAnsi="Cambria Math" w:cs="Arial"/>
                                   <w:color w:val="000000" w:themeColor="text1"/>
                                 </w:rPr>
                                 <m:t>i</m:t>
@@ -1292,7 +1276,7 @@
                           </m:sSub>
                           <m:r>
                             <w:rPr>
-                              <w:rFonts w:ascii="Cambria Math" w:hAnsi="Cambria Math" w:eastAsia="Arial" w:cs="Arial"/>
+                              <w:rFonts w:ascii="Cambria Math" w:eastAsia="Arial" w:hAnsi="Cambria Math" w:cs="Arial"/>
                               <w:color w:val="000000" w:themeColor="text1"/>
                             </w:rPr>
                             <m:t>-</m:t>
@@ -1301,7 +1285,7 @@
                             <m:sSubPr>
                               <m:ctrlPr>
                                 <w:rPr>
-                                  <w:rFonts w:ascii="Cambria Math" w:hAnsi="Cambria Math" w:eastAsia="Arial" w:cs="Arial"/>
+                                  <w:rFonts w:ascii="Cambria Math" w:eastAsia="Arial" w:hAnsi="Cambria Math" w:cs="Arial"/>
                                   <w:i/>
                                   <w:color w:val="000000" w:themeColor="text1"/>
                                 </w:rPr>
@@ -1310,7 +1294,7 @@
                             <m:e>
                               <m:r>
                                 <w:rPr>
-                                  <w:rFonts w:ascii="Cambria Math" w:hAnsi="Cambria Math" w:eastAsia="Arial" w:cs="Arial"/>
+                                  <w:rFonts w:ascii="Cambria Math" w:eastAsia="Arial" w:hAnsi="Cambria Math" w:cs="Arial"/>
                                   <w:color w:val="000000" w:themeColor="text1"/>
                                 </w:rPr>
                                 <m:t>observed</m:t>
@@ -1319,7 +1303,7 @@
                             <m:sub>
                               <m:r>
                                 <w:rPr>
-                                  <w:rFonts w:ascii="Cambria Math" w:hAnsi="Cambria Math" w:eastAsia="Arial" w:cs="Arial"/>
+                                  <w:rFonts w:ascii="Cambria Math" w:eastAsia="Arial" w:hAnsi="Cambria Math" w:cs="Arial"/>
                                   <w:color w:val="000000" w:themeColor="text1"/>
                                 </w:rPr>
                                 <m:t>i</m:t>
@@ -1328,7 +1312,7 @@
                           </m:sSub>
                           <m:r>
                             <w:rPr>
-                              <w:rFonts w:ascii="Cambria Math" w:hAnsi="Cambria Math" w:eastAsia="Arial" w:cs="Arial"/>
+                              <w:rFonts w:ascii="Cambria Math" w:eastAsia="Arial" w:hAnsi="Cambria Math" w:cs="Arial"/>
                               <w:color w:val="000000" w:themeColor="text1"/>
                             </w:rPr>
                             <m:t>)</m:t>
@@ -1337,7 +1321,7 @@
                         <m:sup>
                           <m:r>
                             <w:rPr>
-                              <w:rFonts w:ascii="Cambria Math" w:hAnsi="Cambria Math" w:eastAsia="Arial" w:cs="Arial"/>
+                              <w:rFonts w:ascii="Cambria Math" w:eastAsia="Arial" w:hAnsi="Cambria Math" w:cs="Arial"/>
                               <w:color w:val="000000" w:themeColor="text1"/>
                             </w:rPr>
                             <m:t>2</m:t>
@@ -1350,7 +1334,7 @@
                         <m:sSupPr>
                           <m:ctrlPr>
                             <w:rPr>
-                              <w:rFonts w:ascii="Cambria Math" w:hAnsi="Cambria Math" w:eastAsia="Arial" w:cs="Arial"/>
+                              <w:rFonts w:ascii="Cambria Math" w:eastAsia="Arial" w:hAnsi="Cambria Math" w:cs="Arial"/>
                               <w:i/>
                               <w:color w:val="000000" w:themeColor="text1"/>
                             </w:rPr>
@@ -1359,7 +1343,7 @@
                         <m:e>
                           <m:r>
                             <w:rPr>
-                              <w:rFonts w:ascii="Cambria Math" w:hAnsi="Cambria Math" w:eastAsia="Arial" w:cs="Arial"/>
+                              <w:rFonts w:ascii="Cambria Math" w:eastAsia="Arial" w:hAnsi="Cambria Math" w:cs="Arial"/>
                               <w:color w:val="000000" w:themeColor="text1"/>
                             </w:rPr>
                             <m:t>((</m:t>
@@ -1368,7 +1352,7 @@
                             <m:sSubPr>
                               <m:ctrlPr>
                                 <w:rPr>
-                                  <w:rFonts w:ascii="Cambria Math" w:hAnsi="Cambria Math" w:eastAsia="Arial" w:cs="Arial"/>
+                                  <w:rFonts w:ascii="Cambria Math" w:eastAsia="Arial" w:hAnsi="Cambria Math" w:cs="Arial"/>
                                   <w:i/>
                                   <w:color w:val="000000" w:themeColor="text1"/>
                                 </w:rPr>
@@ -1377,7 +1361,7 @@
                             <m:e>
                               <m:r>
                                 <w:rPr>
-                                  <w:rFonts w:ascii="Cambria Math" w:hAnsi="Cambria Math" w:eastAsia="Arial" w:cs="Arial"/>
+                                  <w:rFonts w:ascii="Cambria Math" w:eastAsia="Arial" w:hAnsi="Cambria Math" w:cs="Arial"/>
                                   <w:color w:val="000000" w:themeColor="text1"/>
                                 </w:rPr>
                                 <m:t>predicted</m:t>
@@ -1386,7 +1370,7 @@
                             <m:sub>
                               <m:r>
                                 <w:rPr>
-                                  <w:rFonts w:ascii="Cambria Math" w:hAnsi="Cambria Math" w:eastAsia="Arial" w:cs="Arial"/>
+                                  <w:rFonts w:ascii="Cambria Math" w:eastAsia="Arial" w:hAnsi="Cambria Math" w:cs="Arial"/>
                                   <w:color w:val="000000" w:themeColor="text1"/>
                                 </w:rPr>
                                 <m:t>i</m:t>
@@ -1395,7 +1379,7 @@
                           </m:sSub>
                           <m:r>
                             <w:rPr>
-                              <w:rFonts w:ascii="Cambria Math" w:hAnsi="Cambria Math" w:eastAsia="Arial" w:cs="Arial"/>
+                              <w:rFonts w:ascii="Cambria Math" w:eastAsia="Arial" w:hAnsi="Cambria Math" w:cs="Arial"/>
                               <w:color w:val="000000" w:themeColor="text1"/>
                             </w:rPr>
                             <m:t>+</m:t>
@@ -1404,7 +1388,7 @@
                             <m:sSubPr>
                               <m:ctrlPr>
                                 <w:rPr>
-                                  <w:rFonts w:ascii="Cambria Math" w:hAnsi="Cambria Math" w:eastAsia="Arial" w:cs="Arial"/>
+                                  <w:rFonts w:ascii="Cambria Math" w:eastAsia="Arial" w:hAnsi="Cambria Math" w:cs="Arial"/>
                                   <w:i/>
                                   <w:color w:val="000000" w:themeColor="text1"/>
                                 </w:rPr>
@@ -1413,7 +1397,7 @@
                             <m:e>
                               <m:r>
                                 <w:rPr>
-                                  <w:rFonts w:ascii="Cambria Math" w:hAnsi="Cambria Math" w:eastAsia="Arial" w:cs="Arial"/>
+                                  <w:rFonts w:ascii="Cambria Math" w:eastAsia="Arial" w:hAnsi="Cambria Math" w:cs="Arial"/>
                                   <w:color w:val="000000" w:themeColor="text1"/>
                                 </w:rPr>
                                 <m:t>observed</m:t>
@@ -1422,7 +1406,7 @@
                             <m:sub>
                               <m:r>
                                 <w:rPr>
-                                  <w:rFonts w:ascii="Cambria Math" w:hAnsi="Cambria Math" w:eastAsia="Arial" w:cs="Arial"/>
+                                  <w:rFonts w:ascii="Cambria Math" w:eastAsia="Arial" w:hAnsi="Cambria Math" w:cs="Arial"/>
                                   <w:color w:val="000000" w:themeColor="text1"/>
                                 </w:rPr>
                                 <m:t>i</m:t>
@@ -1431,7 +1415,7 @@
                           </m:sSub>
                           <m:r>
                             <w:rPr>
-                              <w:rFonts w:ascii="Cambria Math" w:hAnsi="Cambria Math" w:eastAsia="Arial" w:cs="Arial"/>
+                              <w:rFonts w:ascii="Cambria Math" w:eastAsia="Arial" w:hAnsi="Cambria Math" w:cs="Arial"/>
                               <w:color w:val="000000" w:themeColor="text1"/>
                             </w:rPr>
                             <m:t>)/2)</m:t>
@@ -1440,7 +1424,7 @@
                         <m:sup>
                           <m:r>
                             <w:rPr>
-                              <w:rFonts w:ascii="Cambria Math" w:hAnsi="Cambria Math" w:eastAsia="Arial" w:cs="Arial"/>
+                              <w:rFonts w:ascii="Cambria Math" w:eastAsia="Arial" w:hAnsi="Cambria Math" w:cs="Arial"/>
                               <w:color w:val="000000" w:themeColor="text1"/>
                             </w:rPr>
                             <m:t>2</m:t>
@@ -1455,7 +1439,7 @@
           </m:rad>
           <m:r>
             <w:rPr>
-              <w:rFonts w:ascii="Cambria Math" w:hAnsi="Cambria Math" w:eastAsia="Arial" w:cs="Arial"/>
+              <w:rFonts w:ascii="Cambria Math" w:eastAsia="Arial" w:hAnsi="Cambria Math" w:cs="Arial"/>
               <w:color w:val="000000" w:themeColor="text1"/>
             </w:rPr>
             <m:t>*100</m:t>
@@ -1466,15 +1450,15 @@
     <w:p>
       <w:pPr>
         <w:rPr>
-          <w:rFonts w:ascii="Arial" w:hAnsi="Arial" w:eastAsia="Arial" w:cs="Arial"/>
-          <w:color w:val="000000" w:themeColor="text1"/>
-        </w:rPr>
-      </w:pPr>
-    </w:p>
-    <w:p>
-      <w:pPr>
-        <w:rPr>
-          <w:rFonts w:ascii="Arial" w:hAnsi="Arial" w:eastAsia="Arial" w:cs="Arial"/>
+          <w:rFonts w:ascii="Arial" w:eastAsia="Arial" w:hAnsi="Arial" w:cs="Arial"/>
+          <w:color w:val="000000" w:themeColor="text1"/>
+        </w:rPr>
+      </w:pPr>
+    </w:p>
+    <w:p>
+      <w:pPr>
+        <w:rPr>
+          <w:rFonts w:ascii="Arial" w:eastAsia="Arial" w:hAnsi="Arial" w:cs="Arial"/>
           <w:b/>
           <w:bCs/>
           <w:color w:val="000000" w:themeColor="text1"/>
@@ -1484,7 +1468,7 @@
     <w:p>
       <w:pPr>
         <w:rPr>
-          <w:rFonts w:ascii="Arial" w:hAnsi="Arial" w:eastAsia="Arial" w:cs="Arial"/>
+          <w:rFonts w:ascii="Arial" w:eastAsia="Arial" w:hAnsi="Arial" w:cs="Arial"/>
           <w:b/>
           <w:bCs/>
           <w:color w:val="000000" w:themeColor="text1"/>
@@ -1496,7 +1480,7 @@
     <w:p>
       <w:pPr>
         <w:rPr>
-          <w:rFonts w:ascii="Arial" w:hAnsi="Arial" w:eastAsia="Arial" w:cs="Arial"/>
+          <w:rFonts w:ascii="Arial" w:eastAsia="Arial" w:hAnsi="Arial" w:cs="Arial"/>
           <w:b/>
           <w:bCs/>
           <w:color w:val="000000" w:themeColor="text1"/>
@@ -1506,7 +1490,7 @@
       </w:pPr>
       <w:r>
         <w:rPr>
-          <w:rFonts w:ascii="Arial" w:hAnsi="Arial" w:eastAsia="Arial" w:cs="Arial"/>
+          <w:rFonts w:ascii="Arial" w:eastAsia="Arial" w:hAnsi="Arial" w:cs="Arial"/>
           <w:b/>
           <w:bCs/>
           <w:color w:val="000000" w:themeColor="text1"/>
@@ -1519,225 +1503,214 @@
     <w:p>
       <w:pPr>
         <w:rPr>
-          <w:rFonts w:ascii="Arial" w:hAnsi="Arial" w:eastAsia="Arial" w:cs="Arial"/>
-          <w:color w:val="000000" w:themeColor="text1"/>
-        </w:rPr>
-      </w:pPr>
-      <w:r>
-        <w:rPr>
-          <w:rFonts w:ascii="Arial" w:hAnsi="Arial" w:eastAsia="Arial" w:cs="Arial"/>
-          <w:color w:val="000000" w:themeColor="text1" w:themeTint="FF" w:themeShade="FF"/>
+          <w:rFonts w:ascii="Arial" w:eastAsia="Arial" w:hAnsi="Arial" w:cs="Arial"/>
+          <w:color w:val="000000" w:themeColor="text1"/>
+        </w:rPr>
+      </w:pPr>
+      <w:r>
+        <w:rPr>
+          <w:rFonts w:ascii="Arial" w:eastAsia="Arial" w:hAnsi="Arial" w:cs="Arial"/>
+          <w:color w:val="000000" w:themeColor="text1"/>
         </w:rPr>
         <w:t xml:space="preserve">In total, </w:t>
       </w:r>
       <w:r>
         <w:rPr>
-          <w:rFonts w:ascii="Arial" w:hAnsi="Arial" w:eastAsia="Arial" w:cs="Arial"/>
-          <w:color w:val="000000" w:themeColor="text1" w:themeTint="FF" w:themeShade="FF"/>
+          <w:rFonts w:ascii="Arial" w:eastAsia="Arial" w:hAnsi="Arial" w:cs="Arial"/>
+          <w:color w:val="000000" w:themeColor="text1"/>
         </w:rPr>
         <w:t>seven (</w:t>
       </w:r>
       <w:r>
         <w:rPr>
-          <w:rFonts w:ascii="Arial" w:hAnsi="Arial" w:eastAsia="Arial" w:cs="Arial"/>
-          <w:color w:val="000000" w:themeColor="text1" w:themeTint="FF" w:themeShade="FF"/>
+          <w:rFonts w:ascii="Arial" w:eastAsia="Arial" w:hAnsi="Arial" w:cs="Arial"/>
+          <w:color w:val="000000" w:themeColor="text1"/>
         </w:rPr>
         <w:t xml:space="preserve">1-7) </w:t>
       </w:r>
       <w:r>
         <w:rPr>
-          <w:rFonts w:ascii="Arial" w:hAnsi="Arial" w:eastAsia="Arial" w:cs="Arial"/>
-          <w:color w:val="000000" w:themeColor="text1" w:themeTint="FF" w:themeShade="FF"/>
+          <w:rFonts w:ascii="Arial" w:eastAsia="Arial" w:hAnsi="Arial" w:cs="Arial"/>
+          <w:color w:val="000000" w:themeColor="text1"/>
         </w:rPr>
         <w:t xml:space="preserve">published </w:t>
       </w:r>
       <w:r>
         <w:rPr>
-          <w:rFonts w:ascii="Arial" w:hAnsi="Arial" w:eastAsia="Arial" w:cs="Arial"/>
-          <w:color w:val="000000" w:themeColor="text1" w:themeTint="FF" w:themeShade="FF"/>
+          <w:rFonts w:ascii="Arial" w:eastAsia="Arial" w:hAnsi="Arial" w:cs="Arial"/>
+          <w:color w:val="000000" w:themeColor="text1"/>
         </w:rPr>
         <w:t xml:space="preserve">and one unpublished </w:t>
       </w:r>
       <w:r>
         <w:rPr>
-          <w:rFonts w:ascii="Arial" w:hAnsi="Arial" w:eastAsia="Arial" w:cs="Arial"/>
-          <w:color w:val="000000" w:themeColor="text1" w:themeTint="FF" w:themeShade="FF"/>
+          <w:rFonts w:ascii="Arial" w:eastAsia="Arial" w:hAnsi="Arial" w:cs="Arial"/>
+          <w:color w:val="000000" w:themeColor="text1"/>
         </w:rPr>
         <w:t>model</w:t>
       </w:r>
       <w:r>
         <w:rPr>
-          <w:rFonts w:ascii="Arial" w:hAnsi="Arial" w:eastAsia="Arial" w:cs="Arial"/>
-          <w:color w:val="000000" w:themeColor="text1" w:themeTint="FF" w:themeShade="FF"/>
+          <w:rFonts w:ascii="Arial" w:eastAsia="Arial" w:hAnsi="Arial" w:cs="Arial"/>
+          <w:color w:val="000000" w:themeColor="text1"/>
         </w:rPr>
         <w:t xml:space="preserve"> were included. </w:t>
       </w:r>
       <w:r>
         <w:rPr>
-          <w:rFonts w:ascii="Arial" w:hAnsi="Arial" w:eastAsia="Arial" w:cs="Arial"/>
-          <w:color w:val="000000" w:themeColor="text1" w:themeTint="FF" w:themeShade="FF"/>
+          <w:rFonts w:ascii="Arial" w:eastAsia="Arial" w:hAnsi="Arial" w:cs="Arial"/>
+          <w:color w:val="000000" w:themeColor="text1"/>
         </w:rPr>
         <w:t xml:space="preserve">Both model averaging and best-model selection </w:t>
       </w:r>
       <w:r>
         <w:rPr>
-          <w:rFonts w:ascii="Arial" w:hAnsi="Arial" w:eastAsia="Arial" w:cs="Arial"/>
-          <w:color w:val="000000" w:themeColor="text1" w:themeTint="FF" w:themeShade="FF"/>
+          <w:rFonts w:ascii="Arial" w:eastAsia="Arial" w:hAnsi="Arial" w:cs="Arial"/>
+          <w:color w:val="000000" w:themeColor="text1"/>
         </w:rPr>
         <w:t>were</w:t>
       </w:r>
       <w:r>
         <w:rPr>
-          <w:rFonts w:ascii="Arial" w:hAnsi="Arial" w:eastAsia="Arial" w:cs="Arial"/>
-          <w:color w:val="000000" w:themeColor="text1" w:themeTint="FF" w:themeShade="FF"/>
+          <w:rFonts w:ascii="Arial" w:eastAsia="Arial" w:hAnsi="Arial" w:cs="Arial"/>
+          <w:color w:val="000000" w:themeColor="text1"/>
         </w:rPr>
         <w:t xml:space="preserve"> implemented within the Shiny app. For the selected best-fitting model, Sampling-Importance Resampling </w:t>
       </w:r>
       <w:r>
         <w:rPr>
-          <w:rFonts w:ascii="Arial" w:hAnsi="Arial" w:eastAsia="Arial" w:cs="Arial"/>
-          <w:color w:val="000000" w:themeColor="text1" w:themeTint="FF" w:themeShade="FF"/>
+          <w:rFonts w:ascii="Arial" w:eastAsia="Arial" w:hAnsi="Arial" w:cs="Arial"/>
+          <w:color w:val="000000" w:themeColor="text1"/>
         </w:rPr>
         <w:t>was</w:t>
       </w:r>
       <w:r>
         <w:rPr>
-          <w:rFonts w:ascii="Arial" w:hAnsi="Arial" w:eastAsia="Arial" w:cs="Arial"/>
-          <w:color w:val="000000" w:themeColor="text1" w:themeTint="FF" w:themeShade="FF"/>
+          <w:rFonts w:ascii="Arial" w:eastAsia="Arial" w:hAnsi="Arial" w:cs="Arial"/>
+          <w:color w:val="000000" w:themeColor="text1"/>
         </w:rPr>
         <w:t xml:space="preserve"> performed to estimate parameter uncertainty and generate credible intervals for each predicted concentration–time point</w:t>
       </w:r>
       <w:r>
         <w:rPr>
-          <w:rFonts w:ascii="Arial" w:hAnsi="Arial" w:eastAsia="Arial" w:cs="Arial"/>
-          <w:color w:val="000000" w:themeColor="text1" w:themeTint="FF" w:themeShade="FF"/>
+          <w:rFonts w:ascii="Arial" w:eastAsia="Arial" w:hAnsi="Arial" w:cs="Arial"/>
+          <w:color w:val="000000" w:themeColor="text1"/>
         </w:rPr>
         <w:t xml:space="preserve"> (</w:t>
       </w:r>
       <w:r>
         <w:rPr>
-          <w:rFonts w:ascii="Arial" w:hAnsi="Arial" w:eastAsia="Arial" w:cs="Arial"/>
-          <w:b w:val="1"/>
-          <w:bCs w:val="1"/>
-          <w:color w:val="000000" w:themeColor="text1" w:themeTint="FF" w:themeShade="FF"/>
+          <w:rFonts w:ascii="Arial" w:eastAsia="Arial" w:hAnsi="Arial" w:cs="Arial"/>
+          <w:b/>
+          <w:bCs/>
+          <w:color w:val="000000" w:themeColor="text1"/>
         </w:rPr>
         <w:t>F</w:t>
       </w:r>
       <w:r>
         <w:rPr>
-          <w:rFonts w:ascii="Arial" w:hAnsi="Arial" w:eastAsia="Arial" w:cs="Arial"/>
-          <w:b w:val="1"/>
-          <w:bCs w:val="1"/>
-          <w:color w:val="000000" w:themeColor="text1" w:themeTint="FF" w:themeShade="FF"/>
+          <w:rFonts w:ascii="Arial" w:eastAsia="Arial" w:hAnsi="Arial" w:cs="Arial"/>
+          <w:b/>
+          <w:bCs/>
+          <w:color w:val="000000" w:themeColor="text1"/>
         </w:rPr>
         <w:t>igure 1</w:t>
       </w:r>
       <w:r>
         <w:rPr>
-          <w:rFonts w:ascii="Arial" w:hAnsi="Arial" w:eastAsia="Arial" w:cs="Arial"/>
-          <w:color w:val="000000" w:themeColor="text1" w:themeTint="FF" w:themeShade="FF"/>
+          <w:rFonts w:ascii="Arial" w:eastAsia="Arial" w:hAnsi="Arial" w:cs="Arial"/>
+          <w:color w:val="000000" w:themeColor="text1"/>
         </w:rPr>
         <w:t>)</w:t>
       </w:r>
       <w:r>
         <w:rPr>
-          <w:rFonts w:ascii="Arial" w:hAnsi="Arial" w:eastAsia="Arial" w:cs="Arial"/>
-          <w:color w:val="000000" w:themeColor="text1" w:themeTint="FF" w:themeShade="FF"/>
+          <w:rFonts w:ascii="Arial" w:eastAsia="Arial" w:hAnsi="Arial" w:cs="Arial"/>
+          <w:color w:val="000000" w:themeColor="text1"/>
         </w:rPr>
         <w:t>.</w:t>
       </w:r>
     </w:p>
     <w:p>
       <w:pPr>
-        <w:pStyle w:val="Normale"/>
-        <w:rPr>
-          <w:rFonts w:ascii="Arial" w:hAnsi="Arial" w:eastAsia="Arial" w:cs="Arial"/>
-          <w:color w:val="000000" w:themeColor="text1"/>
-        </w:rPr>
-      </w:pPr>
-      <w:r>
-        <w:rPr>
-          <w:rFonts w:ascii="Arial" w:hAnsi="Arial" w:eastAsia="Arial" w:cs="Arial"/>
-          <w:color w:val="000000" w:themeColor="text1" w:themeTint="FF" w:themeShade="FF"/>
+        <w:rPr>
+          <w:rFonts w:ascii="Arial" w:eastAsia="Arial" w:hAnsi="Arial" w:cs="Arial"/>
+          <w:color w:val="000000" w:themeColor="text1"/>
+        </w:rPr>
+      </w:pPr>
+      <w:r>
+        <w:rPr>
+          <w:rFonts w:ascii="Arial" w:eastAsia="Arial" w:hAnsi="Arial" w:cs="Arial"/>
+          <w:color w:val="000000" w:themeColor="text1"/>
         </w:rPr>
         <w:t>The app enables customisation of PK/PD targets, free fraction, and MIC values (</w:t>
       </w:r>
       <w:r>
         <w:rPr>
-          <w:rFonts w:ascii="Arial" w:hAnsi="Arial" w:eastAsia="Arial" w:cs="Arial"/>
-          <w:b w:val="1"/>
-          <w:bCs w:val="1"/>
-          <w:color w:val="000000" w:themeColor="text1" w:themeTint="FF" w:themeShade="FF"/>
+          <w:rFonts w:ascii="Arial" w:eastAsia="Arial" w:hAnsi="Arial" w:cs="Arial"/>
+          <w:b/>
+          <w:bCs/>
+          <w:color w:val="000000" w:themeColor="text1"/>
         </w:rPr>
         <w:t>F</w:t>
       </w:r>
       <w:r>
         <w:rPr>
-          <w:rFonts w:ascii="Arial" w:hAnsi="Arial" w:eastAsia="Arial" w:cs="Arial"/>
-          <w:b w:val="1"/>
-          <w:bCs w:val="1"/>
-          <w:color w:val="000000" w:themeColor="text1" w:themeTint="FF" w:themeShade="FF"/>
+          <w:rFonts w:ascii="Arial" w:eastAsia="Arial" w:hAnsi="Arial" w:cs="Arial"/>
+          <w:b/>
+          <w:bCs/>
+          <w:color w:val="000000" w:themeColor="text1"/>
         </w:rPr>
         <w:t xml:space="preserve">igure </w:t>
       </w:r>
       <w:r>
         <w:rPr>
-          <w:rFonts w:ascii="Arial" w:hAnsi="Arial" w:eastAsia="Arial" w:cs="Arial"/>
-          <w:b w:val="1"/>
-          <w:bCs w:val="1"/>
-          <w:color w:val="000000" w:themeColor="text1" w:themeTint="FF" w:themeShade="FF"/>
+          <w:rFonts w:ascii="Arial" w:eastAsia="Arial" w:hAnsi="Arial" w:cs="Arial"/>
+          <w:b/>
+          <w:bCs/>
+          <w:color w:val="000000" w:themeColor="text1"/>
         </w:rPr>
         <w:t>2-3</w:t>
       </w:r>
       <w:r>
         <w:rPr>
-          <w:rFonts w:ascii="Arial" w:hAnsi="Arial" w:eastAsia="Arial" w:cs="Arial"/>
-          <w:color w:val="000000" w:themeColor="text1" w:themeTint="FF" w:themeShade="FF"/>
+          <w:rFonts w:ascii="Arial" w:eastAsia="Arial" w:hAnsi="Arial" w:cs="Arial"/>
+          <w:color w:val="000000" w:themeColor="text1"/>
         </w:rPr>
         <w:t>).</w:t>
       </w:r>
       <w:r>
         <w:rPr>
-          <w:rFonts w:ascii="Arial" w:hAnsi="Arial" w:eastAsia="Arial" w:cs="Arial"/>
-          <w:noProof w:val="0"/>
-          <w:sz w:val="24"/>
-          <w:szCs w:val="24"/>
-          <w:lang w:val="en-GB"/>
+          <w:rFonts w:ascii="Arial" w:eastAsia="Arial" w:hAnsi="Arial" w:cs="Arial"/>
         </w:rPr>
         <w:t xml:space="preserve"> Dosing individualisation is performed through maximum a posteriori estimation and model-averaged a </w:t>
       </w:r>
-      <w:r>
-        <w:rPr>
-          <w:rFonts w:ascii="Arial" w:hAnsi="Arial" w:eastAsia="Arial" w:cs="Arial"/>
-          <w:noProof w:val="0"/>
-          <w:sz w:val="24"/>
-          <w:szCs w:val="24"/>
-          <w:lang w:val="en-GB"/>
+      <w:proofErr w:type="gramStart"/>
+      <w:r>
+        <w:rPr>
+          <w:rFonts w:ascii="Arial" w:eastAsia="Arial" w:hAnsi="Arial" w:cs="Arial"/>
         </w:rPr>
         <w:t>posteriori predictions</w:t>
       </w:r>
-      <w:r>
-        <w:rPr>
-          <w:rFonts w:ascii="Arial" w:hAnsi="Arial" w:eastAsia="Arial" w:cs="Arial"/>
-          <w:noProof w:val="0"/>
-          <w:sz w:val="24"/>
-          <w:szCs w:val="24"/>
-          <w:lang w:val="en-GB"/>
+      <w:proofErr w:type="gramEnd"/>
+      <w:r>
+        <w:rPr>
+          <w:rFonts w:ascii="Arial" w:eastAsia="Arial" w:hAnsi="Arial" w:cs="Arial"/>
         </w:rPr>
         <w:t xml:space="preserve">. </w:t>
       </w:r>
       <w:r>
         <w:rPr>
-          <w:rFonts w:ascii="Arial" w:hAnsi="Arial" w:eastAsia="Arial" w:cs="Arial"/>
-          <w:color w:val="000000" w:themeColor="text1" w:themeTint="FF" w:themeShade="FF"/>
+          <w:rFonts w:ascii="Arial" w:eastAsia="Arial" w:hAnsi="Arial" w:cs="Arial"/>
+          <w:color w:val="000000" w:themeColor="text1"/>
         </w:rPr>
         <w:t xml:space="preserve">All diagnostic plots, model comparison outputs, and credible interval visualisations are integrated within the app. The tool can be freely accessed at: </w:t>
       </w:r>
-      <w:hyperlink r:id="R48cacf695cef4f26">
+      <w:hyperlink r:id="rId6">
         <w:r>
           <w:rPr>
             <w:rStyle w:val="Collegamentoipertestuale"/>
-            <w:rFonts w:ascii="Arial" w:hAnsi="Arial" w:eastAsia="Arial" w:cs="Arial"/>
+            <w:rFonts w:ascii="Arial" w:eastAsia="Arial" w:hAnsi="Arial" w:cs="Arial"/>
           </w:rPr>
           <w:t>https://1k96vt-matteo-morra.shinyapps.io/Dalbavincin/</w:t>
         </w:r>
@@ -1746,7 +1719,7 @@
     <w:p>
       <w:pPr>
         <w:rPr>
-          <w:rFonts w:ascii="Arial" w:hAnsi="Arial" w:eastAsia="Arial" w:cs="Arial"/>
+          <w:rFonts w:ascii="Arial" w:eastAsia="Arial" w:hAnsi="Arial" w:cs="Arial"/>
           <w:b/>
           <w:bCs/>
           <w:color w:val="000000" w:themeColor="text1"/>
@@ -1756,7 +1729,7 @@
       </w:pPr>
       <w:r>
         <w:rPr>
-          <w:rFonts w:ascii="Arial" w:hAnsi="Arial" w:eastAsia="Arial" w:cs="Arial"/>
+          <w:rFonts w:ascii="Arial" w:eastAsia="Arial" w:hAnsi="Arial" w:cs="Arial"/>
           <w:b/>
           <w:bCs/>
           <w:color w:val="000000" w:themeColor="text1"/>
@@ -1769,27 +1742,27 @@
     <w:p>
       <w:pPr>
         <w:rPr>
-          <w:rFonts w:ascii="Arial" w:hAnsi="Arial" w:eastAsia="Arial" w:cs="Arial"/>
-          <w:color w:val="000000" w:themeColor="text1"/>
-        </w:rPr>
-      </w:pPr>
-      <w:r>
-        <w:rPr>
-          <w:rFonts w:ascii="Arial" w:hAnsi="Arial" w:eastAsia="Arial" w:cs="Arial"/>
+          <w:rFonts w:ascii="Arial" w:eastAsia="Arial" w:hAnsi="Arial" w:cs="Arial"/>
+          <w:color w:val="000000" w:themeColor="text1"/>
+        </w:rPr>
+      </w:pPr>
+      <w:r>
+        <w:rPr>
+          <w:rFonts w:ascii="Arial" w:eastAsia="Arial" w:hAnsi="Arial" w:cs="Arial"/>
           <w:color w:val="000000" w:themeColor="text1"/>
         </w:rPr>
         <w:t xml:space="preserve">A comprehensive model-averaged framework was developed to inform dalbavancin dose optimisation across off-label indications. While prospective clinical validation is required, the Shiny application already offers an accessible and externally informed support tool to guide </w:t>
       </w:r>
       <w:r>
         <w:rPr>
-          <w:rFonts w:ascii="Arial" w:hAnsi="Arial" w:eastAsia="Arial" w:cs="Arial"/>
+          <w:rFonts w:ascii="Arial" w:eastAsia="Arial" w:hAnsi="Arial" w:cs="Arial"/>
           <w:color w:val="000000" w:themeColor="text1"/>
         </w:rPr>
         <w:t xml:space="preserve">personalized </w:t>
       </w:r>
       <w:r>
         <w:rPr>
-          <w:rFonts w:ascii="Arial" w:hAnsi="Arial" w:eastAsia="Arial" w:cs="Arial"/>
+          <w:rFonts w:ascii="Arial" w:eastAsia="Arial" w:hAnsi="Arial" w:cs="Arial"/>
           <w:color w:val="000000" w:themeColor="text1"/>
         </w:rPr>
         <w:t>dalbavancin therapy.</w:t>
@@ -1798,36 +1771,39 @@
     <w:p>
       <w:pPr>
         <w:rPr>
-          <w:rFonts w:ascii="Arial" w:hAnsi="Arial" w:eastAsia="Arial" w:cs="Arial"/>
-          <w:color w:val="000000" w:themeColor="text1"/>
-        </w:rPr>
-      </w:pPr>
-    </w:p>
-    <w:p w14:noSpellErr="1">
-      <w:pPr>
-        <w:rPr>
-          <w:rFonts w:ascii="Arial" w:hAnsi="Arial" w:eastAsia="Arial" w:cs="Arial"/>
-          <w:color w:val="000000" w:themeColor="text1"/>
-        </w:rPr>
-      </w:pPr>
-      <w:r>
+          <w:rFonts w:ascii="Arial" w:eastAsia="Arial" w:hAnsi="Arial" w:cs="Arial"/>
+          <w:color w:val="000000" w:themeColor="text1"/>
+        </w:rPr>
+      </w:pPr>
+    </w:p>
+    <w:p>
+      <w:pPr>
+        <w:rPr>
+          <w:rFonts w:ascii="Arial" w:eastAsia="Arial" w:hAnsi="Arial" w:cs="Arial"/>
+          <w:color w:val="000000" w:themeColor="text1"/>
+        </w:rPr>
+      </w:pPr>
+      <w:r>
+        <w:rPr>
+          <w:noProof/>
+        </w:rPr>
         <w:drawing>
-          <wp:inline wp14:editId="48451D5E" wp14:anchorId="214930A9">
+          <wp:inline distT="0" distB="0" distL="0" distR="0" wp14:anchorId="214930A9" wp14:editId="48451D5E">
             <wp:extent cx="5731510" cy="2701290"/>
             <wp:effectExtent l="0" t="0" r="2540" b="3810"/>
             <wp:docPr id="1648939130" name="Immagine 1" descr="Immagine che contiene testo, schermata, linea, diagramma&#10;&#10;Il contenuto generato dall'IA potrebbe non essere corretto."/>
             <wp:cNvGraphicFramePr>
-              <a:graphicFrameLocks noChangeAspect="1"/>
+              <a:graphicFrameLocks xmlns:a="http://schemas.openxmlformats.org/drawingml/2006/main" noChangeAspect="1"/>
             </wp:cNvGraphicFramePr>
-            <a:graphic>
-              <a:graphicData xmlns:a="http://schemas.openxmlformats.org/drawingml/2006/main" uri="http://schemas.openxmlformats.org/drawingml/2006/picture">
+            <a:graphic xmlns:a="http://schemas.openxmlformats.org/drawingml/2006/main">
+              <a:graphicData uri="http://schemas.openxmlformats.org/drawingml/2006/picture">
                 <pic:pic xmlns:pic="http://schemas.openxmlformats.org/drawingml/2006/picture">
                   <pic:nvPicPr>
                     <pic:cNvPr id="1648939130" name="Immagine 1" descr="Immagine che contiene testo, schermata, linea, diagramma&#10;&#10;Il contenuto generato dall'IA potrebbe non essere corretto."/>
                     <pic:cNvPicPr/>
                   </pic:nvPicPr>
                   <pic:blipFill>
-                    <a:blip xmlns:r="http://schemas.openxmlformats.org/officeDocument/2006/relationships" r:embed="rId10"/>
+                    <a:blip r:embed="rId7"/>
                     <a:stretch>
                       <a:fillRect/>
                     </a:stretch>
@@ -1851,13 +1827,13 @@
     <w:p>
       <w:pPr>
         <w:rPr>
-          <w:rFonts w:ascii="Arial" w:hAnsi="Arial" w:eastAsia="Arial" w:cs="Arial"/>
-          <w:color w:val="000000" w:themeColor="text1"/>
-        </w:rPr>
-      </w:pPr>
-      <w:r>
-        <w:rPr>
-          <w:rFonts w:ascii="Arial" w:hAnsi="Arial" w:eastAsia="Arial" w:cs="Arial"/>
+          <w:rFonts w:ascii="Arial" w:eastAsia="Arial" w:hAnsi="Arial" w:cs="Arial"/>
+          <w:color w:val="000000" w:themeColor="text1"/>
+        </w:rPr>
+      </w:pPr>
+      <w:r>
+        <w:rPr>
+          <w:rFonts w:ascii="Arial" w:eastAsia="Arial" w:hAnsi="Arial" w:cs="Arial"/>
           <w:b/>
           <w:bCs/>
           <w:color w:val="000000" w:themeColor="text1"/>
@@ -1866,29 +1842,37 @@
       </w:r>
       <w:r>
         <w:rPr>
-          <w:rFonts w:ascii="Arial" w:hAnsi="Arial" w:eastAsia="Arial" w:cs="Arial"/>
+          <w:rFonts w:ascii="Arial" w:eastAsia="Arial" w:hAnsi="Arial" w:cs="Arial"/>
           <w:color w:val="000000" w:themeColor="text1"/>
         </w:rPr>
         <w:t>Visualisation of model averaging and single-model predictions</w:t>
       </w:r>
       <w:r>
         <w:rPr>
-          <w:rFonts w:ascii="Arial" w:hAnsi="Arial" w:eastAsia="Arial" w:cs="Arial"/>
-          <w:color w:val="000000" w:themeColor="text1"/>
-        </w:rPr>
-        <w:t>. The upper left panel displays model-averaged concentration–time predictions alongside individual candidate model curves, with observed patient data overlaid. The upper right panel shows the corresponding model weights contributing to the averaged prediction. The lower panel illustrates the prediction from the selected best-fitting model including the 90% prediction interval generated via Sampling–Importance Resampling (SIR) and the patient’s measured concentration used for MAP estimation.</w:t>
-      </w:r>
-    </w:p>
-    <w:p>
-      <w:pPr>
-        <w:rPr>
-          <w:rFonts w:ascii="Arial" w:hAnsi="Arial" w:eastAsia="Arial" w:cs="Arial"/>
-          <w:color w:val="000000" w:themeColor="text1"/>
-        </w:rPr>
-      </w:pPr>
-      <w:r>
-        <w:rPr>
-          <w:rFonts w:ascii="Arial" w:hAnsi="Arial" w:eastAsia="Arial" w:cs="Arial"/>
+          <w:rFonts w:ascii="Arial" w:eastAsia="Arial" w:hAnsi="Arial" w:cs="Arial"/>
+          <w:color w:val="000000" w:themeColor="text1"/>
+        </w:rPr>
+        <w:t xml:space="preserve">. The upper left panel displays model-averaged concentration–time predictions alongside individual candidate model curves, with observed patient data overlaid. The upper right panel shows the corresponding model weights contributing to the averaged prediction. The lower panel illustrates the prediction from the selected best-fitting model including the 90% prediction interval generated via Sampling–Importance </w:t>
+      </w:r>
+      <w:r>
+        <w:rPr>
+          <w:rFonts w:ascii="Arial" w:eastAsia="Arial" w:hAnsi="Arial" w:cs="Arial"/>
+          <w:color w:val="000000" w:themeColor="text1"/>
+        </w:rPr>
+        <w:lastRenderedPageBreak/>
+        <w:t>Resampling (SIR) and the patient’s measured concentration used for MAP estimation.</w:t>
+      </w:r>
+    </w:p>
+    <w:p>
+      <w:pPr>
+        <w:rPr>
+          <w:rFonts w:ascii="Arial" w:eastAsia="Arial" w:hAnsi="Arial" w:cs="Arial"/>
+          <w:color w:val="000000" w:themeColor="text1"/>
+        </w:rPr>
+      </w:pPr>
+      <w:r>
+        <w:rPr>
+          <w:rFonts w:ascii="Arial" w:eastAsia="Arial" w:hAnsi="Arial" w:cs="Arial"/>
           <w:noProof/>
           <w:color w:val="000000" w:themeColor="text1"/>
         </w:rPr>
@@ -1908,7 +1892,7 @@
                     <pic:cNvPicPr/>
                   </pic:nvPicPr>
                   <pic:blipFill>
-                    <a:blip r:embed="rId11"/>
+                    <a:blip r:embed="rId8"/>
                     <a:stretch>
                       <a:fillRect/>
                     </a:stretch>
@@ -1932,13 +1916,13 @@
     <w:p>
       <w:pPr>
         <w:rPr>
-          <w:rFonts w:ascii="Arial" w:hAnsi="Arial" w:eastAsia="Arial" w:cs="Arial"/>
-          <w:color w:val="000000" w:themeColor="text1"/>
-        </w:rPr>
-      </w:pPr>
-      <w:r>
-        <w:rPr>
-          <w:rFonts w:ascii="Arial" w:hAnsi="Arial" w:eastAsia="Arial" w:cs="Arial"/>
+          <w:rFonts w:ascii="Arial" w:eastAsia="Arial" w:hAnsi="Arial" w:cs="Arial"/>
+          <w:color w:val="000000" w:themeColor="text1"/>
+        </w:rPr>
+      </w:pPr>
+      <w:r>
+        <w:rPr>
+          <w:rFonts w:ascii="Arial" w:eastAsia="Arial" w:hAnsi="Arial" w:cs="Arial"/>
           <w:b/>
           <w:bCs/>
           <w:color w:val="000000" w:themeColor="text1"/>
@@ -1947,7 +1931,7 @@
       </w:r>
       <w:r>
         <w:rPr>
-          <w:rFonts w:ascii="Arial" w:hAnsi="Arial" w:eastAsia="Arial" w:cs="Arial"/>
+          <w:rFonts w:ascii="Arial" w:eastAsia="Arial" w:hAnsi="Arial" w:cs="Arial"/>
           <w:b/>
           <w:bCs/>
           <w:color w:val="000000" w:themeColor="text1"/>
@@ -1956,28 +1940,28 @@
       </w:r>
       <w:r>
         <w:rPr>
-          <w:rFonts w:ascii="Arial" w:hAnsi="Arial" w:eastAsia="Arial" w:cs="Arial"/>
+          <w:rFonts w:ascii="Arial" w:eastAsia="Arial" w:hAnsi="Arial" w:cs="Arial"/>
           <w:color w:val="000000" w:themeColor="text1"/>
         </w:rPr>
         <w:t xml:space="preserve">: </w:t>
       </w:r>
       <w:r>
         <w:rPr>
-          <w:rFonts w:ascii="Arial" w:hAnsi="Arial" w:eastAsia="Arial" w:cs="Arial"/>
+          <w:rFonts w:ascii="Arial" w:eastAsia="Arial" w:hAnsi="Arial" w:cs="Arial"/>
           <w:color w:val="000000" w:themeColor="text1"/>
         </w:rPr>
         <w:t xml:space="preserve">Patient data input interface of Shiny application. Demographic information, laboratory values (creatinine, albumin), and </w:t>
       </w:r>
       <w:r>
         <w:rPr>
-          <w:rFonts w:ascii="Arial" w:hAnsi="Arial" w:eastAsia="Arial" w:cs="Arial"/>
+          <w:rFonts w:ascii="Arial" w:eastAsia="Arial" w:hAnsi="Arial" w:cs="Arial"/>
           <w:color w:val="000000" w:themeColor="text1"/>
         </w:rPr>
         <w:t>TDM</w:t>
       </w:r>
       <w:r>
         <w:rPr>
-          <w:rFonts w:ascii="Arial" w:hAnsi="Arial" w:eastAsia="Arial" w:cs="Arial"/>
+          <w:rFonts w:ascii="Arial" w:eastAsia="Arial" w:hAnsi="Arial" w:cs="Arial"/>
           <w:color w:val="000000" w:themeColor="text1"/>
         </w:rPr>
         <w:t xml:space="preserve"> measurements can be entered or updated on the left panel, while the right panel displays the structured patient dataset that will be used for model estimation and dose optimisation.</w:t>
@@ -1986,29 +1970,29 @@
     <w:p>
       <w:pPr>
         <w:rPr>
-          <w:rFonts w:ascii="Arial" w:hAnsi="Arial" w:eastAsia="Arial" w:cs="Arial"/>
-          <w:color w:val="000000" w:themeColor="text1"/>
-        </w:rPr>
-      </w:pPr>
-    </w:p>
-    <w:p>
-      <w:pPr>
-        <w:rPr>
-          <w:rFonts w:ascii="Arial" w:hAnsi="Arial" w:eastAsia="Arial" w:cs="Arial"/>
-          <w:color w:val="000000" w:themeColor="text1"/>
-        </w:rPr>
-      </w:pPr>
-    </w:p>
-    <w:p>
-      <w:pPr>
-        <w:rPr>
-          <w:rFonts w:ascii="Arial" w:hAnsi="Arial" w:eastAsia="Arial" w:cs="Arial"/>
-          <w:color w:val="000000" w:themeColor="text1"/>
-        </w:rPr>
-      </w:pPr>
-      <w:r>
-        <w:rPr>
-          <w:rFonts w:ascii="Arial" w:hAnsi="Arial" w:eastAsia="Arial" w:cs="Arial"/>
+          <w:rFonts w:ascii="Arial" w:eastAsia="Arial" w:hAnsi="Arial" w:cs="Arial"/>
+          <w:color w:val="000000" w:themeColor="text1"/>
+        </w:rPr>
+      </w:pPr>
+    </w:p>
+    <w:p>
+      <w:pPr>
+        <w:rPr>
+          <w:rFonts w:ascii="Arial" w:eastAsia="Arial" w:hAnsi="Arial" w:cs="Arial"/>
+          <w:color w:val="000000" w:themeColor="text1"/>
+        </w:rPr>
+      </w:pPr>
+    </w:p>
+    <w:p>
+      <w:pPr>
+        <w:rPr>
+          <w:rFonts w:ascii="Arial" w:eastAsia="Arial" w:hAnsi="Arial" w:cs="Arial"/>
+          <w:color w:val="000000" w:themeColor="text1"/>
+        </w:rPr>
+      </w:pPr>
+      <w:r>
+        <w:rPr>
+          <w:rFonts w:ascii="Arial" w:eastAsia="Arial" w:hAnsi="Arial" w:cs="Arial"/>
           <w:noProof/>
           <w:color w:val="000000" w:themeColor="text1"/>
         </w:rPr>
@@ -2028,7 +2012,7 @@
                     <pic:cNvPicPr/>
                   </pic:nvPicPr>
                   <pic:blipFill>
-                    <a:blip r:embed="rId12"/>
+                    <a:blip r:embed="rId9"/>
                     <a:stretch>
                       <a:fillRect/>
                     </a:stretch>
@@ -2049,136 +2033,124 @@
         </w:drawing>
       </w:r>
     </w:p>
-    <w:p w14:noSpellErr="1">
-      <w:pPr>
-        <w:rPr>
-          <w:rFonts w:ascii="Arial" w:hAnsi="Arial" w:eastAsia="Arial" w:cs="Arial"/>
-          <w:color w:val="000000" w:themeColor="text1"/>
-        </w:rPr>
-      </w:pPr>
-      <w:r>
-        <w:rPr>
-          <w:rFonts w:ascii="Arial" w:hAnsi="Arial" w:eastAsia="Arial" w:cs="Arial"/>
-          <w:b w:val="1"/>
-          <w:bCs w:val="1"/>
-          <w:color w:val="000000" w:themeColor="text1" w:themeTint="FF" w:themeShade="FF"/>
-        </w:rPr>
-        <w:t xml:space="preserve">Figure </w:t>
-      </w:r>
-      <w:r>
-        <w:rPr>
-          <w:rFonts w:ascii="Arial" w:hAnsi="Arial" w:eastAsia="Arial" w:cs="Arial"/>
-          <w:b w:val="1"/>
-          <w:bCs w:val="1"/>
-          <w:color w:val="000000" w:themeColor="text1" w:themeTint="FF" w:themeShade="FF"/>
-        </w:rPr>
-        <w:t>3</w:t>
-      </w:r>
-      <w:r>
-        <w:rPr>
-          <w:rFonts w:ascii="Arial" w:hAnsi="Arial" w:eastAsia="Arial" w:cs="Arial"/>
-          <w:b w:val="1"/>
-          <w:bCs w:val="1"/>
-          <w:color w:val="000000" w:themeColor="text1" w:themeTint="FF" w:themeShade="FF"/>
-        </w:rPr>
-        <w:t xml:space="preserve">: </w:t>
-      </w:r>
-      <w:r>
-        <w:rPr>
-          <w:rFonts w:ascii="Arial" w:hAnsi="Arial" w:eastAsia="Arial" w:cs="Arial"/>
-          <w:color w:val="000000" w:themeColor="text1" w:themeTint="FF" w:themeShade="FF"/>
-        </w:rPr>
-        <w:t>Pharmacodynamic target selection panel</w:t>
-      </w:r>
-      <w:r>
-        <w:rPr>
-          <w:rFonts w:ascii="Arial" w:hAnsi="Arial" w:eastAsia="Arial" w:cs="Arial"/>
-          <w:color w:val="000000" w:themeColor="text1" w:themeTint="FF" w:themeShade="FF"/>
-        </w:rPr>
-        <w:t xml:space="preserve">. Users can specify the desired PK/PD target (e.g., </w:t>
-      </w:r>
-      <w:r>
-        <w:rPr>
-          <w:rFonts w:ascii="Arial" w:hAnsi="Arial" w:eastAsia="Arial" w:cs="Arial"/>
-          <w:color w:val="000000" w:themeColor="text1" w:themeTint="FF" w:themeShade="FF"/>
-        </w:rPr>
-        <w:t xml:space="preserve">last-24h </w:t>
-      </w:r>
-      <w:r>
-        <w:rPr>
-          <w:rFonts w:ascii="Arial" w:hAnsi="Arial" w:eastAsia="Arial" w:cs="Arial"/>
-          <w:color w:val="000000" w:themeColor="text1" w:themeTint="FF" w:themeShade="FF"/>
-        </w:rPr>
-        <w:t>fAUC</w:t>
-      </w:r>
-      <w:r>
-        <w:rPr>
-          <w:rFonts w:ascii="Cambria Math" w:hAnsi="Cambria Math" w:eastAsia="Arial" w:cs="Cambria Math"/>
-          <w:color w:val="000000" w:themeColor="text1" w:themeTint="FF" w:themeShade="FF"/>
-        </w:rPr>
-        <w:t>₀</w:t>
-      </w:r>
-      <w:r>
-        <w:rPr>
-          <w:rFonts w:ascii="Arial" w:hAnsi="Arial" w:eastAsia="Arial" w:cs="Arial"/>
-          <w:color w:val="000000" w:themeColor="text1" w:themeTint="FF" w:themeShade="FF"/>
-          <w:vertAlign w:val="subscript"/>
-        </w:rPr>
-        <w:t>–</w:t>
-      </w:r>
-      <w:r>
-        <w:rPr>
-          <w:rFonts w:ascii="Cambria Math" w:hAnsi="Cambria Math" w:eastAsia="Arial" w:cs="Cambria Math"/>
-          <w:color w:val="000000" w:themeColor="text1" w:themeTint="FF" w:themeShade="FF"/>
-        </w:rPr>
-        <w:t>₂₄</w:t>
-      </w:r>
-      <w:r>
-        <w:rPr>
-          <w:rFonts w:ascii="Arial" w:hAnsi="Arial" w:eastAsia="Arial" w:cs="Arial"/>
-          <w:color w:val="000000" w:themeColor="text1" w:themeTint="FF" w:themeShade="FF"/>
-        </w:rPr>
-        <w:t>h/MIC</w:t>
-      </w:r>
-      <w:r>
-        <w:rPr>
-          <w:rFonts w:ascii="Arial" w:hAnsi="Arial" w:eastAsia="Arial" w:cs="Arial"/>
-          <w:color w:val="000000" w:themeColor="text1" w:themeTint="FF" w:themeShade="FF"/>
-        </w:rPr>
-        <w:t>), the MIC value, and the protein binding percentage</w:t>
-      </w:r>
-    </w:p>
-    <w:p>
-      <w:pPr>
-        <w:rPr>
-          <w:rFonts w:ascii="Arial" w:hAnsi="Arial" w:eastAsia="Arial" w:cs="Arial"/>
+    <w:p>
+      <w:pPr>
+        <w:rPr>
+          <w:rFonts w:ascii="Arial" w:eastAsia="Arial" w:hAnsi="Arial" w:cs="Arial"/>
+          <w:color w:val="000000" w:themeColor="text1"/>
+        </w:rPr>
+      </w:pPr>
+      <w:r>
+        <w:rPr>
+          <w:rFonts w:ascii="Arial" w:eastAsia="Arial" w:hAnsi="Arial" w:cs="Arial"/>
           <w:b/>
           <w:bCs/>
           <w:color w:val="000000" w:themeColor="text1"/>
         </w:rPr>
-      </w:pPr>
-      <w:r>
-        <w:rPr>
-          <w:rFonts w:ascii="Arial" w:hAnsi="Arial" w:eastAsia="Arial" w:cs="Arial"/>
+        <w:t xml:space="preserve">Figure </w:t>
+      </w:r>
+      <w:r>
+        <w:rPr>
+          <w:rFonts w:ascii="Arial" w:eastAsia="Arial" w:hAnsi="Arial" w:cs="Arial"/>
           <w:b/>
           <w:bCs/>
           <w:color w:val="000000" w:themeColor="text1"/>
         </w:rPr>
+        <w:t>3</w:t>
+      </w:r>
+      <w:r>
+        <w:rPr>
+          <w:rFonts w:ascii="Arial" w:eastAsia="Arial" w:hAnsi="Arial" w:cs="Arial"/>
+          <w:b/>
+          <w:bCs/>
+          <w:color w:val="000000" w:themeColor="text1"/>
+        </w:rPr>
+        <w:t xml:space="preserve">: </w:t>
+      </w:r>
+      <w:r>
+        <w:rPr>
+          <w:rFonts w:ascii="Arial" w:eastAsia="Arial" w:hAnsi="Arial" w:cs="Arial"/>
+          <w:color w:val="000000" w:themeColor="text1"/>
+        </w:rPr>
+        <w:t>Pharmacodynamic target selection panel</w:t>
+      </w:r>
+      <w:r>
+        <w:rPr>
+          <w:rFonts w:ascii="Arial" w:eastAsia="Arial" w:hAnsi="Arial" w:cs="Arial"/>
+          <w:color w:val="000000" w:themeColor="text1"/>
+        </w:rPr>
+        <w:t xml:space="preserve">. Users can specify the desired PK/PD target (e.g., last-24h </w:t>
+      </w:r>
+      <w:proofErr w:type="spellStart"/>
+      <w:r>
+        <w:rPr>
+          <w:rFonts w:ascii="Arial" w:eastAsia="Arial" w:hAnsi="Arial" w:cs="Arial"/>
+          <w:color w:val="000000" w:themeColor="text1"/>
+        </w:rPr>
+        <w:t>fAUC</w:t>
+      </w:r>
+      <w:proofErr w:type="spellEnd"/>
+      <w:r>
+        <w:rPr>
+          <w:rFonts w:ascii="Cambria Math" w:eastAsia="Arial" w:hAnsi="Cambria Math" w:cs="Cambria Math"/>
+          <w:color w:val="000000" w:themeColor="text1"/>
+        </w:rPr>
+        <w:t>₀</w:t>
+      </w:r>
+      <w:r>
+        <w:rPr>
+          <w:rFonts w:ascii="Arial" w:eastAsia="Arial" w:hAnsi="Arial" w:cs="Arial"/>
+          <w:color w:val="000000" w:themeColor="text1"/>
+          <w:vertAlign w:val="subscript"/>
+        </w:rPr>
+        <w:t>–</w:t>
+      </w:r>
+      <w:r>
+        <w:rPr>
+          <w:rFonts w:ascii="Cambria Math" w:eastAsia="Arial" w:hAnsi="Cambria Math" w:cs="Cambria Math"/>
+          <w:color w:val="000000" w:themeColor="text1"/>
+        </w:rPr>
+        <w:t>₂₄</w:t>
+      </w:r>
+      <w:r>
+        <w:rPr>
+          <w:rFonts w:ascii="Arial" w:eastAsia="Arial" w:hAnsi="Arial" w:cs="Arial"/>
+          <w:color w:val="000000" w:themeColor="text1"/>
+        </w:rPr>
+        <w:t>h/MIC), the MIC value, and the protein binding percentage</w:t>
+      </w:r>
+    </w:p>
+    <w:p>
+      <w:pPr>
+        <w:rPr>
+          <w:rFonts w:ascii="Arial" w:eastAsia="Arial" w:hAnsi="Arial" w:cs="Arial"/>
+          <w:b/>
+          <w:bCs/>
+          <w:color w:val="000000" w:themeColor="text1"/>
+        </w:rPr>
+      </w:pPr>
+      <w:r>
+        <w:rPr>
+          <w:rFonts w:ascii="Arial" w:eastAsia="Arial" w:hAnsi="Arial" w:cs="Arial"/>
+          <w:b/>
+          <w:bCs/>
+          <w:color w:val="000000" w:themeColor="text1"/>
+        </w:rPr>
         <w:t>References</w:t>
       </w:r>
     </w:p>
     <w:p>
       <w:pPr>
         <w:rPr>
-          <w:rFonts w:ascii="Arial" w:hAnsi="Arial" w:eastAsia="Arial" w:cs="Arial"/>
-          <w:color w:val="000000" w:themeColor="text1"/>
-          <w:sz w:val="20"/>
-          <w:szCs w:val="20"/>
-        </w:rPr>
-      </w:pPr>
-      <w:r>
-        <w:rPr>
-          <w:rFonts w:ascii="Arial" w:hAnsi="Arial" w:eastAsia="Arial" w:cs="Arial"/>
+          <w:rFonts w:ascii="Arial" w:eastAsia="Arial" w:hAnsi="Arial" w:cs="Arial"/>
+          <w:color w:val="000000" w:themeColor="text1"/>
+          <w:sz w:val="20"/>
+          <w:szCs w:val="20"/>
+        </w:rPr>
+      </w:pPr>
+      <w:r>
+        <w:rPr>
+          <w:rFonts w:ascii="Arial" w:eastAsia="Arial" w:hAnsi="Arial" w:cs="Arial"/>
           <w:color w:val="000000" w:themeColor="text1"/>
           <w:sz w:val="20"/>
           <w:szCs w:val="20"/>
@@ -2188,7 +2160,7 @@
       <w:proofErr w:type="spellStart"/>
       <w:r>
         <w:rPr>
-          <w:rFonts w:ascii="Arial" w:hAnsi="Arial" w:eastAsia="Arial" w:cs="Arial"/>
+          <w:rFonts w:ascii="Arial" w:eastAsia="Arial" w:hAnsi="Arial" w:cs="Arial"/>
           <w:color w:val="000000" w:themeColor="text1"/>
           <w:sz w:val="20"/>
           <w:szCs w:val="20"/>
@@ -2198,7 +2170,7 @@
       <w:proofErr w:type="spellEnd"/>
       <w:r>
         <w:rPr>
-          <w:rFonts w:ascii="Arial" w:hAnsi="Arial" w:eastAsia="Arial" w:cs="Arial"/>
+          <w:rFonts w:ascii="Arial" w:eastAsia="Arial" w:hAnsi="Arial" w:cs="Arial"/>
           <w:color w:val="000000" w:themeColor="text1"/>
           <w:sz w:val="20"/>
           <w:szCs w:val="20"/>
@@ -2208,7 +2180,7 @@
       <w:proofErr w:type="spellStart"/>
       <w:r>
         <w:rPr>
-          <w:rFonts w:ascii="Arial" w:hAnsi="Arial" w:eastAsia="Arial" w:cs="Arial"/>
+          <w:rFonts w:ascii="Arial" w:eastAsia="Arial" w:hAnsi="Arial" w:cs="Arial"/>
           <w:color w:val="000000" w:themeColor="text1"/>
           <w:sz w:val="20"/>
           <w:szCs w:val="20"/>
@@ -2218,7 +2190,7 @@
       <w:proofErr w:type="spellEnd"/>
       <w:r>
         <w:rPr>
-          <w:rFonts w:ascii="Arial" w:hAnsi="Arial" w:eastAsia="Arial" w:cs="Arial"/>
+          <w:rFonts w:ascii="Arial" w:eastAsia="Arial" w:hAnsi="Arial" w:cs="Arial"/>
           <w:color w:val="000000" w:themeColor="text1"/>
           <w:sz w:val="20"/>
           <w:szCs w:val="20"/>
@@ -2229,15 +2201,15 @@
     <w:p>
       <w:pPr>
         <w:rPr>
-          <w:rFonts w:ascii="Arial" w:hAnsi="Arial" w:eastAsia="Arial" w:cs="Arial"/>
-          <w:color w:val="000000" w:themeColor="text1"/>
-          <w:sz w:val="20"/>
-          <w:szCs w:val="20"/>
-        </w:rPr>
-      </w:pPr>
-      <w:r>
-        <w:rPr>
-          <w:rFonts w:ascii="Arial" w:hAnsi="Arial" w:eastAsia="Arial" w:cs="Arial"/>
+          <w:rFonts w:ascii="Arial" w:eastAsia="Arial" w:hAnsi="Arial" w:cs="Arial"/>
+          <w:color w:val="000000" w:themeColor="text1"/>
+          <w:sz w:val="20"/>
+          <w:szCs w:val="20"/>
+        </w:rPr>
+      </w:pPr>
+      <w:r>
+        <w:rPr>
+          <w:rFonts w:ascii="Arial" w:eastAsia="Arial" w:hAnsi="Arial" w:cs="Arial"/>
           <w:color w:val="000000" w:themeColor="text1"/>
           <w:sz w:val="20"/>
           <w:szCs w:val="20"/>
@@ -2246,7 +2218,7 @@
       </w:r>
       <w:r>
         <w:rPr>
-          <w:rFonts w:ascii="Arial" w:hAnsi="Arial" w:eastAsia="Arial" w:cs="Arial"/>
+          <w:rFonts w:ascii="Arial" w:eastAsia="Arial" w:hAnsi="Arial" w:cs="Arial"/>
           <w:color w:val="000000" w:themeColor="text1"/>
           <w:sz w:val="20"/>
           <w:szCs w:val="20"/>
@@ -2256,7 +2228,7 @@
       <w:proofErr w:type="spellStart"/>
       <w:r>
         <w:rPr>
-          <w:rFonts w:ascii="Arial" w:hAnsi="Arial" w:eastAsia="Arial" w:cs="Arial"/>
+          <w:rFonts w:ascii="Arial" w:eastAsia="Arial" w:hAnsi="Arial" w:cs="Arial"/>
           <w:color w:val="000000" w:themeColor="text1"/>
           <w:sz w:val="20"/>
           <w:szCs w:val="20"/>
@@ -2266,7 +2238,7 @@
       <w:proofErr w:type="spellEnd"/>
       <w:r>
         <w:rPr>
-          <w:rFonts w:ascii="Arial" w:hAnsi="Arial" w:eastAsia="Arial" w:cs="Arial"/>
+          <w:rFonts w:ascii="Arial" w:eastAsia="Arial" w:hAnsi="Arial" w:cs="Arial"/>
           <w:color w:val="000000" w:themeColor="text1"/>
           <w:sz w:val="20"/>
           <w:szCs w:val="20"/>
@@ -2277,24 +2249,25 @@
     <w:p>
       <w:pPr>
         <w:rPr>
-          <w:rFonts w:ascii="Arial" w:hAnsi="Arial" w:eastAsia="Arial" w:cs="Arial"/>
-          <w:color w:val="000000" w:themeColor="text1"/>
-          <w:sz w:val="20"/>
-          <w:szCs w:val="20"/>
-        </w:rPr>
-      </w:pPr>
-      <w:r>
-        <w:rPr>
-          <w:rFonts w:ascii="Arial" w:hAnsi="Arial" w:eastAsia="Arial" w:cs="Arial"/>
-          <w:color w:val="000000" w:themeColor="text1"/>
-          <w:sz w:val="20"/>
-          <w:szCs w:val="20"/>
-        </w:rPr>
+          <w:rFonts w:ascii="Arial" w:eastAsia="Arial" w:hAnsi="Arial" w:cs="Arial"/>
+          <w:color w:val="000000" w:themeColor="text1"/>
+          <w:sz w:val="20"/>
+          <w:szCs w:val="20"/>
+        </w:rPr>
+      </w:pPr>
+      <w:r>
+        <w:rPr>
+          <w:rFonts w:ascii="Arial" w:eastAsia="Arial" w:hAnsi="Arial" w:cs="Arial"/>
+          <w:color w:val="000000" w:themeColor="text1"/>
+          <w:sz w:val="20"/>
+          <w:szCs w:val="20"/>
+        </w:rPr>
+        <w:lastRenderedPageBreak/>
         <w:t xml:space="preserve">3, </w:t>
       </w:r>
       <w:r>
         <w:rPr>
-          <w:rFonts w:ascii="Arial" w:hAnsi="Arial" w:eastAsia="Arial" w:cs="Arial"/>
+          <w:rFonts w:ascii="Arial" w:eastAsia="Arial" w:hAnsi="Arial" w:cs="Arial"/>
           <w:color w:val="000000" w:themeColor="text1"/>
           <w:sz w:val="20"/>
           <w:szCs w:val="20"/>
@@ -2304,7 +2277,7 @@
       <w:proofErr w:type="spellStart"/>
       <w:r>
         <w:rPr>
-          <w:rFonts w:ascii="Arial" w:hAnsi="Arial" w:eastAsia="Arial" w:cs="Arial"/>
+          <w:rFonts w:ascii="Arial" w:eastAsia="Arial" w:hAnsi="Arial" w:cs="Arial"/>
           <w:color w:val="000000" w:themeColor="text1"/>
           <w:sz w:val="20"/>
           <w:szCs w:val="20"/>
@@ -2314,7 +2287,7 @@
       <w:proofErr w:type="spellEnd"/>
       <w:r>
         <w:rPr>
-          <w:rFonts w:ascii="Arial" w:hAnsi="Arial" w:eastAsia="Arial" w:cs="Arial"/>
+          <w:rFonts w:ascii="Arial" w:eastAsia="Arial" w:hAnsi="Arial" w:cs="Arial"/>
           <w:color w:val="000000" w:themeColor="text1"/>
           <w:sz w:val="20"/>
           <w:szCs w:val="20"/>
@@ -2324,7 +2297,7 @@
       <w:proofErr w:type="spellStart"/>
       <w:r>
         <w:rPr>
-          <w:rFonts w:ascii="Arial" w:hAnsi="Arial" w:eastAsia="Arial" w:cs="Arial"/>
+          <w:rFonts w:ascii="Arial" w:eastAsia="Arial" w:hAnsi="Arial" w:cs="Arial"/>
           <w:color w:val="000000" w:themeColor="text1"/>
           <w:sz w:val="20"/>
           <w:szCs w:val="20"/>
@@ -2334,7 +2307,7 @@
       <w:proofErr w:type="spellEnd"/>
       <w:r>
         <w:rPr>
-          <w:rFonts w:ascii="Arial" w:hAnsi="Arial" w:eastAsia="Arial" w:cs="Arial"/>
+          <w:rFonts w:ascii="Arial" w:eastAsia="Arial" w:hAnsi="Arial" w:cs="Arial"/>
           <w:color w:val="000000" w:themeColor="text1"/>
           <w:sz w:val="20"/>
           <w:szCs w:val="20"/>
@@ -2344,7 +2317,7 @@
       <w:proofErr w:type="spellStart"/>
       <w:r>
         <w:rPr>
-          <w:rFonts w:ascii="Arial" w:hAnsi="Arial" w:eastAsia="Arial" w:cs="Arial"/>
+          <w:rFonts w:ascii="Arial" w:eastAsia="Arial" w:hAnsi="Arial" w:cs="Arial"/>
           <w:color w:val="000000" w:themeColor="text1"/>
           <w:sz w:val="20"/>
           <w:szCs w:val="20"/>
@@ -2354,7 +2327,7 @@
       <w:proofErr w:type="spellEnd"/>
       <w:r>
         <w:rPr>
-          <w:rFonts w:ascii="Arial" w:hAnsi="Arial" w:eastAsia="Arial" w:cs="Arial"/>
+          <w:rFonts w:ascii="Arial" w:eastAsia="Arial" w:hAnsi="Arial" w:cs="Arial"/>
           <w:color w:val="000000" w:themeColor="text1"/>
           <w:sz w:val="20"/>
           <w:szCs w:val="20"/>
@@ -2364,7 +2337,7 @@
       <w:proofErr w:type="spellStart"/>
       <w:r>
         <w:rPr>
-          <w:rFonts w:ascii="Arial" w:hAnsi="Arial" w:eastAsia="Arial" w:cs="Arial"/>
+          <w:rFonts w:ascii="Arial" w:eastAsia="Arial" w:hAnsi="Arial" w:cs="Arial"/>
           <w:color w:val="000000" w:themeColor="text1"/>
           <w:sz w:val="20"/>
           <w:szCs w:val="20"/>
@@ -2374,7 +2347,7 @@
       <w:proofErr w:type="spellEnd"/>
       <w:r>
         <w:rPr>
-          <w:rFonts w:ascii="Arial" w:hAnsi="Arial" w:eastAsia="Arial" w:cs="Arial"/>
+          <w:rFonts w:ascii="Arial" w:eastAsia="Arial" w:hAnsi="Arial" w:cs="Arial"/>
           <w:color w:val="000000" w:themeColor="text1"/>
           <w:sz w:val="20"/>
           <w:szCs w:val="20"/>
@@ -2385,15 +2358,15 @@
     <w:p>
       <w:pPr>
         <w:rPr>
-          <w:rFonts w:ascii="Arial" w:hAnsi="Arial" w:eastAsia="Arial" w:cs="Arial"/>
-          <w:color w:val="000000" w:themeColor="text1"/>
-          <w:sz w:val="20"/>
-          <w:szCs w:val="20"/>
-        </w:rPr>
-      </w:pPr>
-      <w:r>
-        <w:rPr>
-          <w:rFonts w:ascii="Arial" w:hAnsi="Arial" w:eastAsia="Arial" w:cs="Arial"/>
+          <w:rFonts w:ascii="Arial" w:eastAsia="Arial" w:hAnsi="Arial" w:cs="Arial"/>
+          <w:color w:val="000000" w:themeColor="text1"/>
+          <w:sz w:val="20"/>
+          <w:szCs w:val="20"/>
+        </w:rPr>
+      </w:pPr>
+      <w:r>
+        <w:rPr>
+          <w:rFonts w:ascii="Arial" w:eastAsia="Arial" w:hAnsi="Arial" w:cs="Arial"/>
           <w:color w:val="000000" w:themeColor="text1"/>
           <w:sz w:val="20"/>
           <w:szCs w:val="20"/>
@@ -2403,7 +2376,7 @@
       <w:proofErr w:type="spellStart"/>
       <w:r>
         <w:rPr>
-          <w:rFonts w:ascii="Arial" w:hAnsi="Arial" w:eastAsia="Arial" w:cs="Arial"/>
+          <w:rFonts w:ascii="Arial" w:eastAsia="Arial" w:hAnsi="Arial" w:cs="Arial"/>
           <w:color w:val="000000" w:themeColor="text1"/>
           <w:sz w:val="20"/>
           <w:szCs w:val="20"/>
@@ -2413,7 +2386,7 @@
       <w:proofErr w:type="spellEnd"/>
       <w:r>
         <w:rPr>
-          <w:rFonts w:ascii="Arial" w:hAnsi="Arial" w:eastAsia="Arial" w:cs="Arial"/>
+          <w:rFonts w:ascii="Arial" w:eastAsia="Arial" w:hAnsi="Arial" w:cs="Arial"/>
           <w:color w:val="000000" w:themeColor="text1"/>
           <w:sz w:val="20"/>
           <w:szCs w:val="20"/>
@@ -2423,7 +2396,7 @@
       <w:proofErr w:type="spellStart"/>
       <w:r>
         <w:rPr>
-          <w:rFonts w:ascii="Arial" w:hAnsi="Arial" w:eastAsia="Arial" w:cs="Arial"/>
+          <w:rFonts w:ascii="Arial" w:eastAsia="Arial" w:hAnsi="Arial" w:cs="Arial"/>
           <w:color w:val="000000" w:themeColor="text1"/>
           <w:sz w:val="20"/>
           <w:szCs w:val="20"/>
@@ -2433,7 +2406,7 @@
       <w:proofErr w:type="spellEnd"/>
       <w:r>
         <w:rPr>
-          <w:rFonts w:ascii="Arial" w:hAnsi="Arial" w:eastAsia="Arial" w:cs="Arial"/>
+          <w:rFonts w:ascii="Arial" w:eastAsia="Arial" w:hAnsi="Arial" w:cs="Arial"/>
           <w:color w:val="000000" w:themeColor="text1"/>
           <w:sz w:val="20"/>
           <w:szCs w:val="20"/>
@@ -2443,7 +2416,7 @@
       <w:proofErr w:type="spellStart"/>
       <w:r>
         <w:rPr>
-          <w:rFonts w:ascii="Arial" w:hAnsi="Arial" w:eastAsia="Arial" w:cs="Arial"/>
+          <w:rFonts w:ascii="Arial" w:eastAsia="Arial" w:hAnsi="Arial" w:cs="Arial"/>
           <w:color w:val="000000" w:themeColor="text1"/>
           <w:sz w:val="20"/>
           <w:szCs w:val="20"/>
@@ -2453,7 +2426,7 @@
       <w:proofErr w:type="spellEnd"/>
       <w:r>
         <w:rPr>
-          <w:rFonts w:ascii="Arial" w:hAnsi="Arial" w:eastAsia="Arial" w:cs="Arial"/>
+          <w:rFonts w:ascii="Arial" w:eastAsia="Arial" w:hAnsi="Arial" w:cs="Arial"/>
           <w:color w:val="000000" w:themeColor="text1"/>
           <w:sz w:val="20"/>
           <w:szCs w:val="20"/>
@@ -2463,7 +2436,7 @@
       <w:proofErr w:type="spellStart"/>
       <w:r>
         <w:rPr>
-          <w:rFonts w:ascii="Arial" w:hAnsi="Arial" w:eastAsia="Arial" w:cs="Arial"/>
+          <w:rFonts w:ascii="Arial" w:eastAsia="Arial" w:hAnsi="Arial" w:cs="Arial"/>
           <w:color w:val="000000" w:themeColor="text1"/>
           <w:sz w:val="20"/>
           <w:szCs w:val="20"/>
@@ -2473,7 +2446,7 @@
       <w:proofErr w:type="spellEnd"/>
       <w:r>
         <w:rPr>
-          <w:rFonts w:ascii="Arial" w:hAnsi="Arial" w:eastAsia="Arial" w:cs="Arial"/>
+          <w:rFonts w:ascii="Arial" w:eastAsia="Arial" w:hAnsi="Arial" w:cs="Arial"/>
           <w:color w:val="000000" w:themeColor="text1"/>
           <w:sz w:val="20"/>
           <w:szCs w:val="20"/>
@@ -2484,15 +2457,15 @@
     <w:p>
       <w:pPr>
         <w:rPr>
-          <w:rFonts w:ascii="Arial" w:hAnsi="Arial" w:eastAsia="Arial" w:cs="Arial"/>
-          <w:color w:val="000000" w:themeColor="text1"/>
-          <w:sz w:val="20"/>
-          <w:szCs w:val="20"/>
-        </w:rPr>
-      </w:pPr>
-      <w:r>
-        <w:rPr>
-          <w:rFonts w:ascii="Arial" w:hAnsi="Arial" w:eastAsia="Arial" w:cs="Arial"/>
+          <w:rFonts w:ascii="Arial" w:eastAsia="Arial" w:hAnsi="Arial" w:cs="Arial"/>
+          <w:color w:val="000000" w:themeColor="text1"/>
+          <w:sz w:val="20"/>
+          <w:szCs w:val="20"/>
+        </w:rPr>
+      </w:pPr>
+      <w:r>
+        <w:rPr>
+          <w:rFonts w:ascii="Arial" w:eastAsia="Arial" w:hAnsi="Arial" w:cs="Arial"/>
           <w:color w:val="000000" w:themeColor="text1"/>
           <w:sz w:val="20"/>
           <w:szCs w:val="20"/>
@@ -2502,7 +2475,7 @@
       <w:proofErr w:type="spellStart"/>
       <w:r>
         <w:rPr>
-          <w:rFonts w:ascii="Arial" w:hAnsi="Arial" w:eastAsia="Arial" w:cs="Arial"/>
+          <w:rFonts w:ascii="Arial" w:eastAsia="Arial" w:hAnsi="Arial" w:cs="Arial"/>
           <w:color w:val="000000" w:themeColor="text1"/>
           <w:sz w:val="20"/>
           <w:szCs w:val="20"/>
@@ -2512,7 +2485,7 @@
       <w:proofErr w:type="spellEnd"/>
       <w:r>
         <w:rPr>
-          <w:rFonts w:ascii="Arial" w:hAnsi="Arial" w:eastAsia="Arial" w:cs="Arial"/>
+          <w:rFonts w:ascii="Arial" w:eastAsia="Arial" w:hAnsi="Arial" w:cs="Arial"/>
           <w:color w:val="000000" w:themeColor="text1"/>
           <w:sz w:val="20"/>
           <w:szCs w:val="20"/>
@@ -2522,7 +2495,7 @@
       <w:proofErr w:type="spellStart"/>
       <w:r>
         <w:rPr>
-          <w:rFonts w:ascii="Arial" w:hAnsi="Arial" w:eastAsia="Arial" w:cs="Arial"/>
+          <w:rFonts w:ascii="Arial" w:eastAsia="Arial" w:hAnsi="Arial" w:cs="Arial"/>
           <w:color w:val="000000" w:themeColor="text1"/>
           <w:sz w:val="20"/>
           <w:szCs w:val="20"/>
@@ -2532,7 +2505,7 @@
       <w:proofErr w:type="spellEnd"/>
       <w:r>
         <w:rPr>
-          <w:rFonts w:ascii="Arial" w:hAnsi="Arial" w:eastAsia="Arial" w:cs="Arial"/>
+          <w:rFonts w:ascii="Arial" w:eastAsia="Arial" w:hAnsi="Arial" w:cs="Arial"/>
           <w:color w:val="000000" w:themeColor="text1"/>
           <w:sz w:val="20"/>
           <w:szCs w:val="20"/>
@@ -2542,7 +2515,7 @@
       <w:proofErr w:type="spellStart"/>
       <w:r>
         <w:rPr>
-          <w:rFonts w:ascii="Arial" w:hAnsi="Arial" w:eastAsia="Arial" w:cs="Arial"/>
+          <w:rFonts w:ascii="Arial" w:eastAsia="Arial" w:hAnsi="Arial" w:cs="Arial"/>
           <w:color w:val="000000" w:themeColor="text1"/>
           <w:sz w:val="20"/>
           <w:szCs w:val="20"/>
@@ -2552,7 +2525,7 @@
       <w:proofErr w:type="spellEnd"/>
       <w:r>
         <w:rPr>
-          <w:rFonts w:ascii="Arial" w:hAnsi="Arial" w:eastAsia="Arial" w:cs="Arial"/>
+          <w:rFonts w:ascii="Arial" w:eastAsia="Arial" w:hAnsi="Arial" w:cs="Arial"/>
           <w:color w:val="000000" w:themeColor="text1"/>
           <w:sz w:val="20"/>
           <w:szCs w:val="20"/>
@@ -2562,7 +2535,7 @@
       <w:proofErr w:type="spellStart"/>
       <w:r>
         <w:rPr>
-          <w:rFonts w:ascii="Arial" w:hAnsi="Arial" w:eastAsia="Arial" w:cs="Arial"/>
+          <w:rFonts w:ascii="Arial" w:eastAsia="Arial" w:hAnsi="Arial" w:cs="Arial"/>
           <w:color w:val="000000" w:themeColor="text1"/>
           <w:sz w:val="20"/>
           <w:szCs w:val="20"/>
@@ -2572,7 +2545,7 @@
       <w:proofErr w:type="spellEnd"/>
       <w:r>
         <w:rPr>
-          <w:rFonts w:ascii="Arial" w:hAnsi="Arial" w:eastAsia="Arial" w:cs="Arial"/>
+          <w:rFonts w:ascii="Arial" w:eastAsia="Arial" w:hAnsi="Arial" w:cs="Arial"/>
           <w:color w:val="000000" w:themeColor="text1"/>
           <w:sz w:val="20"/>
           <w:szCs w:val="20"/>
@@ -2582,7 +2555,7 @@
       <w:proofErr w:type="spellStart"/>
       <w:r>
         <w:rPr>
-          <w:rFonts w:ascii="Arial" w:hAnsi="Arial" w:eastAsia="Arial" w:cs="Arial"/>
+          <w:rFonts w:ascii="Arial" w:eastAsia="Arial" w:hAnsi="Arial" w:cs="Arial"/>
           <w:color w:val="000000" w:themeColor="text1"/>
           <w:sz w:val="20"/>
           <w:szCs w:val="20"/>
@@ -2592,7 +2565,7 @@
       <w:proofErr w:type="spellEnd"/>
       <w:r>
         <w:rPr>
-          <w:rFonts w:ascii="Arial" w:hAnsi="Arial" w:eastAsia="Arial" w:cs="Arial"/>
+          <w:rFonts w:ascii="Arial" w:eastAsia="Arial" w:hAnsi="Arial" w:cs="Arial"/>
           <w:color w:val="000000" w:themeColor="text1"/>
           <w:sz w:val="20"/>
           <w:szCs w:val="20"/>
@@ -2602,7 +2575,7 @@
       <w:proofErr w:type="spellStart"/>
       <w:r>
         <w:rPr>
-          <w:rFonts w:ascii="Arial" w:hAnsi="Arial" w:eastAsia="Arial" w:cs="Arial"/>
+          <w:rFonts w:ascii="Arial" w:eastAsia="Arial" w:hAnsi="Arial" w:cs="Arial"/>
           <w:color w:val="000000" w:themeColor="text1"/>
           <w:sz w:val="20"/>
           <w:szCs w:val="20"/>
@@ -2612,7 +2585,7 @@
       <w:proofErr w:type="spellEnd"/>
       <w:r>
         <w:rPr>
-          <w:rFonts w:ascii="Arial" w:hAnsi="Arial" w:eastAsia="Arial" w:cs="Arial"/>
+          <w:rFonts w:ascii="Arial" w:eastAsia="Arial" w:hAnsi="Arial" w:cs="Arial"/>
           <w:color w:val="000000" w:themeColor="text1"/>
           <w:sz w:val="20"/>
           <w:szCs w:val="20"/>
@@ -2623,15 +2596,15 @@
     <w:p>
       <w:pPr>
         <w:rPr>
-          <w:rFonts w:ascii="Arial" w:hAnsi="Arial" w:eastAsia="Arial" w:cs="Arial"/>
-          <w:color w:val="000000" w:themeColor="text1"/>
-          <w:sz w:val="20"/>
-          <w:szCs w:val="20"/>
-        </w:rPr>
-      </w:pPr>
-      <w:r>
-        <w:rPr>
-          <w:rFonts w:ascii="Arial" w:hAnsi="Arial" w:eastAsia="Arial" w:cs="Arial"/>
+          <w:rFonts w:ascii="Arial" w:eastAsia="Arial" w:hAnsi="Arial" w:cs="Arial"/>
+          <w:color w:val="000000" w:themeColor="text1"/>
+          <w:sz w:val="20"/>
+          <w:szCs w:val="20"/>
+        </w:rPr>
+      </w:pPr>
+      <w:r>
+        <w:rPr>
+          <w:rFonts w:ascii="Arial" w:eastAsia="Arial" w:hAnsi="Arial" w:cs="Arial"/>
           <w:color w:val="000000" w:themeColor="text1"/>
           <w:sz w:val="20"/>
           <w:szCs w:val="20"/>
@@ -2641,7 +2614,7 @@
       <w:proofErr w:type="spellStart"/>
       <w:r>
         <w:rPr>
-          <w:rFonts w:ascii="Arial" w:hAnsi="Arial" w:eastAsia="Arial" w:cs="Arial"/>
+          <w:rFonts w:ascii="Arial" w:eastAsia="Arial" w:hAnsi="Arial" w:cs="Arial"/>
           <w:color w:val="000000" w:themeColor="text1"/>
           <w:sz w:val="20"/>
           <w:szCs w:val="20"/>
@@ -2651,7 +2624,7 @@
       <w:proofErr w:type="spellEnd"/>
       <w:r>
         <w:rPr>
-          <w:rFonts w:ascii="Arial" w:hAnsi="Arial" w:eastAsia="Arial" w:cs="Arial"/>
+          <w:rFonts w:ascii="Arial" w:eastAsia="Arial" w:hAnsi="Arial" w:cs="Arial"/>
           <w:color w:val="000000" w:themeColor="text1"/>
           <w:sz w:val="20"/>
           <w:szCs w:val="20"/>
@@ -2661,7 +2634,7 @@
       <w:proofErr w:type="spellStart"/>
       <w:r>
         <w:rPr>
-          <w:rFonts w:ascii="Arial" w:hAnsi="Arial" w:eastAsia="Arial" w:cs="Arial"/>
+          <w:rFonts w:ascii="Arial" w:eastAsia="Arial" w:hAnsi="Arial" w:cs="Arial"/>
           <w:color w:val="000000" w:themeColor="text1"/>
           <w:sz w:val="20"/>
           <w:szCs w:val="20"/>
@@ -2671,7 +2644,7 @@
       <w:proofErr w:type="spellEnd"/>
       <w:r>
         <w:rPr>
-          <w:rFonts w:ascii="Arial" w:hAnsi="Arial" w:eastAsia="Arial" w:cs="Arial"/>
+          <w:rFonts w:ascii="Arial" w:eastAsia="Arial" w:hAnsi="Arial" w:cs="Arial"/>
           <w:color w:val="000000" w:themeColor="text1"/>
           <w:sz w:val="20"/>
           <w:szCs w:val="20"/>
@@ -2681,7 +2654,7 @@
       <w:proofErr w:type="spellStart"/>
       <w:r>
         <w:rPr>
-          <w:rFonts w:ascii="Arial" w:hAnsi="Arial" w:eastAsia="Arial" w:cs="Arial"/>
+          <w:rFonts w:ascii="Arial" w:eastAsia="Arial" w:hAnsi="Arial" w:cs="Arial"/>
           <w:color w:val="000000" w:themeColor="text1"/>
           <w:sz w:val="20"/>
           <w:szCs w:val="20"/>
@@ -2691,7 +2664,7 @@
       <w:proofErr w:type="spellEnd"/>
       <w:r>
         <w:rPr>
-          <w:rFonts w:ascii="Arial" w:hAnsi="Arial" w:eastAsia="Arial" w:cs="Arial"/>
+          <w:rFonts w:ascii="Arial" w:eastAsia="Arial" w:hAnsi="Arial" w:cs="Arial"/>
           <w:color w:val="000000" w:themeColor="text1"/>
           <w:sz w:val="20"/>
           <w:szCs w:val="20"/>
@@ -2701,7 +2674,7 @@
       <w:proofErr w:type="spellStart"/>
       <w:r>
         <w:rPr>
-          <w:rFonts w:ascii="Arial" w:hAnsi="Arial" w:eastAsia="Arial" w:cs="Arial"/>
+          <w:rFonts w:ascii="Arial" w:eastAsia="Arial" w:hAnsi="Arial" w:cs="Arial"/>
           <w:color w:val="000000" w:themeColor="text1"/>
           <w:sz w:val="20"/>
           <w:szCs w:val="20"/>
@@ -2711,7 +2684,7 @@
       <w:proofErr w:type="spellEnd"/>
       <w:r>
         <w:rPr>
-          <w:rFonts w:ascii="Arial" w:hAnsi="Arial" w:eastAsia="Arial" w:cs="Arial"/>
+          <w:rFonts w:ascii="Arial" w:eastAsia="Arial" w:hAnsi="Arial" w:cs="Arial"/>
           <w:color w:val="000000" w:themeColor="text1"/>
           <w:sz w:val="20"/>
           <w:szCs w:val="20"/>
@@ -2721,7 +2694,7 @@
       <w:proofErr w:type="spellStart"/>
       <w:r>
         <w:rPr>
-          <w:rFonts w:ascii="Arial" w:hAnsi="Arial" w:eastAsia="Arial" w:cs="Arial"/>
+          <w:rFonts w:ascii="Arial" w:eastAsia="Arial" w:hAnsi="Arial" w:cs="Arial"/>
           <w:color w:val="000000" w:themeColor="text1"/>
           <w:sz w:val="20"/>
           <w:szCs w:val="20"/>
@@ -2731,7 +2704,7 @@
       <w:proofErr w:type="spellEnd"/>
       <w:r>
         <w:rPr>
-          <w:rFonts w:ascii="Arial" w:hAnsi="Arial" w:eastAsia="Arial" w:cs="Arial"/>
+          <w:rFonts w:ascii="Arial" w:eastAsia="Arial" w:hAnsi="Arial" w:cs="Arial"/>
           <w:color w:val="000000" w:themeColor="text1"/>
           <w:sz w:val="20"/>
           <w:szCs w:val="20"/>
@@ -2741,7 +2714,7 @@
       <w:proofErr w:type="spellStart"/>
       <w:r>
         <w:rPr>
-          <w:rFonts w:ascii="Arial" w:hAnsi="Arial" w:eastAsia="Arial" w:cs="Arial"/>
+          <w:rFonts w:ascii="Arial" w:eastAsia="Arial" w:hAnsi="Arial" w:cs="Arial"/>
           <w:color w:val="000000" w:themeColor="text1"/>
           <w:sz w:val="20"/>
           <w:szCs w:val="20"/>
@@ -2751,17 +2724,37 @@
       <w:proofErr w:type="spellEnd"/>
       <w:r>
         <w:rPr>
-          <w:rFonts w:ascii="Arial" w:hAnsi="Arial" w:eastAsia="Arial" w:cs="Arial"/>
-          <w:color w:val="000000" w:themeColor="text1"/>
-          <w:sz w:val="20"/>
-          <w:szCs w:val="20"/>
-        </w:rPr>
-        <w:t xml:space="preserve">. 2025 Oct 17:e0077325. </w:t>
+          <w:rFonts w:ascii="Arial" w:eastAsia="Arial" w:hAnsi="Arial" w:cs="Arial"/>
+          <w:color w:val="000000" w:themeColor="text1"/>
+          <w:sz w:val="20"/>
+          <w:szCs w:val="20"/>
+        </w:rPr>
+        <w:t xml:space="preserve">. 2025 Oct </w:t>
+      </w:r>
+      <w:proofErr w:type="gramStart"/>
+      <w:r>
+        <w:rPr>
+          <w:rFonts w:ascii="Arial" w:eastAsia="Arial" w:hAnsi="Arial" w:cs="Arial"/>
+          <w:color w:val="000000" w:themeColor="text1"/>
+          <w:sz w:val="20"/>
+          <w:szCs w:val="20"/>
+        </w:rPr>
+        <w:t>17:e</w:t>
+      </w:r>
+      <w:proofErr w:type="gramEnd"/>
+      <w:r>
+        <w:rPr>
+          <w:rFonts w:ascii="Arial" w:eastAsia="Arial" w:hAnsi="Arial" w:cs="Arial"/>
+          <w:color w:val="000000" w:themeColor="text1"/>
+          <w:sz w:val="20"/>
+          <w:szCs w:val="20"/>
+        </w:rPr>
+        <w:t xml:space="preserve">0077325. </w:t>
       </w:r>
       <w:proofErr w:type="spellStart"/>
       <w:r>
         <w:rPr>
-          <w:rFonts w:ascii="Arial" w:hAnsi="Arial" w:eastAsia="Arial" w:cs="Arial"/>
+          <w:rFonts w:ascii="Arial" w:eastAsia="Arial" w:hAnsi="Arial" w:cs="Arial"/>
           <w:color w:val="000000" w:themeColor="text1"/>
           <w:sz w:val="20"/>
           <w:szCs w:val="20"/>
@@ -2771,7 +2764,7 @@
       <w:proofErr w:type="spellEnd"/>
       <w:r>
         <w:rPr>
-          <w:rFonts w:ascii="Arial" w:hAnsi="Arial" w:eastAsia="Arial" w:cs="Arial"/>
+          <w:rFonts w:ascii="Arial" w:eastAsia="Arial" w:hAnsi="Arial" w:cs="Arial"/>
           <w:color w:val="000000" w:themeColor="text1"/>
           <w:sz w:val="20"/>
           <w:szCs w:val="20"/>
@@ -2781,7 +2774,7 @@
       <w:proofErr w:type="spellStart"/>
       <w:r>
         <w:rPr>
-          <w:rFonts w:ascii="Arial" w:hAnsi="Arial" w:eastAsia="Arial" w:cs="Arial"/>
+          <w:rFonts w:ascii="Arial" w:eastAsia="Arial" w:hAnsi="Arial" w:cs="Arial"/>
           <w:color w:val="000000" w:themeColor="text1"/>
           <w:sz w:val="20"/>
           <w:szCs w:val="20"/>
@@ -2791,7 +2784,7 @@
       <w:proofErr w:type="spellEnd"/>
       <w:r>
         <w:rPr>
-          <w:rFonts w:ascii="Arial" w:hAnsi="Arial" w:eastAsia="Arial" w:cs="Arial"/>
+          <w:rFonts w:ascii="Arial" w:eastAsia="Arial" w:hAnsi="Arial" w:cs="Arial"/>
           <w:color w:val="000000" w:themeColor="text1"/>
           <w:sz w:val="20"/>
           <w:szCs w:val="20"/>
@@ -2802,15 +2795,15 @@
     <w:p>
       <w:pPr>
         <w:rPr>
-          <w:rFonts w:ascii="Arial" w:hAnsi="Arial" w:eastAsia="Arial" w:cs="Arial"/>
-          <w:color w:val="000000" w:themeColor="text1"/>
-          <w:sz w:val="20"/>
-          <w:szCs w:val="20"/>
-        </w:rPr>
-      </w:pPr>
-      <w:r>
-        <w:rPr>
-          <w:rFonts w:ascii="Arial" w:hAnsi="Arial" w:eastAsia="Arial" w:cs="Arial"/>
+          <w:rFonts w:ascii="Arial" w:eastAsia="Arial" w:hAnsi="Arial" w:cs="Arial"/>
+          <w:color w:val="000000" w:themeColor="text1"/>
+          <w:sz w:val="20"/>
+          <w:szCs w:val="20"/>
+        </w:rPr>
+      </w:pPr>
+      <w:r>
+        <w:rPr>
+          <w:rFonts w:ascii="Arial" w:eastAsia="Arial" w:hAnsi="Arial" w:cs="Arial"/>
           <w:color w:val="000000" w:themeColor="text1"/>
           <w:sz w:val="20"/>
           <w:szCs w:val="20"/>
@@ -2819,47 +2812,27 @@
       </w:r>
       <w:r>
         <w:rPr>
-          <w:rFonts w:ascii="Arial" w:hAnsi="Arial" w:eastAsia="Arial" w:cs="Arial"/>
-          <w:color w:val="000000" w:themeColor="text1"/>
-          <w:sz w:val="20"/>
-          <w:szCs w:val="20"/>
-        </w:rPr>
-        <w:t xml:space="preserve">Chiriac U, Liebchen U, Frey OR, Lanzinger H, Klein S, Hoppe-Tichy T, </w:t>
+          <w:rFonts w:ascii="Arial" w:eastAsia="Arial" w:hAnsi="Arial" w:cs="Arial"/>
+          <w:color w:val="000000" w:themeColor="text1"/>
+          <w:sz w:val="20"/>
+          <w:szCs w:val="20"/>
+        </w:rPr>
+        <w:t xml:space="preserve">Chiriac U, Liebchen U, Frey OR, Lanzinger H, Klein S, Hoppe-Tichy T, Karck M, Meyer A, Morath B. Model-Based Dose Identification of Dalbavancin for Long-Term Suppressive Outpatient Treatment of Ventricular Assist Device Infections. Antibiotics (Basel). 2024 Nov 20;13(11):1103. </w:t>
       </w:r>
       <w:proofErr w:type="spellStart"/>
       <w:r>
         <w:rPr>
-          <w:rFonts w:ascii="Arial" w:hAnsi="Arial" w:eastAsia="Arial" w:cs="Arial"/>
-          <w:color w:val="000000" w:themeColor="text1"/>
-          <w:sz w:val="20"/>
-          <w:szCs w:val="20"/>
-        </w:rPr>
-        <w:t>Karck</w:t>
+          <w:rFonts w:ascii="Arial" w:eastAsia="Arial" w:hAnsi="Arial" w:cs="Arial"/>
+          <w:color w:val="000000" w:themeColor="text1"/>
+          <w:sz w:val="20"/>
+          <w:szCs w:val="20"/>
+        </w:rPr>
+        <w:t>doi</w:t>
       </w:r>
       <w:proofErr w:type="spellEnd"/>
       <w:r>
         <w:rPr>
-          <w:rFonts w:ascii="Arial" w:hAnsi="Arial" w:eastAsia="Arial" w:cs="Arial"/>
-          <w:color w:val="000000" w:themeColor="text1"/>
-          <w:sz w:val="20"/>
-          <w:szCs w:val="20"/>
-        </w:rPr>
-        <w:t xml:space="preserve"> M, Meyer A, Morath B. Model-Based Dose Identification of Dalbavancin for Long-Term Suppressive Outpatient Treatment of Ventricular Assist Device Infections. Antibiotics (Basel). 2024 Nov 20;13(11):1103. </w:t>
-      </w:r>
-      <w:proofErr w:type="spellStart"/>
-      <w:r>
-        <w:rPr>
-          <w:rFonts w:ascii="Arial" w:hAnsi="Arial" w:eastAsia="Arial" w:cs="Arial"/>
-          <w:color w:val="000000" w:themeColor="text1"/>
-          <w:sz w:val="20"/>
-          <w:szCs w:val="20"/>
-        </w:rPr>
-        <w:t>doi</w:t>
-      </w:r>
-      <w:proofErr w:type="spellEnd"/>
-      <w:r>
-        <w:rPr>
-          <w:rFonts w:ascii="Arial" w:hAnsi="Arial" w:eastAsia="Arial" w:cs="Arial"/>
+          <w:rFonts w:ascii="Arial" w:eastAsia="Arial" w:hAnsi="Arial" w:cs="Arial"/>
           <w:color w:val="000000" w:themeColor="text1"/>
           <w:sz w:val="20"/>
           <w:szCs w:val="20"/>
@@ -2867,22 +2840,56 @@
         <w:t>: 10.3390/antibiotics13111103. PMID: 39596796; PMCID: PMC11591545.</w:t>
       </w:r>
     </w:p>
+    <w:p>
+      <w:pPr>
+        <w:rPr>
+          <w:rFonts w:ascii="Arial" w:eastAsia="Arial" w:hAnsi="Arial" w:cs="Arial"/>
+          <w:color w:val="000000" w:themeColor="text1"/>
+          <w:sz w:val="20"/>
+          <w:szCs w:val="20"/>
+        </w:rPr>
+      </w:pPr>
+    </w:p>
+    <w:p>
+      <w:pPr>
+        <w:rPr>
+          <w:rFonts w:ascii="Arial" w:eastAsia="Arial" w:hAnsi="Arial" w:cs="Arial"/>
+          <w:color w:val="000000" w:themeColor="text1"/>
+          <w:sz w:val="20"/>
+          <w:szCs w:val="20"/>
+        </w:rPr>
+      </w:pPr>
+    </w:p>
+    <w:p>
+      <w:pPr>
+        <w:rPr>
+          <w:rFonts w:ascii="Arial" w:eastAsia="Arial" w:hAnsi="Arial" w:cs="Arial"/>
+          <w:color w:val="000000" w:themeColor="text1"/>
+          <w:sz w:val="20"/>
+          <w:szCs w:val="20"/>
+          <w:lang w:val="it-IT"/>
+        </w:rPr>
+      </w:pPr>
+    </w:p>
+    <w:p>
+      <w:pPr>
+        <w:rPr>
+          <w:rFonts w:ascii="Arial" w:eastAsia="Arial" w:hAnsi="Arial" w:cs="Arial"/>
+          <w:color w:val="000000" w:themeColor="text1"/>
+          <w:sz w:val="20"/>
+          <w:szCs w:val="20"/>
+          <w:lang w:val="it-IT"/>
+        </w:rPr>
+      </w:pPr>
+    </w:p>
     <w:sectPr>
-      <w:pgSz w:w="11906" w:h="16838" w:orient="portrait"/>
+      <w:pgSz w:w="11906" w:h="16838"/>
       <w:pgMar w:top="1440" w:right="1440" w:bottom="1440" w:left="1440" w:header="720" w:footer="720" w:gutter="0"/>
       <w:cols w:space="720"/>
       <w:docGrid w:linePitch="360"/>
     </w:sectPr>
   </w:body>
 </w:document>
-</file>
-
-<file path=word/commentsExtended.xml><?xml version="1.0" encoding="utf-8"?>
-<w15:commentsEx xmlns:mc="http://schemas.openxmlformats.org/markup-compatibility/2006" xmlns:w15="http://schemas.microsoft.com/office/word/2012/wordml" mc:Ignorable="w15"/>
-</file>
-
-<file path=word/commentsIds.xml><?xml version="1.0" encoding="utf-8"?>
-<w16cid:commentsIds xmlns:mc="http://schemas.openxmlformats.org/markup-compatibility/2006" xmlns:w16cid="http://schemas.microsoft.com/office/word/2016/wordml/cid" mc:Ignorable="w16cid"/>
 </file>
 
 <file path=word/numbering.xml><?xml version="1.0" encoding="utf-8"?>
@@ -2903,7 +2910,7 @@
         <w:ind w:left="720" w:hanging="360"/>
       </w:pPr>
       <w:rPr>
-        <w:rFonts w:hint="default" w:ascii="Symbol" w:hAnsi="Symbol"/>
+        <w:rFonts w:ascii="Symbol" w:hAnsi="Symbol" w:hint="default"/>
         <w:sz w:val="20"/>
       </w:rPr>
     </w:lvl>
@@ -2919,7 +2926,7 @@
         <w:ind w:left="1440" w:hanging="360"/>
       </w:pPr>
       <w:rPr>
-        <w:rFonts w:hint="default" w:ascii="Courier New" w:hAnsi="Courier New" w:cs="Times New Roman"/>
+        <w:rFonts w:ascii="Courier New" w:hAnsi="Courier New" w:cs="Times New Roman" w:hint="default"/>
         <w:sz w:val="20"/>
       </w:rPr>
     </w:lvl>
@@ -2935,7 +2942,7 @@
         <w:ind w:left="2160" w:hanging="360"/>
       </w:pPr>
       <w:rPr>
-        <w:rFonts w:hint="default" w:ascii="Wingdings" w:hAnsi="Wingdings"/>
+        <w:rFonts w:ascii="Wingdings" w:hAnsi="Wingdings" w:hint="default"/>
         <w:sz w:val="20"/>
       </w:rPr>
     </w:lvl>
@@ -2951,7 +2958,7 @@
         <w:ind w:left="2880" w:hanging="360"/>
       </w:pPr>
       <w:rPr>
-        <w:rFonts w:hint="default" w:ascii="Wingdings" w:hAnsi="Wingdings"/>
+        <w:rFonts w:ascii="Wingdings" w:hAnsi="Wingdings" w:hint="default"/>
         <w:sz w:val="20"/>
       </w:rPr>
     </w:lvl>
@@ -2967,7 +2974,7 @@
         <w:ind w:left="3600" w:hanging="360"/>
       </w:pPr>
       <w:rPr>
-        <w:rFonts w:hint="default" w:ascii="Wingdings" w:hAnsi="Wingdings"/>
+        <w:rFonts w:ascii="Wingdings" w:hAnsi="Wingdings" w:hint="default"/>
         <w:sz w:val="20"/>
       </w:rPr>
     </w:lvl>
@@ -2983,7 +2990,7 @@
         <w:ind w:left="4320" w:hanging="360"/>
       </w:pPr>
       <w:rPr>
-        <w:rFonts w:hint="default" w:ascii="Wingdings" w:hAnsi="Wingdings"/>
+        <w:rFonts w:ascii="Wingdings" w:hAnsi="Wingdings" w:hint="default"/>
         <w:sz w:val="20"/>
       </w:rPr>
     </w:lvl>
@@ -2999,7 +3006,7 @@
         <w:ind w:left="5040" w:hanging="360"/>
       </w:pPr>
       <w:rPr>
-        <w:rFonts w:hint="default" w:ascii="Wingdings" w:hAnsi="Wingdings"/>
+        <w:rFonts w:ascii="Wingdings" w:hAnsi="Wingdings" w:hint="default"/>
         <w:sz w:val="20"/>
       </w:rPr>
     </w:lvl>
@@ -3015,7 +3022,7 @@
         <w:ind w:left="5760" w:hanging="360"/>
       </w:pPr>
       <w:rPr>
-        <w:rFonts w:hint="default" w:ascii="Wingdings" w:hAnsi="Wingdings"/>
+        <w:rFonts w:ascii="Wingdings" w:hAnsi="Wingdings" w:hint="default"/>
         <w:sz w:val="20"/>
       </w:rPr>
     </w:lvl>
@@ -3031,7 +3038,7 @@
         <w:ind w:left="6480" w:hanging="360"/>
       </w:pPr>
       <w:rPr>
-        <w:rFonts w:hint="default" w:ascii="Wingdings" w:hAnsi="Wingdings"/>
+        <w:rFonts w:ascii="Wingdings" w:hAnsi="Wingdings" w:hint="default"/>
         <w:sz w:val="20"/>
       </w:rPr>
     </w:lvl>
@@ -3042,16 +3049,12 @@
 </w:numbering>
 </file>
 
-<file path=word/people.xml><?xml version="1.0" encoding="utf-8"?>
-<w15:people xmlns:mc="http://schemas.openxmlformats.org/markup-compatibility/2006" xmlns:w15="http://schemas.microsoft.com/office/word/2012/wordml" mc:Ignorable="w15"/>
-</file>
-
 <file path=word/styles.xml><?xml version="1.0" encoding="utf-8"?>
 <w:styles xmlns:mc="http://schemas.openxmlformats.org/markup-compatibility/2006" xmlns:r="http://schemas.openxmlformats.org/officeDocument/2006/relationships" xmlns:w="http://schemas.openxmlformats.org/wordprocessingml/2006/main" xmlns:w14="http://schemas.microsoft.com/office/word/2010/wordml" xmlns:w15="http://schemas.microsoft.com/office/word/2012/wordml" xmlns:w16cex="http://schemas.microsoft.com/office/word/2018/wordml/cex" xmlns:w16cid="http://schemas.microsoft.com/office/word/2016/wordml/cid" xmlns:w16="http://schemas.microsoft.com/office/word/2018/wordml" xmlns:w16du="http://schemas.microsoft.com/office/word/2023/wordml/word16du" xmlns:w16sdtdh="http://schemas.microsoft.com/office/word/2020/wordml/sdtdatahash" xmlns:w16sdtfl="http://schemas.microsoft.com/office/word/2024/wordml/sdtformatlock" xmlns:w16se="http://schemas.microsoft.com/office/word/2015/wordml/symex" mc:Ignorable="w14 w15 w16se w16cid w16 w16cex w16sdtdh w16sdtfl w16du">
   <w:docDefaults>
     <w:rPrDefault>
       <w:rPr>
-        <w:rFonts w:asciiTheme="minorHAnsi" w:hAnsiTheme="minorHAnsi" w:eastAsiaTheme="minorHAnsi" w:cstheme="minorBidi"/>
+        <w:rFonts w:asciiTheme="minorHAnsi" w:eastAsiaTheme="minorHAnsi" w:hAnsiTheme="minorHAnsi" w:cstheme="minorBidi"/>
         <w:sz w:val="24"/>
         <w:szCs w:val="24"/>
         <w:lang w:val="it-IT" w:eastAsia="en-US" w:bidi="ar-SA"/>
@@ -3066,14 +3069,14 @@
   <w:latentStyles w:defLockedState="0" w:defUIPriority="99" w:defSemiHidden="0" w:defUnhideWhenUsed="0" w:defQFormat="0" w:count="376">
     <w:lsdException w:name="Normal" w:uiPriority="0" w:qFormat="1"/>
     <w:lsdException w:name="heading 1" w:uiPriority="9" w:qFormat="1"/>
-    <w:lsdException w:name="heading 2" w:uiPriority="9" w:semiHidden="1" w:unhideWhenUsed="1" w:qFormat="1"/>
-    <w:lsdException w:name="heading 3" w:uiPriority="9" w:semiHidden="1" w:unhideWhenUsed="1" w:qFormat="1"/>
-    <w:lsdException w:name="heading 4" w:uiPriority="9" w:semiHidden="1" w:unhideWhenUsed="1" w:qFormat="1"/>
-    <w:lsdException w:name="heading 5" w:uiPriority="9" w:semiHidden="1" w:unhideWhenUsed="1" w:qFormat="1"/>
-    <w:lsdException w:name="heading 6" w:uiPriority="9" w:semiHidden="1" w:unhideWhenUsed="1" w:qFormat="1"/>
-    <w:lsdException w:name="heading 7" w:uiPriority="9" w:semiHidden="1" w:unhideWhenUsed="1" w:qFormat="1"/>
-    <w:lsdException w:name="heading 8" w:uiPriority="9" w:semiHidden="1" w:unhideWhenUsed="1" w:qFormat="1"/>
-    <w:lsdException w:name="heading 9" w:uiPriority="9" w:semiHidden="1" w:unhideWhenUsed="1" w:qFormat="1"/>
+    <w:lsdException w:name="heading 2" w:semiHidden="1" w:uiPriority="9" w:unhideWhenUsed="1" w:qFormat="1"/>
+    <w:lsdException w:name="heading 3" w:semiHidden="1" w:uiPriority="9" w:unhideWhenUsed="1" w:qFormat="1"/>
+    <w:lsdException w:name="heading 4" w:semiHidden="1" w:uiPriority="9" w:unhideWhenUsed="1" w:qFormat="1"/>
+    <w:lsdException w:name="heading 5" w:semiHidden="1" w:uiPriority="9" w:unhideWhenUsed="1" w:qFormat="1"/>
+    <w:lsdException w:name="heading 6" w:semiHidden="1" w:uiPriority="9" w:unhideWhenUsed="1" w:qFormat="1"/>
+    <w:lsdException w:name="heading 7" w:semiHidden="1" w:uiPriority="9" w:unhideWhenUsed="1" w:qFormat="1"/>
+    <w:lsdException w:name="heading 8" w:semiHidden="1" w:uiPriority="9" w:unhideWhenUsed="1" w:qFormat="1"/>
+    <w:lsdException w:name="heading 9" w:semiHidden="1" w:uiPriority="9" w:unhideWhenUsed="1" w:qFormat="1"/>
     <w:lsdException w:name="index 1" w:semiHidden="1" w:unhideWhenUsed="1"/>
     <w:lsdException w:name="index 2" w:semiHidden="1" w:unhideWhenUsed="1"/>
     <w:lsdException w:name="index 3" w:semiHidden="1" w:unhideWhenUsed="1"/>
@@ -3083,22 +3086,22 @@
     <w:lsdException w:name="index 7" w:semiHidden="1" w:unhideWhenUsed="1"/>
     <w:lsdException w:name="index 8" w:semiHidden="1" w:unhideWhenUsed="1"/>
     <w:lsdException w:name="index 9" w:semiHidden="1" w:unhideWhenUsed="1"/>
-    <w:lsdException w:name="toc 1" w:uiPriority="39" w:semiHidden="1" w:unhideWhenUsed="1"/>
-    <w:lsdException w:name="toc 2" w:uiPriority="39" w:semiHidden="1" w:unhideWhenUsed="1"/>
-    <w:lsdException w:name="toc 3" w:uiPriority="39" w:semiHidden="1" w:unhideWhenUsed="1"/>
-    <w:lsdException w:name="toc 4" w:uiPriority="39" w:semiHidden="1" w:unhideWhenUsed="1"/>
-    <w:lsdException w:name="toc 5" w:uiPriority="39" w:semiHidden="1" w:unhideWhenUsed="1"/>
-    <w:lsdException w:name="toc 6" w:uiPriority="39" w:semiHidden="1" w:unhideWhenUsed="1"/>
-    <w:lsdException w:name="toc 7" w:uiPriority="39" w:semiHidden="1" w:unhideWhenUsed="1"/>
-    <w:lsdException w:name="toc 8" w:uiPriority="39" w:semiHidden="1" w:unhideWhenUsed="1"/>
-    <w:lsdException w:name="toc 9" w:uiPriority="39" w:semiHidden="1" w:unhideWhenUsed="1"/>
+    <w:lsdException w:name="toc 1" w:semiHidden="1" w:uiPriority="39" w:unhideWhenUsed="1"/>
+    <w:lsdException w:name="toc 2" w:semiHidden="1" w:uiPriority="39" w:unhideWhenUsed="1"/>
+    <w:lsdException w:name="toc 3" w:semiHidden="1" w:uiPriority="39" w:unhideWhenUsed="1"/>
+    <w:lsdException w:name="toc 4" w:semiHidden="1" w:uiPriority="39" w:unhideWhenUsed="1"/>
+    <w:lsdException w:name="toc 5" w:semiHidden="1" w:uiPriority="39" w:unhideWhenUsed="1"/>
+    <w:lsdException w:name="toc 6" w:semiHidden="1" w:uiPriority="39" w:unhideWhenUsed="1"/>
+    <w:lsdException w:name="toc 7" w:semiHidden="1" w:uiPriority="39" w:unhideWhenUsed="1"/>
+    <w:lsdException w:name="toc 8" w:semiHidden="1" w:uiPriority="39" w:unhideWhenUsed="1"/>
+    <w:lsdException w:name="toc 9" w:semiHidden="1" w:uiPriority="39" w:unhideWhenUsed="1"/>
     <w:lsdException w:name="Normal Indent" w:semiHidden="1" w:unhideWhenUsed="1"/>
     <w:lsdException w:name="footnote text" w:semiHidden="1" w:unhideWhenUsed="1"/>
     <w:lsdException w:name="annotation text" w:semiHidden="1" w:unhideWhenUsed="1"/>
     <w:lsdException w:name="header" w:semiHidden="1" w:unhideWhenUsed="1"/>
     <w:lsdException w:name="footer" w:semiHidden="1" w:unhideWhenUsed="1"/>
     <w:lsdException w:name="index heading" w:semiHidden="1" w:unhideWhenUsed="1"/>
-    <w:lsdException w:name="caption" w:uiPriority="35" w:semiHidden="1" w:unhideWhenUsed="1" w:qFormat="1"/>
+    <w:lsdException w:name="caption" w:semiHidden="1" w:uiPriority="35" w:unhideWhenUsed="1" w:qFormat="1"/>
     <w:lsdException w:name="table of figures" w:semiHidden="1" w:unhideWhenUsed="1"/>
     <w:lsdException w:name="envelope address" w:semiHidden="1" w:unhideWhenUsed="1"/>
     <w:lsdException w:name="envelope return" w:semiHidden="1" w:unhideWhenUsed="1"/>
@@ -3129,7 +3132,7 @@
     <w:lsdException w:name="Title" w:uiPriority="10" w:qFormat="1"/>
     <w:lsdException w:name="Closing" w:semiHidden="1" w:unhideWhenUsed="1"/>
     <w:lsdException w:name="Signature" w:semiHidden="1" w:unhideWhenUsed="1"/>
-    <w:lsdException w:name="Default Paragraph Font" w:uiPriority="1" w:semiHidden="1" w:unhideWhenUsed="1"/>
+    <w:lsdException w:name="Default Paragraph Font" w:semiHidden="1" w:uiPriority="1" w:unhideWhenUsed="1"/>
     <w:lsdException w:name="Body Text" w:semiHidden="1" w:unhideWhenUsed="1"/>
     <w:lsdException w:name="Body Text Indent" w:semiHidden="1" w:unhideWhenUsed="1"/>
     <w:lsdException w:name="List Continue" w:semiHidden="1" w:unhideWhenUsed="1"/>
@@ -3329,8 +3332,8 @@
     <w:lsdException w:name="Subtle Reference" w:uiPriority="31" w:qFormat="1"/>
     <w:lsdException w:name="Intense Reference" w:uiPriority="32" w:qFormat="1"/>
     <w:lsdException w:name="Book Title" w:uiPriority="33" w:qFormat="1"/>
-    <w:lsdException w:name="Bibliography" w:uiPriority="37" w:semiHidden="1" w:unhideWhenUsed="1"/>
-    <w:lsdException w:name="TOC Heading" w:uiPriority="39" w:semiHidden="1" w:unhideWhenUsed="1" w:qFormat="1"/>
+    <w:lsdException w:name="Bibliography" w:semiHidden="1" w:uiPriority="37" w:unhideWhenUsed="1"/>
+    <w:lsdException w:name="TOC Heading" w:semiHidden="1" w:uiPriority="39" w:unhideWhenUsed="1" w:qFormat="1"/>
     <w:lsdException w:name="Plain Table 1" w:uiPriority="41"/>
     <w:lsdException w:name="Plain Table 2" w:uiPriority="42"/>
     <w:lsdException w:name="Plain Table 3" w:uiPriority="43"/>
@@ -3441,20 +3444,20 @@
     <w:lsdException w:name="Unresolved Mention" w:semiHidden="1" w:unhideWhenUsed="1"/>
     <w:lsdException w:name="Smart Link" w:semiHidden="1" w:unhideWhenUsed="1"/>
   </w:latentStyles>
-  <w:style w:type="paragraph" w:styleId="Normale" w:default="1">
+  <w:style w:type="paragraph" w:default="1" w:styleId="Normale">
     <w:name w:val="Normal"/>
     <w:qFormat/>
     <w:rPr>
       <w:lang w:val="en-GB"/>
     </w:rPr>
   </w:style>
-  <w:style w:type="character" w:styleId="Carpredefinitoparagrafo" w:default="1">
+  <w:style w:type="character" w:default="1" w:styleId="Carpredefinitoparagrafo">
     <w:name w:val="Default Paragraph Font"/>
     <w:uiPriority w:val="1"/>
     <w:semiHidden/>
     <w:unhideWhenUsed/>
   </w:style>
-  <w:style w:type="table" w:styleId="Tabellanormale" w:default="1">
+  <w:style w:type="table" w:default="1" w:styleId="Tabellanormale">
     <w:name w:val="Normal Table"/>
     <w:uiPriority w:val="99"/>
     <w:semiHidden/>
@@ -3469,7 +3472,7 @@
       </w:tblCellMar>
     </w:tblPr>
   </w:style>
-  <w:style w:type="numbering" w:styleId="Nessunelenco" w:default="1">
+  <w:style w:type="numbering" w:default="1" w:styleId="Nessunelenco">
     <w:name w:val="No List"/>
     <w:uiPriority w:val="99"/>
     <w:semiHidden/>
@@ -3508,7 +3511,7 @@
       <w:spacing w:before="100" w:beforeAutospacing="1" w:after="100" w:afterAutospacing="1" w:line="240" w:lineRule="auto"/>
     </w:pPr>
     <w:rPr>
-      <w:rFonts w:ascii="Times New Roman" w:hAnsi="Times New Roman" w:eastAsia="Times New Roman" w:cs="Times New Roman"/>
+      <w:rFonts w:ascii="Times New Roman" w:eastAsia="Times New Roman" w:hAnsi="Times New Roman" w:cs="Times New Roman"/>
     </w:rPr>
   </w:style>
   <w:style w:type="character" w:styleId="Testosegnaposto">
@@ -3535,7 +3538,7 @@
       <w:szCs w:val="20"/>
     </w:rPr>
   </w:style>
-  <w:style w:type="character" w:styleId="TestocommentoCarattere" w:customStyle="1">
+  <w:style w:type="character" w:customStyle="1" w:styleId="TestocommentoCarattere">
     <w:name w:val="Testo commento Carattere"/>
     <w:basedOn w:val="Carpredefinitoparagrafo"/>
     <w:link w:val="Testocommento"/>
@@ -3596,7 +3599,7 @@
       <w:bCs/>
     </w:rPr>
   </w:style>
-  <w:style w:type="character" w:styleId="SoggettocommentoCarattere" w:customStyle="1">
+  <w:style w:type="character" w:customStyle="1" w:styleId="SoggettocommentoCarattere">
     <w:name w:val="Soggetto commento Carattere"/>
     <w:basedOn w:val="TestocommentoCarattere"/>
     <w:link w:val="Soggettocommento"/>
@@ -3615,7 +3618,7 @@
 </file>
 
 <file path=word/theme/theme1.xml><?xml version="1.0" encoding="utf-8"?>
-<a:theme xmlns:a="http://schemas.openxmlformats.org/drawingml/2006/main" xmlns:thm15="http://schemas.microsoft.com/office/thememl/2012/main" name="Office Theme">
+<a:theme xmlns:a="http://schemas.openxmlformats.org/drawingml/2006/main" name="Office Theme">
   <a:themeElements>
     <a:clrScheme name="Office">
       <a:dk1>

</xml_diff>